<commit_message>
Dotační manuál: nová verze Wordu (nové zdroje podle kalendáře)
Co-Authored-By: Claude Opus 5.5 (1M context) <noreply@anthropic.com>
Claude-Session: https://claude.ai/code/session_014Cms99YiFfg5qXi7rp4DXx
</commit_message>
<xml_diff>
--- a/docs/dotacni-manual.docx
+++ b/docs/dotacni-manual.docx
@@ -797,9 +797,9 @@
         <w:tblLook w:val="04A0" w:firstRow="1" w:lastRow="0" w:firstColumn="0" w:lastColumn="0" w:noHBand="0" w:noVBand="1"/>
       </w:tblPr>
       <w:tblGrid>
-        <w:gridCol w:w="3175"/>
-        <w:gridCol w:w="4018"/>
-        <w:gridCol w:w="2167"/>
+        <w:gridCol w:w="2816"/>
+        <w:gridCol w:w="4117"/>
+        <w:gridCol w:w="2427"/>
       </w:tblGrid>
       <w:tr>
         <w:trPr>
@@ -807,7 +807,7 @@
         </w:trPr>
         <w:tc>
           <w:tcPr>
-            <w:tcW w:w="3175" w:type="dxa"/>
+            <w:tcW w:w="2816" w:type="dxa"/>
             <w:shd w:val="clear" w:color="auto" w:fill="F2F2F2"/>
           </w:tcPr>
           <w:p>
@@ -819,7 +819,7 @@
         </w:tc>
         <w:tc>
           <w:tcPr>
-            <w:tcW w:w="4018" w:type="dxa"/>
+            <w:tcW w:w="4117" w:type="dxa"/>
             <w:shd w:val="clear" w:color="auto" w:fill="F2F2F2"/>
           </w:tcPr>
           <w:p>
@@ -831,7 +831,7 @@
         </w:tc>
         <w:tc>
           <w:tcPr>
-            <w:tcW w:w="2167" w:type="dxa"/>
+            <w:tcW w:w="2427" w:type="dxa"/>
             <w:shd w:val="clear" w:color="auto" w:fill="F2F2F2"/>
           </w:tcPr>
           <w:p>
@@ -845,7 +845,7 @@
       <w:tr>
         <w:tc>
           <w:tcPr>
-            <w:tcW w:w="3175" w:type="dxa"/>
+            <w:tcW w:w="2816" w:type="dxa"/>
           </w:tcPr>
           <w:p>
             <w:pPr/>
@@ -861,18 +861,18 @@
         </w:tc>
         <w:tc>
           <w:tcPr>
-            <w:tcW w:w="4018" w:type="dxa"/>
-          </w:tcPr>
-          <w:p>
-            <w:pPr/>
-            <w:r>
-              <w:t xml:space="preserve">bez stropu a bez spoluúčasti, i vybavení; úplné podmínky neověřeny</w:t>
-            </w:r>
-          </w:p>
-        </w:tc>
-        <w:tc>
-          <w:tcPr>
-            <w:tcW w:w="2167" w:type="dxa"/>
+            <w:tcW w:w="4117" w:type="dxa"/>
+          </w:tcPr>
+          <w:p>
+            <w:pPr/>
+            <w:r>
+              <w:t xml:space="preserve">bez stropu a bez spoluúčasti, i vybavení</w:t>
+            </w:r>
+          </w:p>
+        </w:tc>
+        <w:tc>
+          <w:tcPr>
+            <w:tcW w:w="2427" w:type="dxa"/>
           </w:tcPr>
           <w:p>
             <w:pPr/>
@@ -885,7 +885,7 @@
       <w:tr>
         <w:tc>
           <w:tcPr>
-            <w:tcW w:w="3175" w:type="dxa"/>
+            <w:tcW w:w="2816" w:type="dxa"/>
           </w:tcPr>
           <w:p>
             <w:pPr/>
@@ -894,14 +894,14 @@
                 <w:rPr>
                   <w:rStyle w:val="Hyperlink"/>
                 </w:rPr>
-                <w:t xml:space="preserve">Kaufland + Nadace VIA: Už to roste, už to klíčí</w:t>
+                <w:t xml:space="preserve">Nadace VIA: Fond Kaufland, komunitní zahrady</w:t>
               </w:r>
             </w:hyperlink>
           </w:p>
         </w:tc>
         <w:tc>
           <w:tcPr>
-            <w:tcW w:w="4018" w:type="dxa"/>
+            <w:tcW w:w="4117" w:type="dxa"/>
           </w:tcPr>
           <w:p>
             <w:pPr/>
@@ -912,7 +912,7 @@
         </w:tc>
         <w:tc>
           <w:tcPr>
-            <w:tcW w:w="2167" w:type="dxa"/>
+            <w:tcW w:w="2427" w:type="dxa"/>
           </w:tcPr>
           <w:p>
             <w:pPr/>
@@ -925,7 +925,7 @@
       <w:tr>
         <w:tc>
           <w:tcPr>
-            <w:tcW w:w="3175" w:type="dxa"/>
+            <w:tcW w:w="2816" w:type="dxa"/>
           </w:tcPr>
           <w:p>
             <w:pPr/>
@@ -934,70 +934,44 @@
                 <w:rPr>
                   <w:rStyle w:val="Hyperlink"/>
                 </w:rPr>
-                <w:t xml:space="preserve">MMR: dotace pro neziskové organizace</w:t>
+                <w:t xml:space="preserve">MMR: dotace pro nestátní neziskové organizace</w:t>
               </w:r>
             </w:hyperlink>
-          </w:p>
-        </w:tc>
-        <w:tc>
-          <w:tcPr>
-            <w:tcW w:w="4018" w:type="dxa"/>
-          </w:tcPr>
-          <w:p>
-            <w:pPr/>
-            <w:r>
-              <w:t xml:space="preserve">udržitelný cestovní ruch, rozvoj regionů; až 70 % nákladů</w:t>
-            </w:r>
-          </w:p>
-        </w:tc>
-        <w:tc>
-          <w:tcPr>
-            <w:tcW w:w="2167" w:type="dxa"/>
-          </w:tcPr>
-          <w:p>
-            <w:pPr/>
-            <w:r>
-              <w:t xml:space="preserve">uzávěrka 31. 1. (2024 i 2025)</w:t>
-            </w:r>
-          </w:p>
-        </w:tc>
-      </w:tr>
-      <w:tr>
-        <w:tc>
-          <w:tcPr>
-            <w:tcW w:w="3175" w:type="dxa"/>
-          </w:tcPr>
-          <w:p>
-            <w:pPr/>
+            <w:r>
+              <w:t xml:space="preserve"> (</w:t>
+            </w:r>
             <w:hyperlink r:id="rId15" w:history="1">
               <w:r>
                 <w:rPr>
                   <w:rStyle w:val="Hyperlink"/>
                 </w:rPr>
-                <w:t xml:space="preserve">Nadace na záchranu památek: Opomíjené památky</w:t>
+                <w:t xml:space="preserve">podmínky 2026</w:t>
               </w:r>
             </w:hyperlink>
-          </w:p>
-        </w:tc>
-        <w:tc>
-          <w:tcPr>
-            <w:tcW w:w="4018" w:type="dxa"/>
-          </w:tcPr>
-          <w:p>
-            <w:pPr/>
-            <w:r>
-              <w:t xml:space="preserve">drobné památky, např. kaplička sv. Kříže; nutný souhlas vlastníka</w:t>
-            </w:r>
-          </w:p>
-        </w:tc>
-        <w:tc>
-          <w:tcPr>
-            <w:tcW w:w="2167" w:type="dxa"/>
-          </w:tcPr>
-          <w:p>
-            <w:pPr/>
-            <w:r>
-              <w:t xml:space="preserve">pravidla 2026 nenalezena</w:t>
+            <w:r>
+              <w:t xml:space="preserve">)</w:t>
+            </w:r>
+          </w:p>
+        </w:tc>
+        <w:tc>
+          <w:tcPr>
+            <w:tcW w:w="4117" w:type="dxa"/>
+          </w:tcPr>
+          <w:p>
+            <w:pPr/>
+            <w:r>
+              <w:t xml:space="preserve">rozvoj regionů a cestovní ruch celostátního významu; 100 000 Kč–5 mil. Kč, nejvýš 70 % nákladů; pro místní akce se hodí málo</w:t>
+            </w:r>
+          </w:p>
+        </w:tc>
+        <w:tc>
+          <w:tcPr>
+            <w:tcW w:w="2427" w:type="dxa"/>
+          </w:tcPr>
+          <w:p>
+            <w:pPr/>
+            <w:r>
+              <w:t xml:space="preserve">na 2026 příjem 19. 11.–31. 12. 2025; na 2027 se čeká kolem listopadu 2026</w:t>
             </w:r>
           </w:p>
         </w:tc>
@@ -1005,7 +979,7 @@
       <w:tr>
         <w:tc>
           <w:tcPr>
-            <w:tcW w:w="3175" w:type="dxa"/>
+            <w:tcW w:w="2816" w:type="dxa"/>
           </w:tcPr>
           <w:p>
             <w:pPr/>
@@ -1014,30 +988,30 @@
                 <w:rPr>
                   <w:rStyle w:val="Hyperlink"/>
                 </w:rPr>
-                <w:t xml:space="preserve">Nadace Občanského fóra: Památky a zdraví</w:t>
+                <w:t xml:space="preserve">Nadace Občanského fóra: Opomíjené památky</w:t>
               </w:r>
             </w:hyperlink>
           </w:p>
         </w:tc>
         <w:tc>
           <w:tcPr>
-            <w:tcW w:w="4018" w:type="dxa"/>
-          </w:tcPr>
-          <w:p>
-            <w:pPr/>
-            <w:r>
-              <w:t xml:space="preserve">až 100 000 Kč, jen zapsané kulturní památky</w:t>
-            </w:r>
-          </w:p>
-        </w:tc>
-        <w:tc>
-          <w:tcPr>
-            <w:tcW w:w="2167" w:type="dxa"/>
-          </w:tcPr>
-          <w:p>
-            <w:pPr/>
-            <w:r>
-              <w:t xml:space="preserve">2025: do 9. 7.</w:t>
+            <w:tcW w:w="4117" w:type="dxa"/>
+          </w:tcPr>
+          <w:p>
+            <w:pPr/>
+            <w:r>
+              <w:t xml:space="preserve">obnova drobných památek (kapličky, kříže), do 50 000 Kč; nutný souhlas vlastníka</w:t>
+            </w:r>
+          </w:p>
+        </w:tc>
+        <w:tc>
+          <w:tcPr>
+            <w:tcW w:w="2427" w:type="dxa"/>
+          </w:tcPr>
+          <w:p>
+            <w:pPr/>
+            <w:r>
+              <w:t xml:space="preserve">2026: do 15. 7.</w:t>
             </w:r>
           </w:p>
         </w:tc>
@@ -1057,20 +1031,9 @@
         </w:r>
       </w:hyperlink>
       <w:r>
-        <w:t xml:space="preserve"> (Úřad vlády, státní programy pro neziskovky), </w:t>
+        <w:t xml:space="preserve"> (Úřad vlády, státní programy pro neziskovky) a </w:t>
       </w:r>
       <w:hyperlink r:id="rId18" w:history="1">
-        <w:r>
-          <w:rPr>
-            <w:rStyle w:val="Hyperlink"/>
-          </w:rPr>
-          <w:t xml:space="preserve">krajské dotační tituly na RIS</w:t>
-        </w:r>
-      </w:hyperlink>
-      <w:r>
-        <w:t xml:space="preserve"> a </w:t>
-      </w:r>
-      <w:hyperlink r:id="rId19" w:history="1">
         <w:r>
           <w:rPr>
             <w:rStyle w:val="Hyperlink"/>

</xml_diff>

<commit_message>
Dotační manuál: nová verze Wordu (nové zdroje podle kalendáře) (#16)
Claude-Session: https://claude.ai/code/session_014Cms99YiFfg5qXi7rp4DXx

Co-authored-by: Claude <noreply@anthropic.com>
</commit_message>
<xml_diff>
--- a/docs/dotacni-manual.docx
+++ b/docs/dotacni-manual.docx
@@ -797,9 +797,9 @@
         <w:tblLook w:val="04A0" w:firstRow="1" w:lastRow="0" w:firstColumn="0" w:lastColumn="0" w:noHBand="0" w:noVBand="1"/>
       </w:tblPr>
       <w:tblGrid>
-        <w:gridCol w:w="3175"/>
-        <w:gridCol w:w="4018"/>
-        <w:gridCol w:w="2167"/>
+        <w:gridCol w:w="2816"/>
+        <w:gridCol w:w="4117"/>
+        <w:gridCol w:w="2427"/>
       </w:tblGrid>
       <w:tr>
         <w:trPr>
@@ -807,7 +807,7 @@
         </w:trPr>
         <w:tc>
           <w:tcPr>
-            <w:tcW w:w="3175" w:type="dxa"/>
+            <w:tcW w:w="2816" w:type="dxa"/>
             <w:shd w:val="clear" w:color="auto" w:fill="F2F2F2"/>
           </w:tcPr>
           <w:p>
@@ -819,7 +819,7 @@
         </w:tc>
         <w:tc>
           <w:tcPr>
-            <w:tcW w:w="4018" w:type="dxa"/>
+            <w:tcW w:w="4117" w:type="dxa"/>
             <w:shd w:val="clear" w:color="auto" w:fill="F2F2F2"/>
           </w:tcPr>
           <w:p>
@@ -831,7 +831,7 @@
         </w:tc>
         <w:tc>
           <w:tcPr>
-            <w:tcW w:w="2167" w:type="dxa"/>
+            <w:tcW w:w="2427" w:type="dxa"/>
             <w:shd w:val="clear" w:color="auto" w:fill="F2F2F2"/>
           </w:tcPr>
           <w:p>
@@ -845,7 +845,7 @@
       <w:tr>
         <w:tc>
           <w:tcPr>
-            <w:tcW w:w="3175" w:type="dxa"/>
+            <w:tcW w:w="2816" w:type="dxa"/>
           </w:tcPr>
           <w:p>
             <w:pPr/>
@@ -861,18 +861,18 @@
         </w:tc>
         <w:tc>
           <w:tcPr>
-            <w:tcW w:w="4018" w:type="dxa"/>
-          </w:tcPr>
-          <w:p>
-            <w:pPr/>
-            <w:r>
-              <w:t xml:space="preserve">bez stropu a bez spoluúčasti, i vybavení; úplné podmínky neověřeny</w:t>
-            </w:r>
-          </w:p>
-        </w:tc>
-        <w:tc>
-          <w:tcPr>
-            <w:tcW w:w="2167" w:type="dxa"/>
+            <w:tcW w:w="4117" w:type="dxa"/>
+          </w:tcPr>
+          <w:p>
+            <w:pPr/>
+            <w:r>
+              <w:t xml:space="preserve">bez stropu a bez spoluúčasti, i vybavení</w:t>
+            </w:r>
+          </w:p>
+        </w:tc>
+        <w:tc>
+          <w:tcPr>
+            <w:tcW w:w="2427" w:type="dxa"/>
           </w:tcPr>
           <w:p>
             <w:pPr/>
@@ -885,7 +885,7 @@
       <w:tr>
         <w:tc>
           <w:tcPr>
-            <w:tcW w:w="3175" w:type="dxa"/>
+            <w:tcW w:w="2816" w:type="dxa"/>
           </w:tcPr>
           <w:p>
             <w:pPr/>
@@ -894,14 +894,14 @@
                 <w:rPr>
                   <w:rStyle w:val="Hyperlink"/>
                 </w:rPr>
-                <w:t xml:space="preserve">Kaufland + Nadace VIA: Už to roste, už to klíčí</w:t>
+                <w:t xml:space="preserve">Nadace VIA: Fond Kaufland, komunitní zahrady</w:t>
               </w:r>
             </w:hyperlink>
           </w:p>
         </w:tc>
         <w:tc>
           <w:tcPr>
-            <w:tcW w:w="4018" w:type="dxa"/>
+            <w:tcW w:w="4117" w:type="dxa"/>
           </w:tcPr>
           <w:p>
             <w:pPr/>
@@ -912,7 +912,7 @@
         </w:tc>
         <w:tc>
           <w:tcPr>
-            <w:tcW w:w="2167" w:type="dxa"/>
+            <w:tcW w:w="2427" w:type="dxa"/>
           </w:tcPr>
           <w:p>
             <w:pPr/>
@@ -925,7 +925,7 @@
       <w:tr>
         <w:tc>
           <w:tcPr>
-            <w:tcW w:w="3175" w:type="dxa"/>
+            <w:tcW w:w="2816" w:type="dxa"/>
           </w:tcPr>
           <w:p>
             <w:pPr/>
@@ -934,70 +934,44 @@
                 <w:rPr>
                   <w:rStyle w:val="Hyperlink"/>
                 </w:rPr>
-                <w:t xml:space="preserve">MMR: dotace pro neziskové organizace</w:t>
+                <w:t xml:space="preserve">MMR: dotace pro nestátní neziskové organizace</w:t>
               </w:r>
             </w:hyperlink>
-          </w:p>
-        </w:tc>
-        <w:tc>
-          <w:tcPr>
-            <w:tcW w:w="4018" w:type="dxa"/>
-          </w:tcPr>
-          <w:p>
-            <w:pPr/>
-            <w:r>
-              <w:t xml:space="preserve">udržitelný cestovní ruch, rozvoj regionů; až 70 % nákladů</w:t>
-            </w:r>
-          </w:p>
-        </w:tc>
-        <w:tc>
-          <w:tcPr>
-            <w:tcW w:w="2167" w:type="dxa"/>
-          </w:tcPr>
-          <w:p>
-            <w:pPr/>
-            <w:r>
-              <w:t xml:space="preserve">uzávěrka 31. 1. (2024 i 2025)</w:t>
-            </w:r>
-          </w:p>
-        </w:tc>
-      </w:tr>
-      <w:tr>
-        <w:tc>
-          <w:tcPr>
-            <w:tcW w:w="3175" w:type="dxa"/>
-          </w:tcPr>
-          <w:p>
-            <w:pPr/>
+            <w:r>
+              <w:t xml:space="preserve"> (</w:t>
+            </w:r>
             <w:hyperlink r:id="rId15" w:history="1">
               <w:r>
                 <w:rPr>
                   <w:rStyle w:val="Hyperlink"/>
                 </w:rPr>
-                <w:t xml:space="preserve">Nadace na záchranu památek: Opomíjené památky</w:t>
+                <w:t xml:space="preserve">podmínky 2026</w:t>
               </w:r>
             </w:hyperlink>
-          </w:p>
-        </w:tc>
-        <w:tc>
-          <w:tcPr>
-            <w:tcW w:w="4018" w:type="dxa"/>
-          </w:tcPr>
-          <w:p>
-            <w:pPr/>
-            <w:r>
-              <w:t xml:space="preserve">drobné památky, např. kaplička sv. Kříže; nutný souhlas vlastníka</w:t>
-            </w:r>
-          </w:p>
-        </w:tc>
-        <w:tc>
-          <w:tcPr>
-            <w:tcW w:w="2167" w:type="dxa"/>
-          </w:tcPr>
-          <w:p>
-            <w:pPr/>
-            <w:r>
-              <w:t xml:space="preserve">pravidla 2026 nenalezena</w:t>
+            <w:r>
+              <w:t xml:space="preserve">)</w:t>
+            </w:r>
+          </w:p>
+        </w:tc>
+        <w:tc>
+          <w:tcPr>
+            <w:tcW w:w="4117" w:type="dxa"/>
+          </w:tcPr>
+          <w:p>
+            <w:pPr/>
+            <w:r>
+              <w:t xml:space="preserve">rozvoj regionů a cestovní ruch celostátního významu; 100 000 Kč–5 mil. Kč, nejvýš 70 % nákladů; pro místní akce se hodí málo</w:t>
+            </w:r>
+          </w:p>
+        </w:tc>
+        <w:tc>
+          <w:tcPr>
+            <w:tcW w:w="2427" w:type="dxa"/>
+          </w:tcPr>
+          <w:p>
+            <w:pPr/>
+            <w:r>
+              <w:t xml:space="preserve">na 2026 příjem 19. 11.–31. 12. 2025; na 2027 se čeká kolem listopadu 2026</w:t>
             </w:r>
           </w:p>
         </w:tc>
@@ -1005,7 +979,7 @@
       <w:tr>
         <w:tc>
           <w:tcPr>
-            <w:tcW w:w="3175" w:type="dxa"/>
+            <w:tcW w:w="2816" w:type="dxa"/>
           </w:tcPr>
           <w:p>
             <w:pPr/>
@@ -1014,30 +988,30 @@
                 <w:rPr>
                   <w:rStyle w:val="Hyperlink"/>
                 </w:rPr>
-                <w:t xml:space="preserve">Nadace Občanského fóra: Památky a zdraví</w:t>
+                <w:t xml:space="preserve">Nadace Občanského fóra: Opomíjené památky</w:t>
               </w:r>
             </w:hyperlink>
           </w:p>
         </w:tc>
         <w:tc>
           <w:tcPr>
-            <w:tcW w:w="4018" w:type="dxa"/>
-          </w:tcPr>
-          <w:p>
-            <w:pPr/>
-            <w:r>
-              <w:t xml:space="preserve">až 100 000 Kč, jen zapsané kulturní památky</w:t>
-            </w:r>
-          </w:p>
-        </w:tc>
-        <w:tc>
-          <w:tcPr>
-            <w:tcW w:w="2167" w:type="dxa"/>
-          </w:tcPr>
-          <w:p>
-            <w:pPr/>
-            <w:r>
-              <w:t xml:space="preserve">2025: do 9. 7.</w:t>
+            <w:tcW w:w="4117" w:type="dxa"/>
+          </w:tcPr>
+          <w:p>
+            <w:pPr/>
+            <w:r>
+              <w:t xml:space="preserve">obnova drobných památek (kapličky, kříže), do 50 000 Kč; nutný souhlas vlastníka</w:t>
+            </w:r>
+          </w:p>
+        </w:tc>
+        <w:tc>
+          <w:tcPr>
+            <w:tcW w:w="2427" w:type="dxa"/>
+          </w:tcPr>
+          <w:p>
+            <w:pPr/>
+            <w:r>
+              <w:t xml:space="preserve">2026: do 15. 7.</w:t>
             </w:r>
           </w:p>
         </w:tc>
@@ -1057,20 +1031,9 @@
         </w:r>
       </w:hyperlink>
       <w:r>
-        <w:t xml:space="preserve"> (Úřad vlády, státní programy pro neziskovky), </w:t>
+        <w:t xml:space="preserve"> (Úřad vlády, státní programy pro neziskovky) a </w:t>
       </w:r>
       <w:hyperlink r:id="rId18" w:history="1">
-        <w:r>
-          <w:rPr>
-            <w:rStyle w:val="Hyperlink"/>
-          </w:rPr>
-          <w:t xml:space="preserve">krajské dotační tituly na RIS</w:t>
-        </w:r>
-      </w:hyperlink>
-      <w:r>
-        <w:t xml:space="preserve"> a </w:t>
-      </w:r>
-      <w:hyperlink r:id="rId19" w:history="1">
         <w:r>
           <w:rPr>
             <w:rStyle w:val="Hyperlink"/>

</xml_diff>

<commit_message>
Dotační manuál: aktuální zdroje, odkaz na přehled výzev propamatky
Co-Authored-By: Claude Opus 5.5 (1M context) <noreply@anthropic.com>
Claude-Session: https://claude.ai/code/session_014Cms99YiFfg5qXi7rp4DXx
</commit_message>
<xml_diff>
--- a/docs/dotacni-manual.docx
+++ b/docs/dotacni-manual.docx
@@ -285,7 +285,7 @@
     <w:p>
       <w:pPr/>
       <w:r>
-        <w:t xml:space="preserve">Termíny jsou poslední známé a pochází z vyhledávání, protože weby poskytovatelů se Claudovi neotevřou. Před podáním je potřeba je ověřit na odkazu.</w:t>
+        <w:t xml:space="preserve">Termíny jsou poslední známé a ověřené na webech poskytovatelů (20. 10. 2026). Před podáním je potřeba je zkontrolovat na odkazu, aktuální stav je vždy v kalendáři.</w:t>
       </w:r>
     </w:p>
     <w:tbl>
@@ -296,10 +296,10 @@
         <w:tblLook w:val="04A0" w:firstRow="1" w:lastRow="0" w:firstColumn="0" w:lastColumn="0" w:noHBand="0" w:noVBand="1"/>
       </w:tblPr>
       <w:tblGrid>
-        <w:gridCol w:w="3187"/>
-        <w:gridCol w:w="2148"/>
-        <w:gridCol w:w="1678"/>
-        <w:gridCol w:w="2347"/>
+        <w:gridCol w:w="2970"/>
+        <w:gridCol w:w="2007"/>
+        <w:gridCol w:w="1572"/>
+        <w:gridCol w:w="2811"/>
       </w:tblGrid>
       <w:tr>
         <w:trPr>
@@ -307,7 +307,7 @@
         </w:trPr>
         <w:tc>
           <w:tcPr>
-            <w:tcW w:w="3187" w:type="dxa"/>
+            <w:tcW w:w="2970" w:type="dxa"/>
             <w:shd w:val="clear" w:color="auto" w:fill="F2F2F2"/>
           </w:tcPr>
           <w:p>
@@ -319,7 +319,7 @@
         </w:tc>
         <w:tc>
           <w:tcPr>
-            <w:tcW w:w="2148" w:type="dxa"/>
+            <w:tcW w:w="2007" w:type="dxa"/>
             <w:shd w:val="clear" w:color="auto" w:fill="F2F2F2"/>
           </w:tcPr>
           <w:p>
@@ -331,7 +331,7 @@
         </w:tc>
         <w:tc>
           <w:tcPr>
-            <w:tcW w:w="1678" w:type="dxa"/>
+            <w:tcW w:w="1572" w:type="dxa"/>
             <w:shd w:val="clear" w:color="auto" w:fill="F2F2F2"/>
           </w:tcPr>
           <w:p>
@@ -343,7 +343,7 @@
         </w:tc>
         <w:tc>
           <w:tcPr>
-            <w:tcW w:w="2347" w:type="dxa"/>
+            <w:tcW w:w="2811" w:type="dxa"/>
             <w:shd w:val="clear" w:color="auto" w:fill="F2F2F2"/>
           </w:tcPr>
           <w:p>
@@ -357,7 +357,7 @@
       <w:tr>
         <w:tc>
           <w:tcPr>
-            <w:tcW w:w="3187" w:type="dxa"/>
+            <w:tcW w:w="2970" w:type="dxa"/>
           </w:tcPr>
           <w:p>
             <w:pPr/>
@@ -373,7 +373,7 @@
         </w:tc>
         <w:tc>
           <w:tcPr>
-            <w:tcW w:w="2148" w:type="dxa"/>
+            <w:tcW w:w="2007" w:type="dxa"/>
           </w:tcPr>
           <w:p>
             <w:pPr/>
@@ -384,7 +384,7 @@
         </w:tc>
         <w:tc>
           <w:tcPr>
-            <w:tcW w:w="1678" w:type="dxa"/>
+            <w:tcW w:w="1572" w:type="dxa"/>
           </w:tcPr>
           <w:p>
             <w:pPr/>
@@ -395,12 +395,12 @@
         </w:tc>
         <w:tc>
           <w:tcPr>
-            <w:tcW w:w="2347" w:type="dxa"/>
-          </w:tcPr>
-          <w:p>
-            <w:pPr/>
-            <w:r>
-              <w:t xml:space="preserve">dotační portál kraje</w:t>
+            <w:tcW w:w="2811" w:type="dxa"/>
+          </w:tcPr>
+          <w:p>
+            <w:pPr/>
+            <w:r>
+              <w:t xml:space="preserve">dotační portál kraje; smlouva jen s uznávaným el. podpisem; účetní závěrka ve sbírce listin</w:t>
             </w:r>
           </w:p>
         </w:tc>
@@ -408,7 +408,7 @@
       <w:tr>
         <w:tc>
           <w:tcPr>
-            <w:tcW w:w="3187" w:type="dxa"/>
+            <w:tcW w:w="2970" w:type="dxa"/>
           </w:tcPr>
           <w:p>
             <w:pPr/>
@@ -424,7 +424,7 @@
         </w:tc>
         <w:tc>
           <w:tcPr>
-            <w:tcW w:w="2148" w:type="dxa"/>
+            <w:tcW w:w="2007" w:type="dxa"/>
           </w:tcPr>
           <w:p>
             <w:pPr/>
@@ -435,7 +435,7 @@
         </w:tc>
         <w:tc>
           <w:tcPr>
-            <w:tcW w:w="1678" w:type="dxa"/>
+            <w:tcW w:w="1572" w:type="dxa"/>
           </w:tcPr>
           <w:p>
             <w:pPr/>
@@ -446,7 +446,7 @@
         </w:tc>
         <w:tc>
           <w:tcPr>
-            <w:tcW w:w="2347" w:type="dxa"/>
+            <w:tcW w:w="2811" w:type="dxa"/>
           </w:tcPr>
           <w:p>
             <w:pPr/>
@@ -459,7 +459,7 @@
       <w:tr>
         <w:tc>
           <w:tcPr>
-            <w:tcW w:w="3187" w:type="dxa"/>
+            <w:tcW w:w="2970" w:type="dxa"/>
           </w:tcPr>
           <w:p>
             <w:pPr/>
@@ -475,7 +475,7 @@
         </w:tc>
         <w:tc>
           <w:tcPr>
-            <w:tcW w:w="2148" w:type="dxa"/>
+            <w:tcW w:w="2007" w:type="dxa"/>
           </w:tcPr>
           <w:p>
             <w:pPr/>
@@ -486,7 +486,7 @@
         </w:tc>
         <w:tc>
           <w:tcPr>
-            <w:tcW w:w="1678" w:type="dxa"/>
+            <w:tcW w:w="1572" w:type="dxa"/>
           </w:tcPr>
           <w:p>
             <w:pPr/>
@@ -497,7 +497,7 @@
         </w:tc>
         <w:tc>
           <w:tcPr>
-            <w:tcW w:w="2347" w:type="dxa"/>
+            <w:tcW w:w="2811" w:type="dxa"/>
           </w:tcPr>
           <w:p>
             <w:pPr/>
@@ -510,11 +510,11 @@
       <w:tr>
         <w:tc>
           <w:tcPr>
-            <w:tcW w:w="3187" w:type="dxa"/>
-          </w:tcPr>
-          <w:p>
-            <w:pPr/>
-            <w:hyperlink r:id="rId7" w:history="1">
+            <w:tcW w:w="2970" w:type="dxa"/>
+          </w:tcPr>
+          <w:p>
+            <w:pPr/>
+            <w:hyperlink r:id="rId6" w:history="1">
               <w:r>
                 <w:rPr>
                   <w:rStyle w:val="Hyperlink"/>
@@ -526,7 +526,7 @@
         </w:tc>
         <w:tc>
           <w:tcPr>
-            <w:tcW w:w="2148" w:type="dxa"/>
+            <w:tcW w:w="2007" w:type="dxa"/>
           </w:tcPr>
           <w:p>
             <w:pPr/>
@@ -537,7 +537,7 @@
         </w:tc>
         <w:tc>
           <w:tcPr>
-            <w:tcW w:w="1678" w:type="dxa"/>
+            <w:tcW w:w="1572" w:type="dxa"/>
           </w:tcPr>
           <w:p>
             <w:pPr/>
@@ -548,7 +548,7 @@
         </w:tc>
         <w:tc>
           <w:tcPr>
-            <w:tcW w:w="2347" w:type="dxa"/>
+            <w:tcW w:w="2811" w:type="dxa"/>
           </w:tcPr>
           <w:p>
             <w:pPr/>
@@ -561,11 +561,11 @@
       <w:tr>
         <w:tc>
           <w:tcPr>
-            <w:tcW w:w="3187" w:type="dxa"/>
-          </w:tcPr>
-          <w:p>
-            <w:pPr/>
-            <w:hyperlink r:id="rId8" w:history="1">
+            <w:tcW w:w="2970" w:type="dxa"/>
+          </w:tcPr>
+          <w:p>
+            <w:pPr/>
+            <w:hyperlink r:id="rId7" w:history="1">
               <w:r>
                 <w:rPr>
                   <w:rStyle w:val="Hyperlink"/>
@@ -577,7 +577,7 @@
         </w:tc>
         <w:tc>
           <w:tcPr>
-            <w:tcW w:w="2148" w:type="dxa"/>
+            <w:tcW w:w="2007" w:type="dxa"/>
           </w:tcPr>
           <w:p>
             <w:pPr/>
@@ -588,7 +588,7 @@
         </w:tc>
         <w:tc>
           <w:tcPr>
-            <w:tcW w:w="1678" w:type="dxa"/>
+            <w:tcW w:w="1572" w:type="dxa"/>
           </w:tcPr>
           <w:p>
             <w:pPr/>
@@ -599,7 +599,7 @@
         </w:tc>
         <w:tc>
           <w:tcPr>
-            <w:tcW w:w="2347" w:type="dxa"/>
+            <w:tcW w:w="2811" w:type="dxa"/>
           </w:tcPr>
           <w:p>
             <w:pPr/>
@@ -612,11 +612,11 @@
       <w:tr>
         <w:tc>
           <w:tcPr>
-            <w:tcW w:w="3187" w:type="dxa"/>
-          </w:tcPr>
-          <w:p>
-            <w:pPr/>
-            <w:hyperlink r:id="rId9" w:history="1">
+            <w:tcW w:w="2970" w:type="dxa"/>
+          </w:tcPr>
+          <w:p>
+            <w:pPr/>
+            <w:hyperlink r:id="rId8" w:history="1">
               <w:r>
                 <w:rPr>
                   <w:rStyle w:val="Hyperlink"/>
@@ -628,7 +628,7 @@
         </w:tc>
         <w:tc>
           <w:tcPr>
-            <w:tcW w:w="2148" w:type="dxa"/>
+            <w:tcW w:w="2007" w:type="dxa"/>
           </w:tcPr>
           <w:p>
             <w:pPr/>
@@ -639,7 +639,7 @@
         </w:tc>
         <w:tc>
           <w:tcPr>
-            <w:tcW w:w="1678" w:type="dxa"/>
+            <w:tcW w:w="1572" w:type="dxa"/>
           </w:tcPr>
           <w:p>
             <w:pPr/>
@@ -650,7 +650,7 @@
         </w:tc>
         <w:tc>
           <w:tcPr>
-            <w:tcW w:w="2347" w:type="dxa"/>
+            <w:tcW w:w="2811" w:type="dxa"/>
           </w:tcPr>
           <w:p>
             <w:pPr/>
@@ -663,11 +663,11 @@
       <w:tr>
         <w:tc>
           <w:tcPr>
-            <w:tcW w:w="3187" w:type="dxa"/>
-          </w:tcPr>
-          <w:p>
-            <w:pPr/>
-            <w:hyperlink r:id="rId10" w:history="1">
+            <w:tcW w:w="2970" w:type="dxa"/>
+          </w:tcPr>
+          <w:p>
+            <w:pPr/>
+            <w:hyperlink r:id="rId9" w:history="1">
               <w:r>
                 <w:rPr>
                   <w:rStyle w:val="Hyperlink"/>
@@ -679,7 +679,7 @@
         </w:tc>
         <w:tc>
           <w:tcPr>
-            <w:tcW w:w="2148" w:type="dxa"/>
+            <w:tcW w:w="2007" w:type="dxa"/>
           </w:tcPr>
           <w:p>
             <w:pPr/>
@@ -690,7 +690,7 @@
         </w:tc>
         <w:tc>
           <w:tcPr>
-            <w:tcW w:w="1678" w:type="dxa"/>
+            <w:tcW w:w="1572" w:type="dxa"/>
           </w:tcPr>
           <w:p>
             <w:pPr/>
@@ -701,7 +701,7 @@
         </w:tc>
         <w:tc>
           <w:tcPr>
-            <w:tcW w:w="2347" w:type="dxa"/>
+            <w:tcW w:w="2811" w:type="dxa"/>
           </w:tcPr>
           <w:p>
             <w:pPr/>
@@ -714,11 +714,11 @@
       <w:tr>
         <w:tc>
           <w:tcPr>
-            <w:tcW w:w="3187" w:type="dxa"/>
-          </w:tcPr>
-          <w:p>
-            <w:pPr/>
-            <w:hyperlink r:id="rId11" w:history="1">
+            <w:tcW w:w="2970" w:type="dxa"/>
+          </w:tcPr>
+          <w:p>
+            <w:pPr/>
+            <w:hyperlink r:id="rId10" w:history="1">
               <w:r>
                 <w:rPr>
                   <w:rStyle w:val="Hyperlink"/>
@@ -730,7 +730,7 @@
         </w:tc>
         <w:tc>
           <w:tcPr>
-            <w:tcW w:w="2148" w:type="dxa"/>
+            <w:tcW w:w="2007" w:type="dxa"/>
           </w:tcPr>
           <w:p>
             <w:pPr/>
@@ -741,7 +741,7 @@
         </w:tc>
         <w:tc>
           <w:tcPr>
-            <w:tcW w:w="1678" w:type="dxa"/>
+            <w:tcW w:w="1572" w:type="dxa"/>
           </w:tcPr>
           <w:p>
             <w:pPr/>
@@ -752,7 +752,7 @@
         </w:tc>
         <w:tc>
           <w:tcPr>
-            <w:tcW w:w="2347" w:type="dxa"/>
+            <w:tcW w:w="2811" w:type="dxa"/>
           </w:tcPr>
           <w:p>
             <w:pPr/>
@@ -797,9 +797,9 @@
         <w:tblLook w:val="04A0" w:firstRow="1" w:lastRow="0" w:firstColumn="0" w:lastColumn="0" w:noHBand="0" w:noVBand="1"/>
       </w:tblPr>
       <w:tblGrid>
-        <w:gridCol w:w="2816"/>
-        <w:gridCol w:w="4117"/>
-        <w:gridCol w:w="2427"/>
+        <w:gridCol w:w="2477"/>
+        <w:gridCol w:w="4525"/>
+        <w:gridCol w:w="2358"/>
       </w:tblGrid>
       <w:tr>
         <w:trPr>
@@ -807,7 +807,7 @@
         </w:trPr>
         <w:tc>
           <w:tcPr>
-            <w:tcW w:w="2816" w:type="dxa"/>
+            <w:tcW w:w="2477" w:type="dxa"/>
             <w:shd w:val="clear" w:color="auto" w:fill="F2F2F2"/>
           </w:tcPr>
           <w:p>
@@ -819,7 +819,7 @@
         </w:tc>
         <w:tc>
           <w:tcPr>
-            <w:tcW w:w="4117" w:type="dxa"/>
+            <w:tcW w:w="4525" w:type="dxa"/>
             <w:shd w:val="clear" w:color="auto" w:fill="F2F2F2"/>
           </w:tcPr>
           <w:p>
@@ -831,7 +831,7 @@
         </w:tc>
         <w:tc>
           <w:tcPr>
-            <w:tcW w:w="2427" w:type="dxa"/>
+            <w:tcW w:w="2358" w:type="dxa"/>
             <w:shd w:val="clear" w:color="auto" w:fill="F2F2F2"/>
           </w:tcPr>
           <w:p>
@@ -845,11 +845,11 @@
       <w:tr>
         <w:tc>
           <w:tcPr>
-            <w:tcW w:w="2816" w:type="dxa"/>
-          </w:tcPr>
-          <w:p>
-            <w:pPr/>
-            <w:hyperlink r:id="rId12" w:history="1">
+            <w:tcW w:w="2477" w:type="dxa"/>
+          </w:tcPr>
+          <w:p>
+            <w:pPr/>
+            <w:hyperlink r:id="rId11" w:history="1">
               <w:r>
                 <w:rPr>
                   <w:rStyle w:val="Hyperlink"/>
@@ -861,7 +861,7 @@
         </w:tc>
         <w:tc>
           <w:tcPr>
-            <w:tcW w:w="4117" w:type="dxa"/>
+            <w:tcW w:w="4525" w:type="dxa"/>
           </w:tcPr>
           <w:p>
             <w:pPr/>
@@ -872,7 +872,7 @@
         </w:tc>
         <w:tc>
           <w:tcPr>
-            <w:tcW w:w="2427" w:type="dxa"/>
+            <w:tcW w:w="2358" w:type="dxa"/>
           </w:tcPr>
           <w:p>
             <w:pPr/>
@@ -885,11 +885,11 @@
       <w:tr>
         <w:tc>
           <w:tcPr>
-            <w:tcW w:w="2816" w:type="dxa"/>
-          </w:tcPr>
-          <w:p>
-            <w:pPr/>
-            <w:hyperlink r:id="rId13" w:history="1">
+            <w:tcW w:w="2477" w:type="dxa"/>
+          </w:tcPr>
+          <w:p>
+            <w:pPr/>
+            <w:hyperlink r:id="rId12" w:history="1">
               <w:r>
                 <w:rPr>
                   <w:rStyle w:val="Hyperlink"/>
@@ -901,23 +901,23 @@
         </w:tc>
         <w:tc>
           <w:tcPr>
-            <w:tcW w:w="4117" w:type="dxa"/>
-          </w:tcPr>
-          <w:p>
-            <w:pPr/>
-            <w:r>
-              <w:t xml:space="preserve">až 100 000 Kč na komunitní zahradu</w:t>
-            </w:r>
-          </w:p>
-        </w:tc>
-        <w:tc>
-          <w:tcPr>
-            <w:tcW w:w="2427" w:type="dxa"/>
-          </w:tcPr>
-          <w:p>
-            <w:pPr/>
-            <w:r>
-              <w:t xml:space="preserve">2026: dotazník do 8. 2.</w:t>
+            <w:tcW w:w="4525" w:type="dxa"/>
+          </w:tcPr>
+          <w:p>
+            <w:pPr/>
+            <w:r>
+              <w:t xml:space="preserve">20 000–100 000 Kč na komunitní zahradu; nutný souhlas vlastníka (města)</w:t>
+            </w:r>
+          </w:p>
+        </w:tc>
+        <w:tc>
+          <w:tcPr>
+            <w:tcW w:w="2358" w:type="dxa"/>
+          </w:tcPr>
+          <w:p>
+            <w:pPr/>
+            <w:r>
+              <w:t xml:space="preserve">2026: dotazník 5. 1.–8. 2.</w:t>
             </w:r>
           </w:p>
         </w:tc>
@@ -925,11 +925,11 @@
       <w:tr>
         <w:tc>
           <w:tcPr>
-            <w:tcW w:w="2816" w:type="dxa"/>
-          </w:tcPr>
-          <w:p>
-            <w:pPr/>
-            <w:hyperlink r:id="rId14" w:history="1">
+            <w:tcW w:w="2477" w:type="dxa"/>
+          </w:tcPr>
+          <w:p>
+            <w:pPr/>
+            <w:hyperlink r:id="rId13" w:history="1">
               <w:r>
                 <w:rPr>
                   <w:rStyle w:val="Hyperlink"/>
@@ -940,7 +940,7 @@
             <w:r>
               <w:t xml:space="preserve"> (</w:t>
             </w:r>
-            <w:hyperlink r:id="rId15" w:history="1">
+            <w:hyperlink r:id="rId14" w:history="1">
               <w:r>
                 <w:rPr>
                   <w:rStyle w:val="Hyperlink"/>
@@ -955,7 +955,7 @@
         </w:tc>
         <w:tc>
           <w:tcPr>
-            <w:tcW w:w="4117" w:type="dxa"/>
+            <w:tcW w:w="4525" w:type="dxa"/>
           </w:tcPr>
           <w:p>
             <w:pPr/>
@@ -966,7 +966,7 @@
         </w:tc>
         <w:tc>
           <w:tcPr>
-            <w:tcW w:w="2427" w:type="dxa"/>
+            <w:tcW w:w="2358" w:type="dxa"/>
           </w:tcPr>
           <w:p>
             <w:pPr/>
@@ -979,11 +979,11 @@
       <w:tr>
         <w:tc>
           <w:tcPr>
-            <w:tcW w:w="2816" w:type="dxa"/>
-          </w:tcPr>
-          <w:p>
-            <w:pPr/>
-            <w:hyperlink r:id="rId16" w:history="1">
+            <w:tcW w:w="2477" w:type="dxa"/>
+          </w:tcPr>
+          <w:p>
+            <w:pPr/>
+            <w:hyperlink r:id="rId15" w:history="1">
               <w:r>
                 <w:rPr>
                   <w:rStyle w:val="Hyperlink"/>
@@ -995,7 +995,7 @@
         </w:tc>
         <w:tc>
           <w:tcPr>
-            <w:tcW w:w="4117" w:type="dxa"/>
+            <w:tcW w:w="4525" w:type="dxa"/>
           </w:tcPr>
           <w:p>
             <w:pPr/>
@@ -1006,12 +1006,106 @@
         </w:tc>
         <w:tc>
           <w:tcPr>
-            <w:tcW w:w="2427" w:type="dxa"/>
-          </w:tcPr>
-          <w:p>
-            <w:pPr/>
-            <w:r>
-              <w:t xml:space="preserve">2026: do 15. 7.</w:t>
+            <w:tcW w:w="2358" w:type="dxa"/>
+          </w:tcPr>
+          <w:p>
+            <w:pPr/>
+            <w:r>
+              <w:t xml:space="preserve">2026: do 15. 7.; další ročník čekám v létě 2027 (odhad)</w:t>
+            </w:r>
+          </w:p>
+        </w:tc>
+      </w:tr>
+      <w:tr>
+        <w:tc>
+          <w:tcPr>
+            <w:tcW w:w="2477" w:type="dxa"/>
+          </w:tcPr>
+          <w:p>
+            <w:pPr/>
+            <w:hyperlink r:id="rId16" w:history="1">
+              <w:r>
+                <w:rPr>
+                  <w:rStyle w:val="Hyperlink"/>
+                </w:rPr>
+                <w:t xml:space="preserve">Nadace Partnerství: Pro odolná města a zdravou krajinu</w:t>
+              </w:r>
+            </w:hyperlink>
+            <w:r>
+              <w:t xml:space="preserve"> (</w:t>
+            </w:r>
+            <w:hyperlink r:id="rId17" w:history="1">
+              <w:r>
+                <w:rPr>
+                  <w:rStyle w:val="Hyperlink"/>
+                </w:rPr>
+                <w:t xml:space="preserve">výzva 2026</w:t>
+              </w:r>
+            </w:hyperlink>
+            <w:r>
+              <w:t xml:space="preserve">)</w:t>
+            </w:r>
+          </w:p>
+        </w:tc>
+        <w:tc>
+          <w:tcPr>
+            <w:tcW w:w="4525" w:type="dxa"/>
+          </w:tcPr>
+          <w:p>
+            <w:pPr/>
+            <w:r>
+              <w:t xml:space="preserve">50 000–200 000 Kč na přírodě blízká opatření v obci, výslovně i komunitní zahrady; souhlas vlastníka, veřejně přístupné; vyvýšené záhony nelze</w:t>
+            </w:r>
+          </w:p>
+        </w:tc>
+        <w:tc>
+          <w:tcPr>
+            <w:tcW w:w="2358" w:type="dxa"/>
+          </w:tcPr>
+          <w:p>
+            <w:pPr/>
+            <w:r>
+              <w:t xml:space="preserve">2026: 24. 8.–15. 10.; další ročník čekám na podzim 2027 (odhad)</w:t>
+            </w:r>
+          </w:p>
+        </w:tc>
+      </w:tr>
+      <w:tr>
+        <w:tc>
+          <w:tcPr>
+            <w:tcW w:w="2477" w:type="dxa"/>
+          </w:tcPr>
+          <w:p>
+            <w:pPr/>
+            <w:hyperlink r:id="rId18" w:history="1">
+              <w:r>
+                <w:rPr>
+                  <w:rStyle w:val="Hyperlink"/>
+                </w:rPr>
+                <w:t xml:space="preserve">Nadace Partnerství: Péče o mladé stromy</w:t>
+              </w:r>
+            </w:hyperlink>
+          </w:p>
+        </w:tc>
+        <w:tc>
+          <w:tcPr>
+            <w:tcW w:w="4525" w:type="dxa"/>
+          </w:tcPr>
+          <w:p>
+            <w:pPr/>
+            <w:r>
+              <w:t xml:space="preserve">20 000–100 000 Kč na ošetření stromů vysazených v posledních 10 letech; na zahradě až po výsadbě lípy</w:t>
+            </w:r>
+          </w:p>
+        </w:tc>
+        <w:tc>
+          <w:tcPr>
+            <w:tcW w:w="2358" w:type="dxa"/>
+          </w:tcPr>
+          <w:p>
+            <w:pPr/>
+            <w:r>
+              <w:t xml:space="preserve">do 15. 11. 2026</w:t>
             </w:r>
           </w:p>
         </w:tc>
@@ -1022,7 +1116,7 @@
       <w:r>
         <w:t xml:space="preserve">Kde hledat další: </w:t>
       </w:r>
-      <w:hyperlink r:id="rId17" w:history="1">
+      <w:hyperlink r:id="rId19" w:history="1">
         <w:r>
           <w:rPr>
             <w:rStyle w:val="Hyperlink"/>
@@ -1031,18 +1125,40 @@
         </w:r>
       </w:hyperlink>
       <w:r>
-        <w:t xml:space="preserve"> (Úřad vlády, státní programy pro neziskovky) a </w:t>
-      </w:r>
-      <w:hyperlink r:id="rId18" w:history="1">
+        <w:t xml:space="preserve"> (Úřad vlády, státní programy pro neziskovky), </w:t>
+      </w:r>
+      <w:hyperlink r:id="rId13" w:history="1">
         <w:r>
           <w:rPr>
             <w:rStyle w:val="Hyperlink"/>
           </w:rPr>
-          <w:t xml:space="preserve">přehled výzev na památky</w:t>
+          <w:t xml:space="preserve">národní dotace MMR pro neziskovky</w:t>
         </w:r>
       </w:hyperlink>
       <w:r>
-        <w:t xml:space="preserve">.</w:t>
+        <w:t xml:space="preserve">, </w:t>
+      </w:r>
+      <w:hyperlink r:id="rId20" w:history="1">
+        <w:r>
+          <w:rPr>
+            <w:rStyle w:val="Hyperlink"/>
+          </w:rPr>
+          <w:t xml:space="preserve">aktuální výzvy Nadace Partnerství</w:t>
+        </w:r>
+      </w:hyperlink>
+      <w:r>
+        <w:t xml:space="preserve"> a </w:t>
+      </w:r>
+      <w:hyperlink r:id="rId21" w:history="1">
+        <w:r>
+          <w:rPr>
+            <w:rStyle w:val="Hyperlink"/>
+          </w:rPr>
+          <w:t xml:space="preserve">přehled dotačních výzev na památky</w:t>
+        </w:r>
+      </w:hyperlink>
+      <w:r>
+        <w:t xml:space="preserve"> na propamatky.cz. Propamatky.cz je jen rozcestník, podmínky je vždy potřeba ověřit u poskytovatele.</w:t>
       </w:r>
     </w:p>
     <w:sectPr>

</xml_diff>

<commit_message>
Dotační manuál: aktuální zdroje, odkaz na přehled výzev propamatky (#19)
Claude-Session: https://claude.ai/code/session_014Cms99YiFfg5qXi7rp4DXx

Co-authored-by: Claude <noreply@anthropic.com>
</commit_message>
<xml_diff>
--- a/docs/dotacni-manual.docx
+++ b/docs/dotacni-manual.docx
@@ -285,7 +285,7 @@
     <w:p>
       <w:pPr/>
       <w:r>
-        <w:t xml:space="preserve">Termíny jsou poslední známé a pochází z vyhledávání, protože weby poskytovatelů se Claudovi neotevřou. Před podáním je potřeba je ověřit na odkazu.</w:t>
+        <w:t xml:space="preserve">Termíny jsou poslední známé a ověřené na webech poskytovatelů (20. 10. 2026). Před podáním je potřeba je zkontrolovat na odkazu, aktuální stav je vždy v kalendáři.</w:t>
       </w:r>
     </w:p>
     <w:tbl>
@@ -296,10 +296,10 @@
         <w:tblLook w:val="04A0" w:firstRow="1" w:lastRow="0" w:firstColumn="0" w:lastColumn="0" w:noHBand="0" w:noVBand="1"/>
       </w:tblPr>
       <w:tblGrid>
-        <w:gridCol w:w="3187"/>
-        <w:gridCol w:w="2148"/>
-        <w:gridCol w:w="1678"/>
-        <w:gridCol w:w="2347"/>
+        <w:gridCol w:w="2970"/>
+        <w:gridCol w:w="2007"/>
+        <w:gridCol w:w="1572"/>
+        <w:gridCol w:w="2811"/>
       </w:tblGrid>
       <w:tr>
         <w:trPr>
@@ -307,7 +307,7 @@
         </w:trPr>
         <w:tc>
           <w:tcPr>
-            <w:tcW w:w="3187" w:type="dxa"/>
+            <w:tcW w:w="2970" w:type="dxa"/>
             <w:shd w:val="clear" w:color="auto" w:fill="F2F2F2"/>
           </w:tcPr>
           <w:p>
@@ -319,7 +319,7 @@
         </w:tc>
         <w:tc>
           <w:tcPr>
-            <w:tcW w:w="2148" w:type="dxa"/>
+            <w:tcW w:w="2007" w:type="dxa"/>
             <w:shd w:val="clear" w:color="auto" w:fill="F2F2F2"/>
           </w:tcPr>
           <w:p>
@@ -331,7 +331,7 @@
         </w:tc>
         <w:tc>
           <w:tcPr>
-            <w:tcW w:w="1678" w:type="dxa"/>
+            <w:tcW w:w="1572" w:type="dxa"/>
             <w:shd w:val="clear" w:color="auto" w:fill="F2F2F2"/>
           </w:tcPr>
           <w:p>
@@ -343,7 +343,7 @@
         </w:tc>
         <w:tc>
           <w:tcPr>
-            <w:tcW w:w="2347" w:type="dxa"/>
+            <w:tcW w:w="2811" w:type="dxa"/>
             <w:shd w:val="clear" w:color="auto" w:fill="F2F2F2"/>
           </w:tcPr>
           <w:p>
@@ -357,7 +357,7 @@
       <w:tr>
         <w:tc>
           <w:tcPr>
-            <w:tcW w:w="3187" w:type="dxa"/>
+            <w:tcW w:w="2970" w:type="dxa"/>
           </w:tcPr>
           <w:p>
             <w:pPr/>
@@ -373,7 +373,7 @@
         </w:tc>
         <w:tc>
           <w:tcPr>
-            <w:tcW w:w="2148" w:type="dxa"/>
+            <w:tcW w:w="2007" w:type="dxa"/>
           </w:tcPr>
           <w:p>
             <w:pPr/>
@@ -384,7 +384,7 @@
         </w:tc>
         <w:tc>
           <w:tcPr>
-            <w:tcW w:w="1678" w:type="dxa"/>
+            <w:tcW w:w="1572" w:type="dxa"/>
           </w:tcPr>
           <w:p>
             <w:pPr/>
@@ -395,12 +395,12 @@
         </w:tc>
         <w:tc>
           <w:tcPr>
-            <w:tcW w:w="2347" w:type="dxa"/>
-          </w:tcPr>
-          <w:p>
-            <w:pPr/>
-            <w:r>
-              <w:t xml:space="preserve">dotační portál kraje</w:t>
+            <w:tcW w:w="2811" w:type="dxa"/>
+          </w:tcPr>
+          <w:p>
+            <w:pPr/>
+            <w:r>
+              <w:t xml:space="preserve">dotační portál kraje; smlouva jen s uznávaným el. podpisem; účetní závěrka ve sbírce listin</w:t>
             </w:r>
           </w:p>
         </w:tc>
@@ -408,7 +408,7 @@
       <w:tr>
         <w:tc>
           <w:tcPr>
-            <w:tcW w:w="3187" w:type="dxa"/>
+            <w:tcW w:w="2970" w:type="dxa"/>
           </w:tcPr>
           <w:p>
             <w:pPr/>
@@ -424,7 +424,7 @@
         </w:tc>
         <w:tc>
           <w:tcPr>
-            <w:tcW w:w="2148" w:type="dxa"/>
+            <w:tcW w:w="2007" w:type="dxa"/>
           </w:tcPr>
           <w:p>
             <w:pPr/>
@@ -435,7 +435,7 @@
         </w:tc>
         <w:tc>
           <w:tcPr>
-            <w:tcW w:w="1678" w:type="dxa"/>
+            <w:tcW w:w="1572" w:type="dxa"/>
           </w:tcPr>
           <w:p>
             <w:pPr/>
@@ -446,7 +446,7 @@
         </w:tc>
         <w:tc>
           <w:tcPr>
-            <w:tcW w:w="2347" w:type="dxa"/>
+            <w:tcW w:w="2811" w:type="dxa"/>
           </w:tcPr>
           <w:p>
             <w:pPr/>
@@ -459,7 +459,7 @@
       <w:tr>
         <w:tc>
           <w:tcPr>
-            <w:tcW w:w="3187" w:type="dxa"/>
+            <w:tcW w:w="2970" w:type="dxa"/>
           </w:tcPr>
           <w:p>
             <w:pPr/>
@@ -475,7 +475,7 @@
         </w:tc>
         <w:tc>
           <w:tcPr>
-            <w:tcW w:w="2148" w:type="dxa"/>
+            <w:tcW w:w="2007" w:type="dxa"/>
           </w:tcPr>
           <w:p>
             <w:pPr/>
@@ -486,7 +486,7 @@
         </w:tc>
         <w:tc>
           <w:tcPr>
-            <w:tcW w:w="1678" w:type="dxa"/>
+            <w:tcW w:w="1572" w:type="dxa"/>
           </w:tcPr>
           <w:p>
             <w:pPr/>
@@ -497,7 +497,7 @@
         </w:tc>
         <w:tc>
           <w:tcPr>
-            <w:tcW w:w="2347" w:type="dxa"/>
+            <w:tcW w:w="2811" w:type="dxa"/>
           </w:tcPr>
           <w:p>
             <w:pPr/>
@@ -510,11 +510,11 @@
       <w:tr>
         <w:tc>
           <w:tcPr>
-            <w:tcW w:w="3187" w:type="dxa"/>
-          </w:tcPr>
-          <w:p>
-            <w:pPr/>
-            <w:hyperlink r:id="rId7" w:history="1">
+            <w:tcW w:w="2970" w:type="dxa"/>
+          </w:tcPr>
+          <w:p>
+            <w:pPr/>
+            <w:hyperlink r:id="rId6" w:history="1">
               <w:r>
                 <w:rPr>
                   <w:rStyle w:val="Hyperlink"/>
@@ -526,7 +526,7 @@
         </w:tc>
         <w:tc>
           <w:tcPr>
-            <w:tcW w:w="2148" w:type="dxa"/>
+            <w:tcW w:w="2007" w:type="dxa"/>
           </w:tcPr>
           <w:p>
             <w:pPr/>
@@ -537,7 +537,7 @@
         </w:tc>
         <w:tc>
           <w:tcPr>
-            <w:tcW w:w="1678" w:type="dxa"/>
+            <w:tcW w:w="1572" w:type="dxa"/>
           </w:tcPr>
           <w:p>
             <w:pPr/>
@@ -548,7 +548,7 @@
         </w:tc>
         <w:tc>
           <w:tcPr>
-            <w:tcW w:w="2347" w:type="dxa"/>
+            <w:tcW w:w="2811" w:type="dxa"/>
           </w:tcPr>
           <w:p>
             <w:pPr/>
@@ -561,11 +561,11 @@
       <w:tr>
         <w:tc>
           <w:tcPr>
-            <w:tcW w:w="3187" w:type="dxa"/>
-          </w:tcPr>
-          <w:p>
-            <w:pPr/>
-            <w:hyperlink r:id="rId8" w:history="1">
+            <w:tcW w:w="2970" w:type="dxa"/>
+          </w:tcPr>
+          <w:p>
+            <w:pPr/>
+            <w:hyperlink r:id="rId7" w:history="1">
               <w:r>
                 <w:rPr>
                   <w:rStyle w:val="Hyperlink"/>
@@ -577,7 +577,7 @@
         </w:tc>
         <w:tc>
           <w:tcPr>
-            <w:tcW w:w="2148" w:type="dxa"/>
+            <w:tcW w:w="2007" w:type="dxa"/>
           </w:tcPr>
           <w:p>
             <w:pPr/>
@@ -588,7 +588,7 @@
         </w:tc>
         <w:tc>
           <w:tcPr>
-            <w:tcW w:w="1678" w:type="dxa"/>
+            <w:tcW w:w="1572" w:type="dxa"/>
           </w:tcPr>
           <w:p>
             <w:pPr/>
@@ -599,7 +599,7 @@
         </w:tc>
         <w:tc>
           <w:tcPr>
-            <w:tcW w:w="2347" w:type="dxa"/>
+            <w:tcW w:w="2811" w:type="dxa"/>
           </w:tcPr>
           <w:p>
             <w:pPr/>
@@ -612,11 +612,11 @@
       <w:tr>
         <w:tc>
           <w:tcPr>
-            <w:tcW w:w="3187" w:type="dxa"/>
-          </w:tcPr>
-          <w:p>
-            <w:pPr/>
-            <w:hyperlink r:id="rId9" w:history="1">
+            <w:tcW w:w="2970" w:type="dxa"/>
+          </w:tcPr>
+          <w:p>
+            <w:pPr/>
+            <w:hyperlink r:id="rId8" w:history="1">
               <w:r>
                 <w:rPr>
                   <w:rStyle w:val="Hyperlink"/>
@@ -628,7 +628,7 @@
         </w:tc>
         <w:tc>
           <w:tcPr>
-            <w:tcW w:w="2148" w:type="dxa"/>
+            <w:tcW w:w="2007" w:type="dxa"/>
           </w:tcPr>
           <w:p>
             <w:pPr/>
@@ -639,7 +639,7 @@
         </w:tc>
         <w:tc>
           <w:tcPr>
-            <w:tcW w:w="1678" w:type="dxa"/>
+            <w:tcW w:w="1572" w:type="dxa"/>
           </w:tcPr>
           <w:p>
             <w:pPr/>
@@ -650,7 +650,7 @@
         </w:tc>
         <w:tc>
           <w:tcPr>
-            <w:tcW w:w="2347" w:type="dxa"/>
+            <w:tcW w:w="2811" w:type="dxa"/>
           </w:tcPr>
           <w:p>
             <w:pPr/>
@@ -663,11 +663,11 @@
       <w:tr>
         <w:tc>
           <w:tcPr>
-            <w:tcW w:w="3187" w:type="dxa"/>
-          </w:tcPr>
-          <w:p>
-            <w:pPr/>
-            <w:hyperlink r:id="rId10" w:history="1">
+            <w:tcW w:w="2970" w:type="dxa"/>
+          </w:tcPr>
+          <w:p>
+            <w:pPr/>
+            <w:hyperlink r:id="rId9" w:history="1">
               <w:r>
                 <w:rPr>
                   <w:rStyle w:val="Hyperlink"/>
@@ -679,7 +679,7 @@
         </w:tc>
         <w:tc>
           <w:tcPr>
-            <w:tcW w:w="2148" w:type="dxa"/>
+            <w:tcW w:w="2007" w:type="dxa"/>
           </w:tcPr>
           <w:p>
             <w:pPr/>
@@ -690,7 +690,7 @@
         </w:tc>
         <w:tc>
           <w:tcPr>
-            <w:tcW w:w="1678" w:type="dxa"/>
+            <w:tcW w:w="1572" w:type="dxa"/>
           </w:tcPr>
           <w:p>
             <w:pPr/>
@@ -701,7 +701,7 @@
         </w:tc>
         <w:tc>
           <w:tcPr>
-            <w:tcW w:w="2347" w:type="dxa"/>
+            <w:tcW w:w="2811" w:type="dxa"/>
           </w:tcPr>
           <w:p>
             <w:pPr/>
@@ -714,11 +714,11 @@
       <w:tr>
         <w:tc>
           <w:tcPr>
-            <w:tcW w:w="3187" w:type="dxa"/>
-          </w:tcPr>
-          <w:p>
-            <w:pPr/>
-            <w:hyperlink r:id="rId11" w:history="1">
+            <w:tcW w:w="2970" w:type="dxa"/>
+          </w:tcPr>
+          <w:p>
+            <w:pPr/>
+            <w:hyperlink r:id="rId10" w:history="1">
               <w:r>
                 <w:rPr>
                   <w:rStyle w:val="Hyperlink"/>
@@ -730,7 +730,7 @@
         </w:tc>
         <w:tc>
           <w:tcPr>
-            <w:tcW w:w="2148" w:type="dxa"/>
+            <w:tcW w:w="2007" w:type="dxa"/>
           </w:tcPr>
           <w:p>
             <w:pPr/>
@@ -741,7 +741,7 @@
         </w:tc>
         <w:tc>
           <w:tcPr>
-            <w:tcW w:w="1678" w:type="dxa"/>
+            <w:tcW w:w="1572" w:type="dxa"/>
           </w:tcPr>
           <w:p>
             <w:pPr/>
@@ -752,7 +752,7 @@
         </w:tc>
         <w:tc>
           <w:tcPr>
-            <w:tcW w:w="2347" w:type="dxa"/>
+            <w:tcW w:w="2811" w:type="dxa"/>
           </w:tcPr>
           <w:p>
             <w:pPr/>
@@ -797,9 +797,9 @@
         <w:tblLook w:val="04A0" w:firstRow="1" w:lastRow="0" w:firstColumn="0" w:lastColumn="0" w:noHBand="0" w:noVBand="1"/>
       </w:tblPr>
       <w:tblGrid>
-        <w:gridCol w:w="2816"/>
-        <w:gridCol w:w="4117"/>
-        <w:gridCol w:w="2427"/>
+        <w:gridCol w:w="2477"/>
+        <w:gridCol w:w="4525"/>
+        <w:gridCol w:w="2358"/>
       </w:tblGrid>
       <w:tr>
         <w:trPr>
@@ -807,7 +807,7 @@
         </w:trPr>
         <w:tc>
           <w:tcPr>
-            <w:tcW w:w="2816" w:type="dxa"/>
+            <w:tcW w:w="2477" w:type="dxa"/>
             <w:shd w:val="clear" w:color="auto" w:fill="F2F2F2"/>
           </w:tcPr>
           <w:p>
@@ -819,7 +819,7 @@
         </w:tc>
         <w:tc>
           <w:tcPr>
-            <w:tcW w:w="4117" w:type="dxa"/>
+            <w:tcW w:w="4525" w:type="dxa"/>
             <w:shd w:val="clear" w:color="auto" w:fill="F2F2F2"/>
           </w:tcPr>
           <w:p>
@@ -831,7 +831,7 @@
         </w:tc>
         <w:tc>
           <w:tcPr>
-            <w:tcW w:w="2427" w:type="dxa"/>
+            <w:tcW w:w="2358" w:type="dxa"/>
             <w:shd w:val="clear" w:color="auto" w:fill="F2F2F2"/>
           </w:tcPr>
           <w:p>
@@ -845,11 +845,11 @@
       <w:tr>
         <w:tc>
           <w:tcPr>
-            <w:tcW w:w="2816" w:type="dxa"/>
-          </w:tcPr>
-          <w:p>
-            <w:pPr/>
-            <w:hyperlink r:id="rId12" w:history="1">
+            <w:tcW w:w="2477" w:type="dxa"/>
+          </w:tcPr>
+          <w:p>
+            <w:pPr/>
+            <w:hyperlink r:id="rId11" w:history="1">
               <w:r>
                 <w:rPr>
                   <w:rStyle w:val="Hyperlink"/>
@@ -861,7 +861,7 @@
         </w:tc>
         <w:tc>
           <w:tcPr>
-            <w:tcW w:w="4117" w:type="dxa"/>
+            <w:tcW w:w="4525" w:type="dxa"/>
           </w:tcPr>
           <w:p>
             <w:pPr/>
@@ -872,7 +872,7 @@
         </w:tc>
         <w:tc>
           <w:tcPr>
-            <w:tcW w:w="2427" w:type="dxa"/>
+            <w:tcW w:w="2358" w:type="dxa"/>
           </w:tcPr>
           <w:p>
             <w:pPr/>
@@ -885,11 +885,11 @@
       <w:tr>
         <w:tc>
           <w:tcPr>
-            <w:tcW w:w="2816" w:type="dxa"/>
-          </w:tcPr>
-          <w:p>
-            <w:pPr/>
-            <w:hyperlink r:id="rId13" w:history="1">
+            <w:tcW w:w="2477" w:type="dxa"/>
+          </w:tcPr>
+          <w:p>
+            <w:pPr/>
+            <w:hyperlink r:id="rId12" w:history="1">
               <w:r>
                 <w:rPr>
                   <w:rStyle w:val="Hyperlink"/>
@@ -901,23 +901,23 @@
         </w:tc>
         <w:tc>
           <w:tcPr>
-            <w:tcW w:w="4117" w:type="dxa"/>
-          </w:tcPr>
-          <w:p>
-            <w:pPr/>
-            <w:r>
-              <w:t xml:space="preserve">až 100 000 Kč na komunitní zahradu</w:t>
-            </w:r>
-          </w:p>
-        </w:tc>
-        <w:tc>
-          <w:tcPr>
-            <w:tcW w:w="2427" w:type="dxa"/>
-          </w:tcPr>
-          <w:p>
-            <w:pPr/>
-            <w:r>
-              <w:t xml:space="preserve">2026: dotazník do 8. 2.</w:t>
+            <w:tcW w:w="4525" w:type="dxa"/>
+          </w:tcPr>
+          <w:p>
+            <w:pPr/>
+            <w:r>
+              <w:t xml:space="preserve">20 000–100 000 Kč na komunitní zahradu; nutný souhlas vlastníka (města)</w:t>
+            </w:r>
+          </w:p>
+        </w:tc>
+        <w:tc>
+          <w:tcPr>
+            <w:tcW w:w="2358" w:type="dxa"/>
+          </w:tcPr>
+          <w:p>
+            <w:pPr/>
+            <w:r>
+              <w:t xml:space="preserve">2026: dotazník 5. 1.–8. 2.</w:t>
             </w:r>
           </w:p>
         </w:tc>
@@ -925,11 +925,11 @@
       <w:tr>
         <w:tc>
           <w:tcPr>
-            <w:tcW w:w="2816" w:type="dxa"/>
-          </w:tcPr>
-          <w:p>
-            <w:pPr/>
-            <w:hyperlink r:id="rId14" w:history="1">
+            <w:tcW w:w="2477" w:type="dxa"/>
+          </w:tcPr>
+          <w:p>
+            <w:pPr/>
+            <w:hyperlink r:id="rId13" w:history="1">
               <w:r>
                 <w:rPr>
                   <w:rStyle w:val="Hyperlink"/>
@@ -940,7 +940,7 @@
             <w:r>
               <w:t xml:space="preserve"> (</w:t>
             </w:r>
-            <w:hyperlink r:id="rId15" w:history="1">
+            <w:hyperlink r:id="rId14" w:history="1">
               <w:r>
                 <w:rPr>
                   <w:rStyle w:val="Hyperlink"/>
@@ -955,7 +955,7 @@
         </w:tc>
         <w:tc>
           <w:tcPr>
-            <w:tcW w:w="4117" w:type="dxa"/>
+            <w:tcW w:w="4525" w:type="dxa"/>
           </w:tcPr>
           <w:p>
             <w:pPr/>
@@ -966,7 +966,7 @@
         </w:tc>
         <w:tc>
           <w:tcPr>
-            <w:tcW w:w="2427" w:type="dxa"/>
+            <w:tcW w:w="2358" w:type="dxa"/>
           </w:tcPr>
           <w:p>
             <w:pPr/>
@@ -979,11 +979,11 @@
       <w:tr>
         <w:tc>
           <w:tcPr>
-            <w:tcW w:w="2816" w:type="dxa"/>
-          </w:tcPr>
-          <w:p>
-            <w:pPr/>
-            <w:hyperlink r:id="rId16" w:history="1">
+            <w:tcW w:w="2477" w:type="dxa"/>
+          </w:tcPr>
+          <w:p>
+            <w:pPr/>
+            <w:hyperlink r:id="rId15" w:history="1">
               <w:r>
                 <w:rPr>
                   <w:rStyle w:val="Hyperlink"/>
@@ -995,7 +995,7 @@
         </w:tc>
         <w:tc>
           <w:tcPr>
-            <w:tcW w:w="4117" w:type="dxa"/>
+            <w:tcW w:w="4525" w:type="dxa"/>
           </w:tcPr>
           <w:p>
             <w:pPr/>
@@ -1006,12 +1006,106 @@
         </w:tc>
         <w:tc>
           <w:tcPr>
-            <w:tcW w:w="2427" w:type="dxa"/>
-          </w:tcPr>
-          <w:p>
-            <w:pPr/>
-            <w:r>
-              <w:t xml:space="preserve">2026: do 15. 7.</w:t>
+            <w:tcW w:w="2358" w:type="dxa"/>
+          </w:tcPr>
+          <w:p>
+            <w:pPr/>
+            <w:r>
+              <w:t xml:space="preserve">2026: do 15. 7.; další ročník čekám v létě 2027 (odhad)</w:t>
+            </w:r>
+          </w:p>
+        </w:tc>
+      </w:tr>
+      <w:tr>
+        <w:tc>
+          <w:tcPr>
+            <w:tcW w:w="2477" w:type="dxa"/>
+          </w:tcPr>
+          <w:p>
+            <w:pPr/>
+            <w:hyperlink r:id="rId16" w:history="1">
+              <w:r>
+                <w:rPr>
+                  <w:rStyle w:val="Hyperlink"/>
+                </w:rPr>
+                <w:t xml:space="preserve">Nadace Partnerství: Pro odolná města a zdravou krajinu</w:t>
+              </w:r>
+            </w:hyperlink>
+            <w:r>
+              <w:t xml:space="preserve"> (</w:t>
+            </w:r>
+            <w:hyperlink r:id="rId17" w:history="1">
+              <w:r>
+                <w:rPr>
+                  <w:rStyle w:val="Hyperlink"/>
+                </w:rPr>
+                <w:t xml:space="preserve">výzva 2026</w:t>
+              </w:r>
+            </w:hyperlink>
+            <w:r>
+              <w:t xml:space="preserve">)</w:t>
+            </w:r>
+          </w:p>
+        </w:tc>
+        <w:tc>
+          <w:tcPr>
+            <w:tcW w:w="4525" w:type="dxa"/>
+          </w:tcPr>
+          <w:p>
+            <w:pPr/>
+            <w:r>
+              <w:t xml:space="preserve">50 000–200 000 Kč na přírodě blízká opatření v obci, výslovně i komunitní zahrady; souhlas vlastníka, veřejně přístupné; vyvýšené záhony nelze</w:t>
+            </w:r>
+          </w:p>
+        </w:tc>
+        <w:tc>
+          <w:tcPr>
+            <w:tcW w:w="2358" w:type="dxa"/>
+          </w:tcPr>
+          <w:p>
+            <w:pPr/>
+            <w:r>
+              <w:t xml:space="preserve">2026: 24. 8.–15. 10.; další ročník čekám na podzim 2027 (odhad)</w:t>
+            </w:r>
+          </w:p>
+        </w:tc>
+      </w:tr>
+      <w:tr>
+        <w:tc>
+          <w:tcPr>
+            <w:tcW w:w="2477" w:type="dxa"/>
+          </w:tcPr>
+          <w:p>
+            <w:pPr/>
+            <w:hyperlink r:id="rId18" w:history="1">
+              <w:r>
+                <w:rPr>
+                  <w:rStyle w:val="Hyperlink"/>
+                </w:rPr>
+                <w:t xml:space="preserve">Nadace Partnerství: Péče o mladé stromy</w:t>
+              </w:r>
+            </w:hyperlink>
+          </w:p>
+        </w:tc>
+        <w:tc>
+          <w:tcPr>
+            <w:tcW w:w="4525" w:type="dxa"/>
+          </w:tcPr>
+          <w:p>
+            <w:pPr/>
+            <w:r>
+              <w:t xml:space="preserve">20 000–100 000 Kč na ošetření stromů vysazených v posledních 10 letech; na zahradě až po výsadbě lípy</w:t>
+            </w:r>
+          </w:p>
+        </w:tc>
+        <w:tc>
+          <w:tcPr>
+            <w:tcW w:w="2358" w:type="dxa"/>
+          </w:tcPr>
+          <w:p>
+            <w:pPr/>
+            <w:r>
+              <w:t xml:space="preserve">do 15. 11. 2026</w:t>
             </w:r>
           </w:p>
         </w:tc>
@@ -1022,7 +1116,7 @@
       <w:r>
         <w:t xml:space="preserve">Kde hledat další: </w:t>
       </w:r>
-      <w:hyperlink r:id="rId17" w:history="1">
+      <w:hyperlink r:id="rId19" w:history="1">
         <w:r>
           <w:rPr>
             <w:rStyle w:val="Hyperlink"/>
@@ -1031,18 +1125,40 @@
         </w:r>
       </w:hyperlink>
       <w:r>
-        <w:t xml:space="preserve"> (Úřad vlády, státní programy pro neziskovky) a </w:t>
-      </w:r>
-      <w:hyperlink r:id="rId18" w:history="1">
+        <w:t xml:space="preserve"> (Úřad vlády, státní programy pro neziskovky), </w:t>
+      </w:r>
+      <w:hyperlink r:id="rId13" w:history="1">
         <w:r>
           <w:rPr>
             <w:rStyle w:val="Hyperlink"/>
           </w:rPr>
-          <w:t xml:space="preserve">přehled výzev na památky</w:t>
+          <w:t xml:space="preserve">národní dotace MMR pro neziskovky</w:t>
         </w:r>
       </w:hyperlink>
       <w:r>
-        <w:t xml:space="preserve">.</w:t>
+        <w:t xml:space="preserve">, </w:t>
+      </w:r>
+      <w:hyperlink r:id="rId20" w:history="1">
+        <w:r>
+          <w:rPr>
+            <w:rStyle w:val="Hyperlink"/>
+          </w:rPr>
+          <w:t xml:space="preserve">aktuální výzvy Nadace Partnerství</w:t>
+        </w:r>
+      </w:hyperlink>
+      <w:r>
+        <w:t xml:space="preserve"> a </w:t>
+      </w:r>
+      <w:hyperlink r:id="rId21" w:history="1">
+        <w:r>
+          <w:rPr>
+            <w:rStyle w:val="Hyperlink"/>
+          </w:rPr>
+          <w:t xml:space="preserve">přehled dotačních výzev na památky</w:t>
+        </w:r>
+      </w:hyperlink>
+      <w:r>
+        <w:t xml:space="preserve"> na propamatky.cz. Propamatky.cz je jen rozcestník, podmínky je vždy potřeba ověřit u poskytovatele.</w:t>
       </w:r>
     </w:p>
     <w:sectPr>

</xml_diff>

<commit_message>
Dotační manuál: programy MAS Kraj živých vod
Co-Authored-By: Claude Opus 5.5 (1M context) <noreply@anthropic.com>
Claude-Session: https://claude.ai/code/session_014Cms99YiFfg5qXi7rp4DXx
</commit_message>
<xml_diff>
--- a/docs/dotacni-manual.docx
+++ b/docs/dotacni-manual.docx
@@ -296,10 +296,10 @@
         <w:tblLook w:val="04A0" w:firstRow="1" w:lastRow="0" w:firstColumn="0" w:lastColumn="0" w:noHBand="0" w:noVBand="1"/>
       </w:tblPr>
       <w:tblGrid>
-        <w:gridCol w:w="2970"/>
-        <w:gridCol w:w="2007"/>
-        <w:gridCol w:w="1572"/>
-        <w:gridCol w:w="2811"/>
+        <w:gridCol w:w="2668"/>
+        <w:gridCol w:w="2358"/>
+        <w:gridCol w:w="1601"/>
+        <w:gridCol w:w="2732"/>
       </w:tblGrid>
       <w:tr>
         <w:trPr>
@@ -307,7 +307,7 @@
         </w:trPr>
         <w:tc>
           <w:tcPr>
-            <w:tcW w:w="2970" w:type="dxa"/>
+            <w:tcW w:w="2668" w:type="dxa"/>
             <w:shd w:val="clear" w:color="auto" w:fill="F2F2F2"/>
           </w:tcPr>
           <w:p>
@@ -319,7 +319,7 @@
         </w:tc>
         <w:tc>
           <w:tcPr>
-            <w:tcW w:w="2007" w:type="dxa"/>
+            <w:tcW w:w="2358" w:type="dxa"/>
             <w:shd w:val="clear" w:color="auto" w:fill="F2F2F2"/>
           </w:tcPr>
           <w:p>
@@ -331,7 +331,7 @@
         </w:tc>
         <w:tc>
           <w:tcPr>
-            <w:tcW w:w="1572" w:type="dxa"/>
+            <w:tcW w:w="1601" w:type="dxa"/>
             <w:shd w:val="clear" w:color="auto" w:fill="F2F2F2"/>
           </w:tcPr>
           <w:p>
@@ -343,7 +343,7 @@
         </w:tc>
         <w:tc>
           <w:tcPr>
-            <w:tcW w:w="2811" w:type="dxa"/>
+            <w:tcW w:w="2732" w:type="dxa"/>
             <w:shd w:val="clear" w:color="auto" w:fill="F2F2F2"/>
           </w:tcPr>
           <w:p>
@@ -357,7 +357,7 @@
       <w:tr>
         <w:tc>
           <w:tcPr>
-            <w:tcW w:w="2970" w:type="dxa"/>
+            <w:tcW w:w="2668" w:type="dxa"/>
           </w:tcPr>
           <w:p>
             <w:pPr/>
@@ -373,7 +373,7 @@
         </w:tc>
         <w:tc>
           <w:tcPr>
-            <w:tcW w:w="2007" w:type="dxa"/>
+            <w:tcW w:w="2358" w:type="dxa"/>
           </w:tcPr>
           <w:p>
             <w:pPr/>
@@ -384,7 +384,7 @@
         </w:tc>
         <w:tc>
           <w:tcPr>
-            <w:tcW w:w="1572" w:type="dxa"/>
+            <w:tcW w:w="1601" w:type="dxa"/>
           </w:tcPr>
           <w:p>
             <w:pPr/>
@@ -395,7 +395,7 @@
         </w:tc>
         <w:tc>
           <w:tcPr>
-            <w:tcW w:w="2811" w:type="dxa"/>
+            <w:tcW w:w="2732" w:type="dxa"/>
           </w:tcPr>
           <w:p>
             <w:pPr/>
@@ -408,7 +408,7 @@
       <w:tr>
         <w:tc>
           <w:tcPr>
-            <w:tcW w:w="2970" w:type="dxa"/>
+            <w:tcW w:w="2668" w:type="dxa"/>
           </w:tcPr>
           <w:p>
             <w:pPr/>
@@ -424,7 +424,7 @@
         </w:tc>
         <w:tc>
           <w:tcPr>
-            <w:tcW w:w="2007" w:type="dxa"/>
+            <w:tcW w:w="2358" w:type="dxa"/>
           </w:tcPr>
           <w:p>
             <w:pPr/>
@@ -435,7 +435,7 @@
         </w:tc>
         <w:tc>
           <w:tcPr>
-            <w:tcW w:w="1572" w:type="dxa"/>
+            <w:tcW w:w="1601" w:type="dxa"/>
           </w:tcPr>
           <w:p>
             <w:pPr/>
@@ -446,7 +446,7 @@
         </w:tc>
         <w:tc>
           <w:tcPr>
-            <w:tcW w:w="2811" w:type="dxa"/>
+            <w:tcW w:w="2732" w:type="dxa"/>
           </w:tcPr>
           <w:p>
             <w:pPr/>
@@ -459,7 +459,7 @@
       <w:tr>
         <w:tc>
           <w:tcPr>
-            <w:tcW w:w="2970" w:type="dxa"/>
+            <w:tcW w:w="2668" w:type="dxa"/>
           </w:tcPr>
           <w:p>
             <w:pPr/>
@@ -475,7 +475,7 @@
         </w:tc>
         <w:tc>
           <w:tcPr>
-            <w:tcW w:w="2007" w:type="dxa"/>
+            <w:tcW w:w="2358" w:type="dxa"/>
           </w:tcPr>
           <w:p>
             <w:pPr/>
@@ -486,7 +486,7 @@
         </w:tc>
         <w:tc>
           <w:tcPr>
-            <w:tcW w:w="1572" w:type="dxa"/>
+            <w:tcW w:w="1601" w:type="dxa"/>
           </w:tcPr>
           <w:p>
             <w:pPr/>
@@ -497,7 +497,7 @@
         </w:tc>
         <w:tc>
           <w:tcPr>
-            <w:tcW w:w="2811" w:type="dxa"/>
+            <w:tcW w:w="2732" w:type="dxa"/>
           </w:tcPr>
           <w:p>
             <w:pPr/>
@@ -510,7 +510,7 @@
       <w:tr>
         <w:tc>
           <w:tcPr>
-            <w:tcW w:w="2970" w:type="dxa"/>
+            <w:tcW w:w="2668" w:type="dxa"/>
           </w:tcPr>
           <w:p>
             <w:pPr/>
@@ -526,7 +526,7 @@
         </w:tc>
         <w:tc>
           <w:tcPr>
-            <w:tcW w:w="2007" w:type="dxa"/>
+            <w:tcW w:w="2358" w:type="dxa"/>
           </w:tcPr>
           <w:p>
             <w:pPr/>
@@ -537,7 +537,7 @@
         </w:tc>
         <w:tc>
           <w:tcPr>
-            <w:tcW w:w="1572" w:type="dxa"/>
+            <w:tcW w:w="1601" w:type="dxa"/>
           </w:tcPr>
           <w:p>
             <w:pPr/>
@@ -548,7 +548,7 @@
         </w:tc>
         <w:tc>
           <w:tcPr>
-            <w:tcW w:w="2811" w:type="dxa"/>
+            <w:tcW w:w="2732" w:type="dxa"/>
           </w:tcPr>
           <w:p>
             <w:pPr/>
@@ -561,7 +561,7 @@
       <w:tr>
         <w:tc>
           <w:tcPr>
-            <w:tcW w:w="2970" w:type="dxa"/>
+            <w:tcW w:w="2668" w:type="dxa"/>
           </w:tcPr>
           <w:p>
             <w:pPr/>
@@ -573,54 +573,68 @@
                 <w:t xml:space="preserve">MAS Kraj živých vod: Dr. ŽIVODA</w:t>
               </w:r>
             </w:hyperlink>
-          </w:p>
-        </w:tc>
-        <w:tc>
-          <w:tcPr>
-            <w:tcW w:w="2007" w:type="dxa"/>
-          </w:tcPr>
-          <w:p>
-            <w:pPr/>
-            <w:r>
-              <w:t xml:space="preserve">kulturní a sportovní akce s místními spolky</w:t>
-            </w:r>
-          </w:p>
-        </w:tc>
-        <w:tc>
-          <w:tcPr>
-            <w:tcW w:w="1572" w:type="dxa"/>
-          </w:tcPr>
-          <w:p>
-            <w:pPr/>
-            <w:r>
-              <w:t xml:space="preserve">cca březen</w:t>
-            </w:r>
-          </w:p>
-        </w:tc>
-        <w:tc>
-          <w:tcPr>
-            <w:tcW w:w="2811" w:type="dxa"/>
-          </w:tcPr>
-          <w:p>
-            <w:pPr/>
-            <w:r>
-              <w:t xml:space="preserve">e-mailem na krajzivychvod@seznam.cz</w:t>
-            </w:r>
-          </w:p>
-        </w:tc>
-      </w:tr>
-      <w:tr>
-        <w:tc>
-          <w:tcPr>
-            <w:tcW w:w="2970" w:type="dxa"/>
-          </w:tcPr>
-          <w:p>
-            <w:pPr/>
+            <w:r>
+              <w:t xml:space="preserve"> (</w:t>
+            </w:r>
             <w:hyperlink r:id="rId8" w:history="1">
               <w:r>
                 <w:rPr>
                   <w:rStyle w:val="Hyperlink"/>
                 </w:rPr>
+                <w:t xml:space="preserve">pravidla 2026</w:t>
+              </w:r>
+            </w:hyperlink>
+            <w:r>
+              <w:t xml:space="preserve">)</w:t>
+            </w:r>
+          </w:p>
+        </w:tc>
+        <w:tc>
+          <w:tcPr>
+            <w:tcW w:w="2358" w:type="dxa"/>
+          </w:tcPr>
+          <w:p>
+            <w:pPr/>
+            <w:r>
+              <w:t xml:space="preserve">až 50 000 Kč na žádost; veřejné a komunitní akce, neinvestiční vybavení spolku, honorář odborníka; jedna žádost v každé oblasti</w:t>
+            </w:r>
+          </w:p>
+        </w:tc>
+        <w:tc>
+          <w:tcPr>
+            <w:tcW w:w="1601" w:type="dxa"/>
+          </w:tcPr>
+          <w:p>
+            <w:pPr/>
+            <w:r>
+              <w:t xml:space="preserve">2026: 1. 3.–30. 4., veřejné slyšení 5.–6. 5.</w:t>
+            </w:r>
+          </w:p>
+        </w:tc>
+        <w:tc>
+          <w:tcPr>
+            <w:tcW w:w="2732" w:type="dxa"/>
+          </w:tcPr>
+          <w:p>
+            <w:pPr/>
+            <w:r>
+              <w:t xml:space="preserve">e-mailem na krajzivychvod@seznam.cz; účast na veřejném slyšení je podmínkou</w:t>
+            </w:r>
+          </w:p>
+        </w:tc>
+      </w:tr>
+      <w:tr>
+        <w:tc>
+          <w:tcPr>
+            <w:tcW w:w="2668" w:type="dxa"/>
+          </w:tcPr>
+          <w:p>
+            <w:pPr/>
+            <w:hyperlink r:id="rId9" w:history="1">
+              <w:r>
+                <w:rPr>
+                  <w:rStyle w:val="Hyperlink"/>
+                </w:rPr>
                 <w:t xml:space="preserve">Nadace ČEZ: Zaměstnanecké granty</w:t>
               </w:r>
             </w:hyperlink>
@@ -628,7 +642,7 @@
         </w:tc>
         <w:tc>
           <w:tcPr>
-            <w:tcW w:w="2007" w:type="dxa"/>
+            <w:tcW w:w="2358" w:type="dxa"/>
           </w:tcPr>
           <w:p>
             <w:pPr/>
@@ -639,7 +653,7 @@
         </w:tc>
         <w:tc>
           <w:tcPr>
-            <w:tcW w:w="1572" w:type="dxa"/>
+            <w:tcW w:w="1601" w:type="dxa"/>
           </w:tcPr>
           <w:p>
             <w:pPr/>
@@ -650,7 +664,7 @@
         </w:tc>
         <w:tc>
           <w:tcPr>
-            <w:tcW w:w="2811" w:type="dxa"/>
+            <w:tcW w:w="2732" w:type="dxa"/>
           </w:tcPr>
           <w:p>
             <w:pPr/>
@@ -663,11 +677,11 @@
       <w:tr>
         <w:tc>
           <w:tcPr>
-            <w:tcW w:w="2970" w:type="dxa"/>
-          </w:tcPr>
-          <w:p>
-            <w:pPr/>
-            <w:hyperlink r:id="rId9" w:history="1">
+            <w:tcW w:w="2668" w:type="dxa"/>
+          </w:tcPr>
+          <w:p>
+            <w:pPr/>
+            <w:hyperlink r:id="rId10" w:history="1">
               <w:r>
                 <w:rPr>
                   <w:rStyle w:val="Hyperlink"/>
@@ -679,7 +693,7 @@
         </w:tc>
         <w:tc>
           <w:tcPr>
-            <w:tcW w:w="2007" w:type="dxa"/>
+            <w:tcW w:w="2358" w:type="dxa"/>
           </w:tcPr>
           <w:p>
             <w:pPr/>
@@ -690,7 +704,7 @@
         </w:tc>
         <w:tc>
           <w:tcPr>
-            <w:tcW w:w="1572" w:type="dxa"/>
+            <w:tcW w:w="1601" w:type="dxa"/>
           </w:tcPr>
           <w:p>
             <w:pPr/>
@@ -701,7 +715,7 @@
         </w:tc>
         <w:tc>
           <w:tcPr>
-            <w:tcW w:w="2811" w:type="dxa"/>
+            <w:tcW w:w="2732" w:type="dxa"/>
           </w:tcPr>
           <w:p>
             <w:pPr/>
@@ -714,11 +728,11 @@
       <w:tr>
         <w:tc>
           <w:tcPr>
-            <w:tcW w:w="2970" w:type="dxa"/>
-          </w:tcPr>
-          <w:p>
-            <w:pPr/>
-            <w:hyperlink r:id="rId10" w:history="1">
+            <w:tcW w:w="2668" w:type="dxa"/>
+          </w:tcPr>
+          <w:p>
+            <w:pPr/>
+            <w:hyperlink r:id="rId11" w:history="1">
               <w:r>
                 <w:rPr>
                   <w:rStyle w:val="Hyperlink"/>
@@ -730,7 +744,7 @@
         </w:tc>
         <w:tc>
           <w:tcPr>
-            <w:tcW w:w="2007" w:type="dxa"/>
+            <w:tcW w:w="2358" w:type="dxa"/>
           </w:tcPr>
           <w:p>
             <w:pPr/>
@@ -741,7 +755,7 @@
         </w:tc>
         <w:tc>
           <w:tcPr>
-            <w:tcW w:w="1572" w:type="dxa"/>
+            <w:tcW w:w="1601" w:type="dxa"/>
           </w:tcPr>
           <w:p>
             <w:pPr/>
@@ -752,7 +766,7 @@
         </w:tc>
         <w:tc>
           <w:tcPr>
-            <w:tcW w:w="2811" w:type="dxa"/>
+            <w:tcW w:w="2732" w:type="dxa"/>
           </w:tcPr>
           <w:p>
             <w:pPr/>
@@ -797,9 +811,9 @@
         <w:tblLook w:val="04A0" w:firstRow="1" w:lastRow="0" w:firstColumn="0" w:lastColumn="0" w:noHBand="0" w:noVBand="1"/>
       </w:tblPr>
       <w:tblGrid>
-        <w:gridCol w:w="2477"/>
-        <w:gridCol w:w="4525"/>
-        <w:gridCol w:w="2358"/>
+        <w:gridCol w:w="2245"/>
+        <w:gridCol w:w="4879"/>
+        <w:gridCol w:w="2236"/>
       </w:tblGrid>
       <w:tr>
         <w:trPr>
@@ -807,7 +821,7 @@
         </w:trPr>
         <w:tc>
           <w:tcPr>
-            <w:tcW w:w="2477" w:type="dxa"/>
+            <w:tcW w:w="2245" w:type="dxa"/>
             <w:shd w:val="clear" w:color="auto" w:fill="F2F2F2"/>
           </w:tcPr>
           <w:p>
@@ -819,7 +833,7 @@
         </w:tc>
         <w:tc>
           <w:tcPr>
-            <w:tcW w:w="4525" w:type="dxa"/>
+            <w:tcW w:w="4879" w:type="dxa"/>
             <w:shd w:val="clear" w:color="auto" w:fill="F2F2F2"/>
           </w:tcPr>
           <w:p>
@@ -831,7 +845,7 @@
         </w:tc>
         <w:tc>
           <w:tcPr>
-            <w:tcW w:w="2358" w:type="dxa"/>
+            <w:tcW w:w="2236" w:type="dxa"/>
             <w:shd w:val="clear" w:color="auto" w:fill="F2F2F2"/>
           </w:tcPr>
           <w:p>
@@ -845,11 +859,11 @@
       <w:tr>
         <w:tc>
           <w:tcPr>
-            <w:tcW w:w="2477" w:type="dxa"/>
-          </w:tcPr>
-          <w:p>
-            <w:pPr/>
-            <w:hyperlink r:id="rId11" w:history="1">
+            <w:tcW w:w="2245" w:type="dxa"/>
+          </w:tcPr>
+          <w:p>
+            <w:pPr/>
+            <w:hyperlink r:id="rId12" w:history="1">
               <w:r>
                 <w:rPr>
                   <w:rStyle w:val="Hyperlink"/>
@@ -861,7 +875,7 @@
         </w:tc>
         <w:tc>
           <w:tcPr>
-            <w:tcW w:w="4525" w:type="dxa"/>
+            <w:tcW w:w="4879" w:type="dxa"/>
           </w:tcPr>
           <w:p>
             <w:pPr/>
@@ -872,7 +886,7 @@
         </w:tc>
         <w:tc>
           <w:tcPr>
-            <w:tcW w:w="2358" w:type="dxa"/>
+            <w:tcW w:w="2236" w:type="dxa"/>
           </w:tcPr>
           <w:p>
             <w:pPr/>
@@ -885,11 +899,11 @@
       <w:tr>
         <w:tc>
           <w:tcPr>
-            <w:tcW w:w="2477" w:type="dxa"/>
-          </w:tcPr>
-          <w:p>
-            <w:pPr/>
-            <w:hyperlink r:id="rId12" w:history="1">
+            <w:tcW w:w="2245" w:type="dxa"/>
+          </w:tcPr>
+          <w:p>
+            <w:pPr/>
+            <w:hyperlink r:id="rId13" w:history="1">
               <w:r>
                 <w:rPr>
                   <w:rStyle w:val="Hyperlink"/>
@@ -901,7 +915,7 @@
         </w:tc>
         <w:tc>
           <w:tcPr>
-            <w:tcW w:w="4525" w:type="dxa"/>
+            <w:tcW w:w="4879" w:type="dxa"/>
           </w:tcPr>
           <w:p>
             <w:pPr/>
@@ -912,7 +926,7 @@
         </w:tc>
         <w:tc>
           <w:tcPr>
-            <w:tcW w:w="2358" w:type="dxa"/>
+            <w:tcW w:w="2236" w:type="dxa"/>
           </w:tcPr>
           <w:p>
             <w:pPr/>
@@ -925,11 +939,11 @@
       <w:tr>
         <w:tc>
           <w:tcPr>
-            <w:tcW w:w="2477" w:type="dxa"/>
-          </w:tcPr>
-          <w:p>
-            <w:pPr/>
-            <w:hyperlink r:id="rId13" w:history="1">
+            <w:tcW w:w="2245" w:type="dxa"/>
+          </w:tcPr>
+          <w:p>
+            <w:pPr/>
+            <w:hyperlink r:id="rId14" w:history="1">
               <w:r>
                 <w:rPr>
                   <w:rStyle w:val="Hyperlink"/>
@@ -940,7 +954,7 @@
             <w:r>
               <w:t xml:space="preserve"> (</w:t>
             </w:r>
-            <w:hyperlink r:id="rId14" w:history="1">
+            <w:hyperlink r:id="rId15" w:history="1">
               <w:r>
                 <w:rPr>
                   <w:rStyle w:val="Hyperlink"/>
@@ -955,7 +969,7 @@
         </w:tc>
         <w:tc>
           <w:tcPr>
-            <w:tcW w:w="4525" w:type="dxa"/>
+            <w:tcW w:w="4879" w:type="dxa"/>
           </w:tcPr>
           <w:p>
             <w:pPr/>
@@ -966,7 +980,7 @@
         </w:tc>
         <w:tc>
           <w:tcPr>
-            <w:tcW w:w="2358" w:type="dxa"/>
+            <w:tcW w:w="2236" w:type="dxa"/>
           </w:tcPr>
           <w:p>
             <w:pPr/>
@@ -979,11 +993,11 @@
       <w:tr>
         <w:tc>
           <w:tcPr>
-            <w:tcW w:w="2477" w:type="dxa"/>
-          </w:tcPr>
-          <w:p>
-            <w:pPr/>
-            <w:hyperlink r:id="rId15" w:history="1">
+            <w:tcW w:w="2245" w:type="dxa"/>
+          </w:tcPr>
+          <w:p>
+            <w:pPr/>
+            <w:hyperlink r:id="rId16" w:history="1">
               <w:r>
                 <w:rPr>
                   <w:rStyle w:val="Hyperlink"/>
@@ -995,7 +1009,7 @@
         </w:tc>
         <w:tc>
           <w:tcPr>
-            <w:tcW w:w="4525" w:type="dxa"/>
+            <w:tcW w:w="4879" w:type="dxa"/>
           </w:tcPr>
           <w:p>
             <w:pPr/>
@@ -1006,7 +1020,7 @@
         </w:tc>
         <w:tc>
           <w:tcPr>
-            <w:tcW w:w="2358" w:type="dxa"/>
+            <w:tcW w:w="2236" w:type="dxa"/>
           </w:tcPr>
           <w:p>
             <w:pPr/>
@@ -1019,11 +1033,11 @@
       <w:tr>
         <w:tc>
           <w:tcPr>
-            <w:tcW w:w="2477" w:type="dxa"/>
-          </w:tcPr>
-          <w:p>
-            <w:pPr/>
-            <w:hyperlink r:id="rId16" w:history="1">
+            <w:tcW w:w="2245" w:type="dxa"/>
+          </w:tcPr>
+          <w:p>
+            <w:pPr/>
+            <w:hyperlink r:id="rId17" w:history="1">
               <w:r>
                 <w:rPr>
                   <w:rStyle w:val="Hyperlink"/>
@@ -1034,7 +1048,7 @@
             <w:r>
               <w:t xml:space="preserve"> (</w:t>
             </w:r>
-            <w:hyperlink r:id="rId17" w:history="1">
+            <w:hyperlink r:id="rId18" w:history="1">
               <w:r>
                 <w:rPr>
                   <w:rStyle w:val="Hyperlink"/>
@@ -1049,7 +1063,7 @@
         </w:tc>
         <w:tc>
           <w:tcPr>
-            <w:tcW w:w="4525" w:type="dxa"/>
+            <w:tcW w:w="4879" w:type="dxa"/>
           </w:tcPr>
           <w:p>
             <w:pPr/>
@@ -1060,7 +1074,7 @@
         </w:tc>
         <w:tc>
           <w:tcPr>
-            <w:tcW w:w="2358" w:type="dxa"/>
+            <w:tcW w:w="2236" w:type="dxa"/>
           </w:tcPr>
           <w:p>
             <w:pPr/>
@@ -1073,11 +1087,11 @@
       <w:tr>
         <w:tc>
           <w:tcPr>
-            <w:tcW w:w="2477" w:type="dxa"/>
-          </w:tcPr>
-          <w:p>
-            <w:pPr/>
-            <w:hyperlink r:id="rId18" w:history="1">
+            <w:tcW w:w="2245" w:type="dxa"/>
+          </w:tcPr>
+          <w:p>
+            <w:pPr/>
+            <w:hyperlink r:id="rId19" w:history="1">
               <w:r>
                 <w:rPr>
                   <w:rStyle w:val="Hyperlink"/>
@@ -1089,7 +1103,7 @@
         </w:tc>
         <w:tc>
           <w:tcPr>
-            <w:tcW w:w="4525" w:type="dxa"/>
+            <w:tcW w:w="4879" w:type="dxa"/>
           </w:tcPr>
           <w:p>
             <w:pPr/>
@@ -1100,7 +1114,7 @@
         </w:tc>
         <w:tc>
           <w:tcPr>
-            <w:tcW w:w="2358" w:type="dxa"/>
+            <w:tcW w:w="2236" w:type="dxa"/>
           </w:tcPr>
           <w:p>
             <w:pPr/>
@@ -1110,13 +1124,93 @@
           </w:p>
         </w:tc>
       </w:tr>
+      <w:tr>
+        <w:tc>
+          <w:tcPr>
+            <w:tcW w:w="2245" w:type="dxa"/>
+          </w:tcPr>
+          <w:p>
+            <w:pPr/>
+            <w:hyperlink r:id="rId20" w:history="1">
+              <w:r>
+                <w:rPr>
+                  <w:rStyle w:val="Hyperlink"/>
+                </w:rPr>
+                <w:t xml:space="preserve">MAS Kraj živých vod: SZP Leader, Fiche 5 Obnova venkova</w:t>
+              </w:r>
+            </w:hyperlink>
+          </w:p>
+        </w:tc>
+        <w:tc>
+          <w:tcPr>
+            <w:tcW w:w="4879" w:type="dxa"/>
+          </w:tcPr>
+          <w:p>
+            <w:pPr/>
+            <w:r>
+              <w:t xml:space="preserve">dotace 80 % z 100 000–2 000 000 Kč na kulturní a spolková zařízení a drobné památky; neziskovka +30 bodů; spolek musí předfinancovat; podání přes Portál farmáře SZIF; výpůjčku zámku ověřit u MAS</w:t>
+            </w:r>
+          </w:p>
+        </w:tc>
+        <w:tc>
+          <w:tcPr>
+            <w:tcW w:w="2236" w:type="dxa"/>
+          </w:tcPr>
+          <w:p>
+            <w:pPr/>
+            <w:r>
+              <w:t xml:space="preserve">2026: 2.–20. 3.; 2027 zatím nevyhlášeno (odhad březen)</w:t>
+            </w:r>
+          </w:p>
+        </w:tc>
+      </w:tr>
+      <w:tr>
+        <w:tc>
+          <w:tcPr>
+            <w:tcW w:w="2245" w:type="dxa"/>
+          </w:tcPr>
+          <w:p>
+            <w:pPr/>
+            <w:hyperlink r:id="rId21" w:history="1">
+              <w:r>
+                <w:rPr>
+                  <w:rStyle w:val="Hyperlink"/>
+                </w:rPr>
+                <w:t xml:space="preserve">MAS Kraj živých vod: IROP Kultura</w:t>
+              </w:r>
+            </w:hyperlink>
+          </w:p>
+        </w:tc>
+        <w:tc>
+          <w:tcPr>
+            <w:tcW w:w="4879" w:type="dxa"/>
+          </w:tcPr>
+          <w:p>
+            <w:pPr/>
+            <w:r>
+              <w:t xml:space="preserve">obnova památkově chráněných objektů pro kulturu; nejvíc bodů má neziskovka-vlastník, proto spíš pro město se spolkem jako partnerem</w:t>
+            </w:r>
+          </w:p>
+        </w:tc>
+        <w:tc>
+          <w:tcPr>
+            <w:tcW w:w="2236" w:type="dxa"/>
+          </w:tcPr>
+          <w:p>
+            <w:pPr/>
+            <w:r>
+              <w:t xml:space="preserve">2026: 1. 4.–1. 6. a 1. 8.–31. 8.; další kolo nevyhlášeno</w:t>
+            </w:r>
+          </w:p>
+        </w:tc>
+      </w:tr>
     </w:tbl>
     <w:p>
       <w:pPr/>
       <w:r>
         <w:t xml:space="preserve">Kde hledat další: </w:t>
       </w:r>
-      <w:hyperlink r:id="rId19" w:history="1">
+      <w:hyperlink r:id="rId22" w:history="1">
         <w:r>
           <w:rPr>
             <w:rStyle w:val="Hyperlink"/>
@@ -1127,7 +1221,7 @@
       <w:r>
         <w:t xml:space="preserve"> (Úřad vlády, státní programy pro neziskovky), </w:t>
       </w:r>
-      <w:hyperlink r:id="rId13" w:history="1">
+      <w:hyperlink r:id="rId14" w:history="1">
         <w:r>
           <w:rPr>
             <w:rStyle w:val="Hyperlink"/>
@@ -1138,7 +1232,7 @@
       <w:r>
         <w:t xml:space="preserve">, </w:t>
       </w:r>
-      <w:hyperlink r:id="rId20" w:history="1">
+      <w:hyperlink r:id="rId23" w:history="1">
         <w:r>
           <w:rPr>
             <w:rStyle w:val="Hyperlink"/>
@@ -1149,7 +1243,7 @@
       <w:r>
         <w:t xml:space="preserve"> a </w:t>
       </w:r>
-      <w:hyperlink r:id="rId21" w:history="1">
+      <w:hyperlink r:id="rId24" w:history="1">
         <w:r>
           <w:rPr>
             <w:rStyle w:val="Hyperlink"/>

</xml_diff>

<commit_message>
Dotační manuál: programy MAS Kraj živých vod (#22)
Claude-Session: https://claude.ai/code/session_014Cms99YiFfg5qXi7rp4DXx

Co-authored-by: Claude <noreply@anthropic.com>
</commit_message>
<xml_diff>
--- a/docs/dotacni-manual.docx
+++ b/docs/dotacni-manual.docx
@@ -296,10 +296,10 @@
         <w:tblLook w:val="04A0" w:firstRow="1" w:lastRow="0" w:firstColumn="0" w:lastColumn="0" w:noHBand="0" w:noVBand="1"/>
       </w:tblPr>
       <w:tblGrid>
-        <w:gridCol w:w="2970"/>
-        <w:gridCol w:w="2007"/>
-        <w:gridCol w:w="1572"/>
-        <w:gridCol w:w="2811"/>
+        <w:gridCol w:w="2668"/>
+        <w:gridCol w:w="2358"/>
+        <w:gridCol w:w="1601"/>
+        <w:gridCol w:w="2732"/>
       </w:tblGrid>
       <w:tr>
         <w:trPr>
@@ -307,7 +307,7 @@
         </w:trPr>
         <w:tc>
           <w:tcPr>
-            <w:tcW w:w="2970" w:type="dxa"/>
+            <w:tcW w:w="2668" w:type="dxa"/>
             <w:shd w:val="clear" w:color="auto" w:fill="F2F2F2"/>
           </w:tcPr>
           <w:p>
@@ -319,7 +319,7 @@
         </w:tc>
         <w:tc>
           <w:tcPr>
-            <w:tcW w:w="2007" w:type="dxa"/>
+            <w:tcW w:w="2358" w:type="dxa"/>
             <w:shd w:val="clear" w:color="auto" w:fill="F2F2F2"/>
           </w:tcPr>
           <w:p>
@@ -331,7 +331,7 @@
         </w:tc>
         <w:tc>
           <w:tcPr>
-            <w:tcW w:w="1572" w:type="dxa"/>
+            <w:tcW w:w="1601" w:type="dxa"/>
             <w:shd w:val="clear" w:color="auto" w:fill="F2F2F2"/>
           </w:tcPr>
           <w:p>
@@ -343,7 +343,7 @@
         </w:tc>
         <w:tc>
           <w:tcPr>
-            <w:tcW w:w="2811" w:type="dxa"/>
+            <w:tcW w:w="2732" w:type="dxa"/>
             <w:shd w:val="clear" w:color="auto" w:fill="F2F2F2"/>
           </w:tcPr>
           <w:p>
@@ -357,7 +357,7 @@
       <w:tr>
         <w:tc>
           <w:tcPr>
-            <w:tcW w:w="2970" w:type="dxa"/>
+            <w:tcW w:w="2668" w:type="dxa"/>
           </w:tcPr>
           <w:p>
             <w:pPr/>
@@ -373,7 +373,7 @@
         </w:tc>
         <w:tc>
           <w:tcPr>
-            <w:tcW w:w="2007" w:type="dxa"/>
+            <w:tcW w:w="2358" w:type="dxa"/>
           </w:tcPr>
           <w:p>
             <w:pPr/>
@@ -384,7 +384,7 @@
         </w:tc>
         <w:tc>
           <w:tcPr>
-            <w:tcW w:w="1572" w:type="dxa"/>
+            <w:tcW w:w="1601" w:type="dxa"/>
           </w:tcPr>
           <w:p>
             <w:pPr/>
@@ -395,7 +395,7 @@
         </w:tc>
         <w:tc>
           <w:tcPr>
-            <w:tcW w:w="2811" w:type="dxa"/>
+            <w:tcW w:w="2732" w:type="dxa"/>
           </w:tcPr>
           <w:p>
             <w:pPr/>
@@ -408,7 +408,7 @@
       <w:tr>
         <w:tc>
           <w:tcPr>
-            <w:tcW w:w="2970" w:type="dxa"/>
+            <w:tcW w:w="2668" w:type="dxa"/>
           </w:tcPr>
           <w:p>
             <w:pPr/>
@@ -424,7 +424,7 @@
         </w:tc>
         <w:tc>
           <w:tcPr>
-            <w:tcW w:w="2007" w:type="dxa"/>
+            <w:tcW w:w="2358" w:type="dxa"/>
           </w:tcPr>
           <w:p>
             <w:pPr/>
@@ -435,7 +435,7 @@
         </w:tc>
         <w:tc>
           <w:tcPr>
-            <w:tcW w:w="1572" w:type="dxa"/>
+            <w:tcW w:w="1601" w:type="dxa"/>
           </w:tcPr>
           <w:p>
             <w:pPr/>
@@ -446,7 +446,7 @@
         </w:tc>
         <w:tc>
           <w:tcPr>
-            <w:tcW w:w="2811" w:type="dxa"/>
+            <w:tcW w:w="2732" w:type="dxa"/>
           </w:tcPr>
           <w:p>
             <w:pPr/>
@@ -459,7 +459,7 @@
       <w:tr>
         <w:tc>
           <w:tcPr>
-            <w:tcW w:w="2970" w:type="dxa"/>
+            <w:tcW w:w="2668" w:type="dxa"/>
           </w:tcPr>
           <w:p>
             <w:pPr/>
@@ -475,7 +475,7 @@
         </w:tc>
         <w:tc>
           <w:tcPr>
-            <w:tcW w:w="2007" w:type="dxa"/>
+            <w:tcW w:w="2358" w:type="dxa"/>
           </w:tcPr>
           <w:p>
             <w:pPr/>
@@ -486,7 +486,7 @@
         </w:tc>
         <w:tc>
           <w:tcPr>
-            <w:tcW w:w="1572" w:type="dxa"/>
+            <w:tcW w:w="1601" w:type="dxa"/>
           </w:tcPr>
           <w:p>
             <w:pPr/>
@@ -497,7 +497,7 @@
         </w:tc>
         <w:tc>
           <w:tcPr>
-            <w:tcW w:w="2811" w:type="dxa"/>
+            <w:tcW w:w="2732" w:type="dxa"/>
           </w:tcPr>
           <w:p>
             <w:pPr/>
@@ -510,7 +510,7 @@
       <w:tr>
         <w:tc>
           <w:tcPr>
-            <w:tcW w:w="2970" w:type="dxa"/>
+            <w:tcW w:w="2668" w:type="dxa"/>
           </w:tcPr>
           <w:p>
             <w:pPr/>
@@ -526,7 +526,7 @@
         </w:tc>
         <w:tc>
           <w:tcPr>
-            <w:tcW w:w="2007" w:type="dxa"/>
+            <w:tcW w:w="2358" w:type="dxa"/>
           </w:tcPr>
           <w:p>
             <w:pPr/>
@@ -537,7 +537,7 @@
         </w:tc>
         <w:tc>
           <w:tcPr>
-            <w:tcW w:w="1572" w:type="dxa"/>
+            <w:tcW w:w="1601" w:type="dxa"/>
           </w:tcPr>
           <w:p>
             <w:pPr/>
@@ -548,7 +548,7 @@
         </w:tc>
         <w:tc>
           <w:tcPr>
-            <w:tcW w:w="2811" w:type="dxa"/>
+            <w:tcW w:w="2732" w:type="dxa"/>
           </w:tcPr>
           <w:p>
             <w:pPr/>
@@ -561,7 +561,7 @@
       <w:tr>
         <w:tc>
           <w:tcPr>
-            <w:tcW w:w="2970" w:type="dxa"/>
+            <w:tcW w:w="2668" w:type="dxa"/>
           </w:tcPr>
           <w:p>
             <w:pPr/>
@@ -573,54 +573,68 @@
                 <w:t xml:space="preserve">MAS Kraj živých vod: Dr. ŽIVODA</w:t>
               </w:r>
             </w:hyperlink>
-          </w:p>
-        </w:tc>
-        <w:tc>
-          <w:tcPr>
-            <w:tcW w:w="2007" w:type="dxa"/>
-          </w:tcPr>
-          <w:p>
-            <w:pPr/>
-            <w:r>
-              <w:t xml:space="preserve">kulturní a sportovní akce s místními spolky</w:t>
-            </w:r>
-          </w:p>
-        </w:tc>
-        <w:tc>
-          <w:tcPr>
-            <w:tcW w:w="1572" w:type="dxa"/>
-          </w:tcPr>
-          <w:p>
-            <w:pPr/>
-            <w:r>
-              <w:t xml:space="preserve">cca březen</w:t>
-            </w:r>
-          </w:p>
-        </w:tc>
-        <w:tc>
-          <w:tcPr>
-            <w:tcW w:w="2811" w:type="dxa"/>
-          </w:tcPr>
-          <w:p>
-            <w:pPr/>
-            <w:r>
-              <w:t xml:space="preserve">e-mailem na krajzivychvod@seznam.cz</w:t>
-            </w:r>
-          </w:p>
-        </w:tc>
-      </w:tr>
-      <w:tr>
-        <w:tc>
-          <w:tcPr>
-            <w:tcW w:w="2970" w:type="dxa"/>
-          </w:tcPr>
-          <w:p>
-            <w:pPr/>
+            <w:r>
+              <w:t xml:space="preserve"> (</w:t>
+            </w:r>
             <w:hyperlink r:id="rId8" w:history="1">
               <w:r>
                 <w:rPr>
                   <w:rStyle w:val="Hyperlink"/>
                 </w:rPr>
+                <w:t xml:space="preserve">pravidla 2026</w:t>
+              </w:r>
+            </w:hyperlink>
+            <w:r>
+              <w:t xml:space="preserve">)</w:t>
+            </w:r>
+          </w:p>
+        </w:tc>
+        <w:tc>
+          <w:tcPr>
+            <w:tcW w:w="2358" w:type="dxa"/>
+          </w:tcPr>
+          <w:p>
+            <w:pPr/>
+            <w:r>
+              <w:t xml:space="preserve">až 50 000 Kč na žádost; veřejné a komunitní akce, neinvestiční vybavení spolku, honorář odborníka; jedna žádost v každé oblasti</w:t>
+            </w:r>
+          </w:p>
+        </w:tc>
+        <w:tc>
+          <w:tcPr>
+            <w:tcW w:w="1601" w:type="dxa"/>
+          </w:tcPr>
+          <w:p>
+            <w:pPr/>
+            <w:r>
+              <w:t xml:space="preserve">2026: 1. 3.–30. 4., veřejné slyšení 5.–6. 5.</w:t>
+            </w:r>
+          </w:p>
+        </w:tc>
+        <w:tc>
+          <w:tcPr>
+            <w:tcW w:w="2732" w:type="dxa"/>
+          </w:tcPr>
+          <w:p>
+            <w:pPr/>
+            <w:r>
+              <w:t xml:space="preserve">e-mailem na krajzivychvod@seznam.cz; účast na veřejném slyšení je podmínkou</w:t>
+            </w:r>
+          </w:p>
+        </w:tc>
+      </w:tr>
+      <w:tr>
+        <w:tc>
+          <w:tcPr>
+            <w:tcW w:w="2668" w:type="dxa"/>
+          </w:tcPr>
+          <w:p>
+            <w:pPr/>
+            <w:hyperlink r:id="rId9" w:history="1">
+              <w:r>
+                <w:rPr>
+                  <w:rStyle w:val="Hyperlink"/>
+                </w:rPr>
                 <w:t xml:space="preserve">Nadace ČEZ: Zaměstnanecké granty</w:t>
               </w:r>
             </w:hyperlink>
@@ -628,7 +642,7 @@
         </w:tc>
         <w:tc>
           <w:tcPr>
-            <w:tcW w:w="2007" w:type="dxa"/>
+            <w:tcW w:w="2358" w:type="dxa"/>
           </w:tcPr>
           <w:p>
             <w:pPr/>
@@ -639,7 +653,7 @@
         </w:tc>
         <w:tc>
           <w:tcPr>
-            <w:tcW w:w="1572" w:type="dxa"/>
+            <w:tcW w:w="1601" w:type="dxa"/>
           </w:tcPr>
           <w:p>
             <w:pPr/>
@@ -650,7 +664,7 @@
         </w:tc>
         <w:tc>
           <w:tcPr>
-            <w:tcW w:w="2811" w:type="dxa"/>
+            <w:tcW w:w="2732" w:type="dxa"/>
           </w:tcPr>
           <w:p>
             <w:pPr/>
@@ -663,11 +677,11 @@
       <w:tr>
         <w:tc>
           <w:tcPr>
-            <w:tcW w:w="2970" w:type="dxa"/>
-          </w:tcPr>
-          <w:p>
-            <w:pPr/>
-            <w:hyperlink r:id="rId9" w:history="1">
+            <w:tcW w:w="2668" w:type="dxa"/>
+          </w:tcPr>
+          <w:p>
+            <w:pPr/>
+            <w:hyperlink r:id="rId10" w:history="1">
               <w:r>
                 <w:rPr>
                   <w:rStyle w:val="Hyperlink"/>
@@ -679,7 +693,7 @@
         </w:tc>
         <w:tc>
           <w:tcPr>
-            <w:tcW w:w="2007" w:type="dxa"/>
+            <w:tcW w:w="2358" w:type="dxa"/>
           </w:tcPr>
           <w:p>
             <w:pPr/>
@@ -690,7 +704,7 @@
         </w:tc>
         <w:tc>
           <w:tcPr>
-            <w:tcW w:w="1572" w:type="dxa"/>
+            <w:tcW w:w="1601" w:type="dxa"/>
           </w:tcPr>
           <w:p>
             <w:pPr/>
@@ -701,7 +715,7 @@
         </w:tc>
         <w:tc>
           <w:tcPr>
-            <w:tcW w:w="2811" w:type="dxa"/>
+            <w:tcW w:w="2732" w:type="dxa"/>
           </w:tcPr>
           <w:p>
             <w:pPr/>
@@ -714,11 +728,11 @@
       <w:tr>
         <w:tc>
           <w:tcPr>
-            <w:tcW w:w="2970" w:type="dxa"/>
-          </w:tcPr>
-          <w:p>
-            <w:pPr/>
-            <w:hyperlink r:id="rId10" w:history="1">
+            <w:tcW w:w="2668" w:type="dxa"/>
+          </w:tcPr>
+          <w:p>
+            <w:pPr/>
+            <w:hyperlink r:id="rId11" w:history="1">
               <w:r>
                 <w:rPr>
                   <w:rStyle w:val="Hyperlink"/>
@@ -730,7 +744,7 @@
         </w:tc>
         <w:tc>
           <w:tcPr>
-            <w:tcW w:w="2007" w:type="dxa"/>
+            <w:tcW w:w="2358" w:type="dxa"/>
           </w:tcPr>
           <w:p>
             <w:pPr/>
@@ -741,7 +755,7 @@
         </w:tc>
         <w:tc>
           <w:tcPr>
-            <w:tcW w:w="1572" w:type="dxa"/>
+            <w:tcW w:w="1601" w:type="dxa"/>
           </w:tcPr>
           <w:p>
             <w:pPr/>
@@ -752,7 +766,7 @@
         </w:tc>
         <w:tc>
           <w:tcPr>
-            <w:tcW w:w="2811" w:type="dxa"/>
+            <w:tcW w:w="2732" w:type="dxa"/>
           </w:tcPr>
           <w:p>
             <w:pPr/>
@@ -797,9 +811,9 @@
         <w:tblLook w:val="04A0" w:firstRow="1" w:lastRow="0" w:firstColumn="0" w:lastColumn="0" w:noHBand="0" w:noVBand="1"/>
       </w:tblPr>
       <w:tblGrid>
-        <w:gridCol w:w="2477"/>
-        <w:gridCol w:w="4525"/>
-        <w:gridCol w:w="2358"/>
+        <w:gridCol w:w="2245"/>
+        <w:gridCol w:w="4879"/>
+        <w:gridCol w:w="2236"/>
       </w:tblGrid>
       <w:tr>
         <w:trPr>
@@ -807,7 +821,7 @@
         </w:trPr>
         <w:tc>
           <w:tcPr>
-            <w:tcW w:w="2477" w:type="dxa"/>
+            <w:tcW w:w="2245" w:type="dxa"/>
             <w:shd w:val="clear" w:color="auto" w:fill="F2F2F2"/>
           </w:tcPr>
           <w:p>
@@ -819,7 +833,7 @@
         </w:tc>
         <w:tc>
           <w:tcPr>
-            <w:tcW w:w="4525" w:type="dxa"/>
+            <w:tcW w:w="4879" w:type="dxa"/>
             <w:shd w:val="clear" w:color="auto" w:fill="F2F2F2"/>
           </w:tcPr>
           <w:p>
@@ -831,7 +845,7 @@
         </w:tc>
         <w:tc>
           <w:tcPr>
-            <w:tcW w:w="2358" w:type="dxa"/>
+            <w:tcW w:w="2236" w:type="dxa"/>
             <w:shd w:val="clear" w:color="auto" w:fill="F2F2F2"/>
           </w:tcPr>
           <w:p>
@@ -845,11 +859,11 @@
       <w:tr>
         <w:tc>
           <w:tcPr>
-            <w:tcW w:w="2477" w:type="dxa"/>
-          </w:tcPr>
-          <w:p>
-            <w:pPr/>
-            <w:hyperlink r:id="rId11" w:history="1">
+            <w:tcW w:w="2245" w:type="dxa"/>
+          </w:tcPr>
+          <w:p>
+            <w:pPr/>
+            <w:hyperlink r:id="rId12" w:history="1">
               <w:r>
                 <w:rPr>
                   <w:rStyle w:val="Hyperlink"/>
@@ -861,7 +875,7 @@
         </w:tc>
         <w:tc>
           <w:tcPr>
-            <w:tcW w:w="4525" w:type="dxa"/>
+            <w:tcW w:w="4879" w:type="dxa"/>
           </w:tcPr>
           <w:p>
             <w:pPr/>
@@ -872,7 +886,7 @@
         </w:tc>
         <w:tc>
           <w:tcPr>
-            <w:tcW w:w="2358" w:type="dxa"/>
+            <w:tcW w:w="2236" w:type="dxa"/>
           </w:tcPr>
           <w:p>
             <w:pPr/>
@@ -885,11 +899,11 @@
       <w:tr>
         <w:tc>
           <w:tcPr>
-            <w:tcW w:w="2477" w:type="dxa"/>
-          </w:tcPr>
-          <w:p>
-            <w:pPr/>
-            <w:hyperlink r:id="rId12" w:history="1">
+            <w:tcW w:w="2245" w:type="dxa"/>
+          </w:tcPr>
+          <w:p>
+            <w:pPr/>
+            <w:hyperlink r:id="rId13" w:history="1">
               <w:r>
                 <w:rPr>
                   <w:rStyle w:val="Hyperlink"/>
@@ -901,7 +915,7 @@
         </w:tc>
         <w:tc>
           <w:tcPr>
-            <w:tcW w:w="4525" w:type="dxa"/>
+            <w:tcW w:w="4879" w:type="dxa"/>
           </w:tcPr>
           <w:p>
             <w:pPr/>
@@ -912,7 +926,7 @@
         </w:tc>
         <w:tc>
           <w:tcPr>
-            <w:tcW w:w="2358" w:type="dxa"/>
+            <w:tcW w:w="2236" w:type="dxa"/>
           </w:tcPr>
           <w:p>
             <w:pPr/>
@@ -925,11 +939,11 @@
       <w:tr>
         <w:tc>
           <w:tcPr>
-            <w:tcW w:w="2477" w:type="dxa"/>
-          </w:tcPr>
-          <w:p>
-            <w:pPr/>
-            <w:hyperlink r:id="rId13" w:history="1">
+            <w:tcW w:w="2245" w:type="dxa"/>
+          </w:tcPr>
+          <w:p>
+            <w:pPr/>
+            <w:hyperlink r:id="rId14" w:history="1">
               <w:r>
                 <w:rPr>
                   <w:rStyle w:val="Hyperlink"/>
@@ -940,7 +954,7 @@
             <w:r>
               <w:t xml:space="preserve"> (</w:t>
             </w:r>
-            <w:hyperlink r:id="rId14" w:history="1">
+            <w:hyperlink r:id="rId15" w:history="1">
               <w:r>
                 <w:rPr>
                   <w:rStyle w:val="Hyperlink"/>
@@ -955,7 +969,7 @@
         </w:tc>
         <w:tc>
           <w:tcPr>
-            <w:tcW w:w="4525" w:type="dxa"/>
+            <w:tcW w:w="4879" w:type="dxa"/>
           </w:tcPr>
           <w:p>
             <w:pPr/>
@@ -966,7 +980,7 @@
         </w:tc>
         <w:tc>
           <w:tcPr>
-            <w:tcW w:w="2358" w:type="dxa"/>
+            <w:tcW w:w="2236" w:type="dxa"/>
           </w:tcPr>
           <w:p>
             <w:pPr/>
@@ -979,11 +993,11 @@
       <w:tr>
         <w:tc>
           <w:tcPr>
-            <w:tcW w:w="2477" w:type="dxa"/>
-          </w:tcPr>
-          <w:p>
-            <w:pPr/>
-            <w:hyperlink r:id="rId15" w:history="1">
+            <w:tcW w:w="2245" w:type="dxa"/>
+          </w:tcPr>
+          <w:p>
+            <w:pPr/>
+            <w:hyperlink r:id="rId16" w:history="1">
               <w:r>
                 <w:rPr>
                   <w:rStyle w:val="Hyperlink"/>
@@ -995,7 +1009,7 @@
         </w:tc>
         <w:tc>
           <w:tcPr>
-            <w:tcW w:w="4525" w:type="dxa"/>
+            <w:tcW w:w="4879" w:type="dxa"/>
           </w:tcPr>
           <w:p>
             <w:pPr/>
@@ -1006,7 +1020,7 @@
         </w:tc>
         <w:tc>
           <w:tcPr>
-            <w:tcW w:w="2358" w:type="dxa"/>
+            <w:tcW w:w="2236" w:type="dxa"/>
           </w:tcPr>
           <w:p>
             <w:pPr/>
@@ -1019,11 +1033,11 @@
       <w:tr>
         <w:tc>
           <w:tcPr>
-            <w:tcW w:w="2477" w:type="dxa"/>
-          </w:tcPr>
-          <w:p>
-            <w:pPr/>
-            <w:hyperlink r:id="rId16" w:history="1">
+            <w:tcW w:w="2245" w:type="dxa"/>
+          </w:tcPr>
+          <w:p>
+            <w:pPr/>
+            <w:hyperlink r:id="rId17" w:history="1">
               <w:r>
                 <w:rPr>
                   <w:rStyle w:val="Hyperlink"/>
@@ -1034,7 +1048,7 @@
             <w:r>
               <w:t xml:space="preserve"> (</w:t>
             </w:r>
-            <w:hyperlink r:id="rId17" w:history="1">
+            <w:hyperlink r:id="rId18" w:history="1">
               <w:r>
                 <w:rPr>
                   <w:rStyle w:val="Hyperlink"/>
@@ -1049,7 +1063,7 @@
         </w:tc>
         <w:tc>
           <w:tcPr>
-            <w:tcW w:w="4525" w:type="dxa"/>
+            <w:tcW w:w="4879" w:type="dxa"/>
           </w:tcPr>
           <w:p>
             <w:pPr/>
@@ -1060,7 +1074,7 @@
         </w:tc>
         <w:tc>
           <w:tcPr>
-            <w:tcW w:w="2358" w:type="dxa"/>
+            <w:tcW w:w="2236" w:type="dxa"/>
           </w:tcPr>
           <w:p>
             <w:pPr/>
@@ -1073,11 +1087,11 @@
       <w:tr>
         <w:tc>
           <w:tcPr>
-            <w:tcW w:w="2477" w:type="dxa"/>
-          </w:tcPr>
-          <w:p>
-            <w:pPr/>
-            <w:hyperlink r:id="rId18" w:history="1">
+            <w:tcW w:w="2245" w:type="dxa"/>
+          </w:tcPr>
+          <w:p>
+            <w:pPr/>
+            <w:hyperlink r:id="rId19" w:history="1">
               <w:r>
                 <w:rPr>
                   <w:rStyle w:val="Hyperlink"/>
@@ -1089,7 +1103,7 @@
         </w:tc>
         <w:tc>
           <w:tcPr>
-            <w:tcW w:w="4525" w:type="dxa"/>
+            <w:tcW w:w="4879" w:type="dxa"/>
           </w:tcPr>
           <w:p>
             <w:pPr/>
@@ -1100,7 +1114,7 @@
         </w:tc>
         <w:tc>
           <w:tcPr>
-            <w:tcW w:w="2358" w:type="dxa"/>
+            <w:tcW w:w="2236" w:type="dxa"/>
           </w:tcPr>
           <w:p>
             <w:pPr/>
@@ -1110,13 +1124,93 @@
           </w:p>
         </w:tc>
       </w:tr>
+      <w:tr>
+        <w:tc>
+          <w:tcPr>
+            <w:tcW w:w="2245" w:type="dxa"/>
+          </w:tcPr>
+          <w:p>
+            <w:pPr/>
+            <w:hyperlink r:id="rId20" w:history="1">
+              <w:r>
+                <w:rPr>
+                  <w:rStyle w:val="Hyperlink"/>
+                </w:rPr>
+                <w:t xml:space="preserve">MAS Kraj živých vod: SZP Leader, Fiche 5 Obnova venkova</w:t>
+              </w:r>
+            </w:hyperlink>
+          </w:p>
+        </w:tc>
+        <w:tc>
+          <w:tcPr>
+            <w:tcW w:w="4879" w:type="dxa"/>
+          </w:tcPr>
+          <w:p>
+            <w:pPr/>
+            <w:r>
+              <w:t xml:space="preserve">dotace 80 % z 100 000–2 000 000 Kč na kulturní a spolková zařízení a drobné památky; neziskovka +30 bodů; spolek musí předfinancovat; podání přes Portál farmáře SZIF; výpůjčku zámku ověřit u MAS</w:t>
+            </w:r>
+          </w:p>
+        </w:tc>
+        <w:tc>
+          <w:tcPr>
+            <w:tcW w:w="2236" w:type="dxa"/>
+          </w:tcPr>
+          <w:p>
+            <w:pPr/>
+            <w:r>
+              <w:t xml:space="preserve">2026: 2.–20. 3.; 2027 zatím nevyhlášeno (odhad březen)</w:t>
+            </w:r>
+          </w:p>
+        </w:tc>
+      </w:tr>
+      <w:tr>
+        <w:tc>
+          <w:tcPr>
+            <w:tcW w:w="2245" w:type="dxa"/>
+          </w:tcPr>
+          <w:p>
+            <w:pPr/>
+            <w:hyperlink r:id="rId21" w:history="1">
+              <w:r>
+                <w:rPr>
+                  <w:rStyle w:val="Hyperlink"/>
+                </w:rPr>
+                <w:t xml:space="preserve">MAS Kraj živých vod: IROP Kultura</w:t>
+              </w:r>
+            </w:hyperlink>
+          </w:p>
+        </w:tc>
+        <w:tc>
+          <w:tcPr>
+            <w:tcW w:w="4879" w:type="dxa"/>
+          </w:tcPr>
+          <w:p>
+            <w:pPr/>
+            <w:r>
+              <w:t xml:space="preserve">obnova památkově chráněných objektů pro kulturu; nejvíc bodů má neziskovka-vlastník, proto spíš pro město se spolkem jako partnerem</w:t>
+            </w:r>
+          </w:p>
+        </w:tc>
+        <w:tc>
+          <w:tcPr>
+            <w:tcW w:w="2236" w:type="dxa"/>
+          </w:tcPr>
+          <w:p>
+            <w:pPr/>
+            <w:r>
+              <w:t xml:space="preserve">2026: 1. 4.–1. 6. a 1. 8.–31. 8.; další kolo nevyhlášeno</w:t>
+            </w:r>
+          </w:p>
+        </w:tc>
+      </w:tr>
     </w:tbl>
     <w:p>
       <w:pPr/>
       <w:r>
         <w:t xml:space="preserve">Kde hledat další: </w:t>
       </w:r>
-      <w:hyperlink r:id="rId19" w:history="1">
+      <w:hyperlink r:id="rId22" w:history="1">
         <w:r>
           <w:rPr>
             <w:rStyle w:val="Hyperlink"/>
@@ -1127,7 +1221,7 @@
       <w:r>
         <w:t xml:space="preserve"> (Úřad vlády, státní programy pro neziskovky), </w:t>
       </w:r>
-      <w:hyperlink r:id="rId13" w:history="1">
+      <w:hyperlink r:id="rId14" w:history="1">
         <w:r>
           <w:rPr>
             <w:rStyle w:val="Hyperlink"/>
@@ -1138,7 +1232,7 @@
       <w:r>
         <w:t xml:space="preserve">, </w:t>
       </w:r>
-      <w:hyperlink r:id="rId20" w:history="1">
+      <w:hyperlink r:id="rId23" w:history="1">
         <w:r>
           <w:rPr>
             <w:rStyle w:val="Hyperlink"/>
@@ -1149,7 +1243,7 @@
       <w:r>
         <w:t xml:space="preserve"> a </w:t>
       </w:r>
-      <w:hyperlink r:id="rId21" w:history="1">
+      <w:hyperlink r:id="rId24" w:history="1">
         <w:r>
           <w:rPr>
             <w:rStyle w:val="Hyperlink"/>

</xml_diff>

<commit_message>
Dotační manuál: Destinační společnost Postřelí
Co-Authored-By: Claude Opus 5.5 (1M context) <noreply@anthropic.com>
Claude-Session: https://claude.ai/code/session_014Cms99YiFfg5qXi7rp4DXx
</commit_message>
<xml_diff>
--- a/docs/dotacni-manual.docx
+++ b/docs/dotacni-manual.docx
@@ -296,10 +296,10 @@
         <w:tblLook w:val="04A0" w:firstRow="1" w:lastRow="0" w:firstColumn="0" w:lastColumn="0" w:noHBand="0" w:noVBand="1"/>
       </w:tblPr>
       <w:tblGrid>
-        <w:gridCol w:w="2668"/>
-        <w:gridCol w:w="2358"/>
-        <w:gridCol w:w="1601"/>
-        <w:gridCol w:w="2732"/>
+        <w:gridCol w:w="2559"/>
+        <w:gridCol w:w="2292"/>
+        <w:gridCol w:w="1556"/>
+        <w:gridCol w:w="2953"/>
       </w:tblGrid>
       <w:tr>
         <w:trPr>
@@ -307,7 +307,7 @@
         </w:trPr>
         <w:tc>
           <w:tcPr>
-            <w:tcW w:w="2668" w:type="dxa"/>
+            <w:tcW w:w="2559" w:type="dxa"/>
             <w:shd w:val="clear" w:color="auto" w:fill="F2F2F2"/>
           </w:tcPr>
           <w:p>
@@ -319,7 +319,7 @@
         </w:tc>
         <w:tc>
           <w:tcPr>
-            <w:tcW w:w="2358" w:type="dxa"/>
+            <w:tcW w:w="2292" w:type="dxa"/>
             <w:shd w:val="clear" w:color="auto" w:fill="F2F2F2"/>
           </w:tcPr>
           <w:p>
@@ -331,7 +331,7 @@
         </w:tc>
         <w:tc>
           <w:tcPr>
-            <w:tcW w:w="1601" w:type="dxa"/>
+            <w:tcW w:w="1556" w:type="dxa"/>
             <w:shd w:val="clear" w:color="auto" w:fill="F2F2F2"/>
           </w:tcPr>
           <w:p>
@@ -343,7 +343,7 @@
         </w:tc>
         <w:tc>
           <w:tcPr>
-            <w:tcW w:w="2732" w:type="dxa"/>
+            <w:tcW w:w="2953" w:type="dxa"/>
             <w:shd w:val="clear" w:color="auto" w:fill="F2F2F2"/>
           </w:tcPr>
           <w:p>
@@ -357,7 +357,7 @@
       <w:tr>
         <w:tc>
           <w:tcPr>
-            <w:tcW w:w="2668" w:type="dxa"/>
+            <w:tcW w:w="2559" w:type="dxa"/>
           </w:tcPr>
           <w:p>
             <w:pPr/>
@@ -373,7 +373,7 @@
         </w:tc>
         <w:tc>
           <w:tcPr>
-            <w:tcW w:w="2358" w:type="dxa"/>
+            <w:tcW w:w="2292" w:type="dxa"/>
           </w:tcPr>
           <w:p>
             <w:pPr/>
@@ -384,7 +384,7 @@
         </w:tc>
         <w:tc>
           <w:tcPr>
-            <w:tcW w:w="1601" w:type="dxa"/>
+            <w:tcW w:w="1556" w:type="dxa"/>
           </w:tcPr>
           <w:p>
             <w:pPr/>
@@ -395,7 +395,7 @@
         </w:tc>
         <w:tc>
           <w:tcPr>
-            <w:tcW w:w="2732" w:type="dxa"/>
+            <w:tcW w:w="2953" w:type="dxa"/>
           </w:tcPr>
           <w:p>
             <w:pPr/>
@@ -408,7 +408,7 @@
       <w:tr>
         <w:tc>
           <w:tcPr>
-            <w:tcW w:w="2668" w:type="dxa"/>
+            <w:tcW w:w="2559" w:type="dxa"/>
           </w:tcPr>
           <w:p>
             <w:pPr/>
@@ -424,7 +424,7 @@
         </w:tc>
         <w:tc>
           <w:tcPr>
-            <w:tcW w:w="2358" w:type="dxa"/>
+            <w:tcW w:w="2292" w:type="dxa"/>
           </w:tcPr>
           <w:p>
             <w:pPr/>
@@ -435,7 +435,7 @@
         </w:tc>
         <w:tc>
           <w:tcPr>
-            <w:tcW w:w="1601" w:type="dxa"/>
+            <w:tcW w:w="1556" w:type="dxa"/>
           </w:tcPr>
           <w:p>
             <w:pPr/>
@@ -446,7 +446,7 @@
         </w:tc>
         <w:tc>
           <w:tcPr>
-            <w:tcW w:w="2732" w:type="dxa"/>
+            <w:tcW w:w="2953" w:type="dxa"/>
           </w:tcPr>
           <w:p>
             <w:pPr/>
@@ -459,7 +459,7 @@
       <w:tr>
         <w:tc>
           <w:tcPr>
-            <w:tcW w:w="2668" w:type="dxa"/>
+            <w:tcW w:w="2559" w:type="dxa"/>
           </w:tcPr>
           <w:p>
             <w:pPr/>
@@ -475,7 +475,7 @@
         </w:tc>
         <w:tc>
           <w:tcPr>
-            <w:tcW w:w="2358" w:type="dxa"/>
+            <w:tcW w:w="2292" w:type="dxa"/>
           </w:tcPr>
           <w:p>
             <w:pPr/>
@@ -486,7 +486,7 @@
         </w:tc>
         <w:tc>
           <w:tcPr>
-            <w:tcW w:w="1601" w:type="dxa"/>
+            <w:tcW w:w="1556" w:type="dxa"/>
           </w:tcPr>
           <w:p>
             <w:pPr/>
@@ -497,7 +497,7 @@
         </w:tc>
         <w:tc>
           <w:tcPr>
-            <w:tcW w:w="2732" w:type="dxa"/>
+            <w:tcW w:w="2953" w:type="dxa"/>
           </w:tcPr>
           <w:p>
             <w:pPr/>
@@ -510,7 +510,7 @@
       <w:tr>
         <w:tc>
           <w:tcPr>
-            <w:tcW w:w="2668" w:type="dxa"/>
+            <w:tcW w:w="2559" w:type="dxa"/>
           </w:tcPr>
           <w:p>
             <w:pPr/>
@@ -526,7 +526,7 @@
         </w:tc>
         <w:tc>
           <w:tcPr>
-            <w:tcW w:w="2358" w:type="dxa"/>
+            <w:tcW w:w="2292" w:type="dxa"/>
           </w:tcPr>
           <w:p>
             <w:pPr/>
@@ -537,7 +537,7 @@
         </w:tc>
         <w:tc>
           <w:tcPr>
-            <w:tcW w:w="1601" w:type="dxa"/>
+            <w:tcW w:w="1556" w:type="dxa"/>
           </w:tcPr>
           <w:p>
             <w:pPr/>
@@ -548,7 +548,7 @@
         </w:tc>
         <w:tc>
           <w:tcPr>
-            <w:tcW w:w="2732" w:type="dxa"/>
+            <w:tcW w:w="2953" w:type="dxa"/>
           </w:tcPr>
           <w:p>
             <w:pPr/>
@@ -561,7 +561,7 @@
       <w:tr>
         <w:tc>
           <w:tcPr>
-            <w:tcW w:w="2668" w:type="dxa"/>
+            <w:tcW w:w="2559" w:type="dxa"/>
           </w:tcPr>
           <w:p>
             <w:pPr/>
@@ -591,7 +591,7 @@
         </w:tc>
         <w:tc>
           <w:tcPr>
-            <w:tcW w:w="2358" w:type="dxa"/>
+            <w:tcW w:w="2292" w:type="dxa"/>
           </w:tcPr>
           <w:p>
             <w:pPr/>
@@ -602,7 +602,7 @@
         </w:tc>
         <w:tc>
           <w:tcPr>
-            <w:tcW w:w="1601" w:type="dxa"/>
+            <w:tcW w:w="1556" w:type="dxa"/>
           </w:tcPr>
           <w:p>
             <w:pPr/>
@@ -613,7 +613,7 @@
         </w:tc>
         <w:tc>
           <w:tcPr>
-            <w:tcW w:w="2732" w:type="dxa"/>
+            <w:tcW w:w="2953" w:type="dxa"/>
           </w:tcPr>
           <w:p>
             <w:pPr/>
@@ -626,7 +626,7 @@
       <w:tr>
         <w:tc>
           <w:tcPr>
-            <w:tcW w:w="2668" w:type="dxa"/>
+            <w:tcW w:w="2559" w:type="dxa"/>
           </w:tcPr>
           <w:p>
             <w:pPr/>
@@ -635,6 +635,57 @@
                 <w:rPr>
                   <w:rStyle w:val="Hyperlink"/>
                 </w:rPr>
+                <w:t xml:space="preserve">Destinační společnost Postřelí</w:t>
+              </w:r>
+            </w:hyperlink>
+          </w:p>
+        </w:tc>
+        <w:tc>
+          <w:tcPr>
+            <w:tcW w:w="2292" w:type="dxa"/>
+          </w:tcPr>
+          <w:p>
+            <w:pPr/>
+            <w:r>
+              <w:t xml:space="preserve">spolek je člen; nepřímá podpora</w:t>
+            </w:r>
+          </w:p>
+        </w:tc>
+        <w:tc>
+          <w:tcPr>
+            <w:tcW w:w="1556" w:type="dxa"/>
+          </w:tcPr>
+          <w:p>
+            <w:pPr/>
+            <w:r>
+              <w:t xml:space="preserve">průběžně, bez výzvy</w:t>
+            </w:r>
+          </w:p>
+        </w:tc>
+        <w:tc>
+          <w:tcPr>
+            <w:tcW w:w="2953" w:type="dxa"/>
+          </w:tcPr>
+          <w:p>
+            <w:pPr/>
+            <w:r>
+              <w:t xml:space="preserve">individuálně s ředitelem Ondřejem Fáberou, +420 728 215 628, dspostreli@gmail.com</w:t>
+            </w:r>
+          </w:p>
+        </w:tc>
+      </w:tr>
+      <w:tr>
+        <w:tc>
+          <w:tcPr>
+            <w:tcW w:w="2559" w:type="dxa"/>
+          </w:tcPr>
+          <w:p>
+            <w:pPr/>
+            <w:hyperlink r:id="rId10" w:history="1">
+              <w:r>
+                <w:rPr>
+                  <w:rStyle w:val="Hyperlink"/>
+                </w:rPr>
                 <w:t xml:space="preserve">Nadace ČEZ: Zaměstnanecké granty</w:t>
               </w:r>
             </w:hyperlink>
@@ -642,7 +693,7 @@
         </w:tc>
         <w:tc>
           <w:tcPr>
-            <w:tcW w:w="2358" w:type="dxa"/>
+            <w:tcW w:w="2292" w:type="dxa"/>
           </w:tcPr>
           <w:p>
             <w:pPr/>
@@ -653,7 +704,7 @@
         </w:tc>
         <w:tc>
           <w:tcPr>
-            <w:tcW w:w="1601" w:type="dxa"/>
+            <w:tcW w:w="1556" w:type="dxa"/>
           </w:tcPr>
           <w:p>
             <w:pPr/>
@@ -664,7 +715,7 @@
         </w:tc>
         <w:tc>
           <w:tcPr>
-            <w:tcW w:w="2732" w:type="dxa"/>
+            <w:tcW w:w="2953" w:type="dxa"/>
           </w:tcPr>
           <w:p>
             <w:pPr/>
@@ -677,11 +728,11 @@
       <w:tr>
         <w:tc>
           <w:tcPr>
-            <w:tcW w:w="2668" w:type="dxa"/>
-          </w:tcPr>
-          <w:p>
-            <w:pPr/>
-            <w:hyperlink r:id="rId10" w:history="1">
+            <w:tcW w:w="2559" w:type="dxa"/>
+          </w:tcPr>
+          <w:p>
+            <w:pPr/>
+            <w:hyperlink r:id="rId11" w:history="1">
               <w:r>
                 <w:rPr>
                   <w:rStyle w:val="Hyperlink"/>
@@ -693,7 +744,7 @@
         </w:tc>
         <w:tc>
           <w:tcPr>
-            <w:tcW w:w="2358" w:type="dxa"/>
+            <w:tcW w:w="2292" w:type="dxa"/>
           </w:tcPr>
           <w:p>
             <w:pPr/>
@@ -704,7 +755,7 @@
         </w:tc>
         <w:tc>
           <w:tcPr>
-            <w:tcW w:w="1601" w:type="dxa"/>
+            <w:tcW w:w="1556" w:type="dxa"/>
           </w:tcPr>
           <w:p>
             <w:pPr/>
@@ -715,7 +766,7 @@
         </w:tc>
         <w:tc>
           <w:tcPr>
-            <w:tcW w:w="2732" w:type="dxa"/>
+            <w:tcW w:w="2953" w:type="dxa"/>
           </w:tcPr>
           <w:p>
             <w:pPr/>
@@ -728,11 +779,11 @@
       <w:tr>
         <w:tc>
           <w:tcPr>
-            <w:tcW w:w="2668" w:type="dxa"/>
-          </w:tcPr>
-          <w:p>
-            <w:pPr/>
-            <w:hyperlink r:id="rId11" w:history="1">
+            <w:tcW w:w="2559" w:type="dxa"/>
+          </w:tcPr>
+          <w:p>
+            <w:pPr/>
+            <w:hyperlink r:id="rId12" w:history="1">
               <w:r>
                 <w:rPr>
                   <w:rStyle w:val="Hyperlink"/>
@@ -744,7 +795,7 @@
         </w:tc>
         <w:tc>
           <w:tcPr>
-            <w:tcW w:w="2358" w:type="dxa"/>
+            <w:tcW w:w="2292" w:type="dxa"/>
           </w:tcPr>
           <w:p>
             <w:pPr/>
@@ -755,7 +806,7 @@
         </w:tc>
         <w:tc>
           <w:tcPr>
-            <w:tcW w:w="1601" w:type="dxa"/>
+            <w:tcW w:w="1556" w:type="dxa"/>
           </w:tcPr>
           <w:p>
             <w:pPr/>
@@ -766,7 +817,7 @@
         </w:tc>
         <w:tc>
           <w:tcPr>
-            <w:tcW w:w="2732" w:type="dxa"/>
+            <w:tcW w:w="2953" w:type="dxa"/>
           </w:tcPr>
           <w:p>
             <w:pPr/>
@@ -863,7 +914,7 @@
           </w:tcPr>
           <w:p>
             <w:pPr/>
-            <w:hyperlink r:id="rId12" w:history="1">
+            <w:hyperlink r:id="rId13" w:history="1">
               <w:r>
                 <w:rPr>
                   <w:rStyle w:val="Hyperlink"/>
@@ -903,7 +954,7 @@
           </w:tcPr>
           <w:p>
             <w:pPr/>
-            <w:hyperlink r:id="rId13" w:history="1">
+            <w:hyperlink r:id="rId14" w:history="1">
               <w:r>
                 <w:rPr>
                   <w:rStyle w:val="Hyperlink"/>
@@ -943,7 +994,7 @@
           </w:tcPr>
           <w:p>
             <w:pPr/>
-            <w:hyperlink r:id="rId14" w:history="1">
+            <w:hyperlink r:id="rId15" w:history="1">
               <w:r>
                 <w:rPr>
                   <w:rStyle w:val="Hyperlink"/>
@@ -954,7 +1005,7 @@
             <w:r>
               <w:t xml:space="preserve"> (</w:t>
             </w:r>
-            <w:hyperlink r:id="rId15" w:history="1">
+            <w:hyperlink r:id="rId16" w:history="1">
               <w:r>
                 <w:rPr>
                   <w:rStyle w:val="Hyperlink"/>
@@ -997,7 +1048,7 @@
           </w:tcPr>
           <w:p>
             <w:pPr/>
-            <w:hyperlink r:id="rId16" w:history="1">
+            <w:hyperlink r:id="rId17" w:history="1">
               <w:r>
                 <w:rPr>
                   <w:rStyle w:val="Hyperlink"/>
@@ -1037,7 +1088,7 @@
           </w:tcPr>
           <w:p>
             <w:pPr/>
-            <w:hyperlink r:id="rId17" w:history="1">
+            <w:hyperlink r:id="rId18" w:history="1">
               <w:r>
                 <w:rPr>
                   <w:rStyle w:val="Hyperlink"/>
@@ -1048,7 +1099,7 @@
             <w:r>
               <w:t xml:space="preserve"> (</w:t>
             </w:r>
-            <w:hyperlink r:id="rId18" w:history="1">
+            <w:hyperlink r:id="rId19" w:history="1">
               <w:r>
                 <w:rPr>
                   <w:rStyle w:val="Hyperlink"/>
@@ -1091,7 +1142,7 @@
           </w:tcPr>
           <w:p>
             <w:pPr/>
-            <w:hyperlink r:id="rId19" w:history="1">
+            <w:hyperlink r:id="rId20" w:history="1">
               <w:r>
                 <w:rPr>
                   <w:rStyle w:val="Hyperlink"/>
@@ -1131,7 +1182,7 @@
           </w:tcPr>
           <w:p>
             <w:pPr/>
-            <w:hyperlink r:id="rId20" w:history="1">
+            <w:hyperlink r:id="rId21" w:history="1">
               <w:r>
                 <w:rPr>
                   <w:rStyle w:val="Hyperlink"/>
@@ -1171,7 +1222,7 @@
           </w:tcPr>
           <w:p>
             <w:pPr/>
-            <w:hyperlink r:id="rId21" w:history="1">
+            <w:hyperlink r:id="rId22" w:history="1">
               <w:r>
                 <w:rPr>
                   <w:rStyle w:val="Hyperlink"/>
@@ -1210,7 +1261,7 @@
       <w:r>
         <w:t xml:space="preserve">Kde hledat další: </w:t>
       </w:r>
-      <w:hyperlink r:id="rId22" w:history="1">
+      <w:hyperlink r:id="rId23" w:history="1">
         <w:r>
           <w:rPr>
             <w:rStyle w:val="Hyperlink"/>
@@ -1221,7 +1272,7 @@
       <w:r>
         <w:t xml:space="preserve"> (Úřad vlády, státní programy pro neziskovky), </w:t>
       </w:r>
-      <w:hyperlink r:id="rId14" w:history="1">
+      <w:hyperlink r:id="rId15" w:history="1">
         <w:r>
           <w:rPr>
             <w:rStyle w:val="Hyperlink"/>
@@ -1232,7 +1283,7 @@
       <w:r>
         <w:t xml:space="preserve">, </w:t>
       </w:r>
-      <w:hyperlink r:id="rId23" w:history="1">
+      <w:hyperlink r:id="rId24" w:history="1">
         <w:r>
           <w:rPr>
             <w:rStyle w:val="Hyperlink"/>
@@ -1243,7 +1294,7 @@
       <w:r>
         <w:t xml:space="preserve"> a </w:t>
       </w:r>
-      <w:hyperlink r:id="rId24" w:history="1">
+      <w:hyperlink r:id="rId25" w:history="1">
         <w:r>
           <w:rPr>
             <w:rStyle w:val="Hyperlink"/>

</xml_diff>

<commit_message>
Dotační kalendář a manuál: Destinační společnost Postřelí (#23)
* Dotační kalendář: Destinační společnost Postřelí mezi pravidelné zdroje

Co-Authored-By: Claude Opus 5.5 (1M context) <noreply@anthropic.com>
Claude-Session: https://claude.ai/code/session_014Cms99YiFfg5qXi7rp4DXx

* Dotační kalendář: upřesnění karty Postřelí

Co-Authored-By: Claude Opus 5.5 (1M context) <noreply@anthropic.com>
Claude-Session: https://claude.ai/code/session_014Cms99YiFfg5qXi7rp4DXx

* Dotační manuál: Destinační společnost Postřelí

Co-Authored-By: Claude Opus 5.5 (1M context) <noreply@anthropic.com>
Claude-Session: https://claude.ai/code/session_014Cms99YiFfg5qXi7rp4DXx

---------

Co-authored-by: Claude <noreply@anthropic.com>
</commit_message>
<xml_diff>
--- a/docs/dotacni-manual.docx
+++ b/docs/dotacni-manual.docx
@@ -296,10 +296,10 @@
         <w:tblLook w:val="04A0" w:firstRow="1" w:lastRow="0" w:firstColumn="0" w:lastColumn="0" w:noHBand="0" w:noVBand="1"/>
       </w:tblPr>
       <w:tblGrid>
-        <w:gridCol w:w="2668"/>
-        <w:gridCol w:w="2358"/>
-        <w:gridCol w:w="1601"/>
-        <w:gridCol w:w="2732"/>
+        <w:gridCol w:w="2559"/>
+        <w:gridCol w:w="2292"/>
+        <w:gridCol w:w="1556"/>
+        <w:gridCol w:w="2953"/>
       </w:tblGrid>
       <w:tr>
         <w:trPr>
@@ -307,7 +307,7 @@
         </w:trPr>
         <w:tc>
           <w:tcPr>
-            <w:tcW w:w="2668" w:type="dxa"/>
+            <w:tcW w:w="2559" w:type="dxa"/>
             <w:shd w:val="clear" w:color="auto" w:fill="F2F2F2"/>
           </w:tcPr>
           <w:p>
@@ -319,7 +319,7 @@
         </w:tc>
         <w:tc>
           <w:tcPr>
-            <w:tcW w:w="2358" w:type="dxa"/>
+            <w:tcW w:w="2292" w:type="dxa"/>
             <w:shd w:val="clear" w:color="auto" w:fill="F2F2F2"/>
           </w:tcPr>
           <w:p>
@@ -331,7 +331,7 @@
         </w:tc>
         <w:tc>
           <w:tcPr>
-            <w:tcW w:w="1601" w:type="dxa"/>
+            <w:tcW w:w="1556" w:type="dxa"/>
             <w:shd w:val="clear" w:color="auto" w:fill="F2F2F2"/>
           </w:tcPr>
           <w:p>
@@ -343,7 +343,7 @@
         </w:tc>
         <w:tc>
           <w:tcPr>
-            <w:tcW w:w="2732" w:type="dxa"/>
+            <w:tcW w:w="2953" w:type="dxa"/>
             <w:shd w:val="clear" w:color="auto" w:fill="F2F2F2"/>
           </w:tcPr>
           <w:p>
@@ -357,7 +357,7 @@
       <w:tr>
         <w:tc>
           <w:tcPr>
-            <w:tcW w:w="2668" w:type="dxa"/>
+            <w:tcW w:w="2559" w:type="dxa"/>
           </w:tcPr>
           <w:p>
             <w:pPr/>
@@ -373,7 +373,7 @@
         </w:tc>
         <w:tc>
           <w:tcPr>
-            <w:tcW w:w="2358" w:type="dxa"/>
+            <w:tcW w:w="2292" w:type="dxa"/>
           </w:tcPr>
           <w:p>
             <w:pPr/>
@@ -384,7 +384,7 @@
         </w:tc>
         <w:tc>
           <w:tcPr>
-            <w:tcW w:w="1601" w:type="dxa"/>
+            <w:tcW w:w="1556" w:type="dxa"/>
           </w:tcPr>
           <w:p>
             <w:pPr/>
@@ -395,7 +395,7 @@
         </w:tc>
         <w:tc>
           <w:tcPr>
-            <w:tcW w:w="2732" w:type="dxa"/>
+            <w:tcW w:w="2953" w:type="dxa"/>
           </w:tcPr>
           <w:p>
             <w:pPr/>
@@ -408,7 +408,7 @@
       <w:tr>
         <w:tc>
           <w:tcPr>
-            <w:tcW w:w="2668" w:type="dxa"/>
+            <w:tcW w:w="2559" w:type="dxa"/>
           </w:tcPr>
           <w:p>
             <w:pPr/>
@@ -424,7 +424,7 @@
         </w:tc>
         <w:tc>
           <w:tcPr>
-            <w:tcW w:w="2358" w:type="dxa"/>
+            <w:tcW w:w="2292" w:type="dxa"/>
           </w:tcPr>
           <w:p>
             <w:pPr/>
@@ -435,7 +435,7 @@
         </w:tc>
         <w:tc>
           <w:tcPr>
-            <w:tcW w:w="1601" w:type="dxa"/>
+            <w:tcW w:w="1556" w:type="dxa"/>
           </w:tcPr>
           <w:p>
             <w:pPr/>
@@ -446,7 +446,7 @@
         </w:tc>
         <w:tc>
           <w:tcPr>
-            <w:tcW w:w="2732" w:type="dxa"/>
+            <w:tcW w:w="2953" w:type="dxa"/>
           </w:tcPr>
           <w:p>
             <w:pPr/>
@@ -459,7 +459,7 @@
       <w:tr>
         <w:tc>
           <w:tcPr>
-            <w:tcW w:w="2668" w:type="dxa"/>
+            <w:tcW w:w="2559" w:type="dxa"/>
           </w:tcPr>
           <w:p>
             <w:pPr/>
@@ -475,7 +475,7 @@
         </w:tc>
         <w:tc>
           <w:tcPr>
-            <w:tcW w:w="2358" w:type="dxa"/>
+            <w:tcW w:w="2292" w:type="dxa"/>
           </w:tcPr>
           <w:p>
             <w:pPr/>
@@ -486,7 +486,7 @@
         </w:tc>
         <w:tc>
           <w:tcPr>
-            <w:tcW w:w="1601" w:type="dxa"/>
+            <w:tcW w:w="1556" w:type="dxa"/>
           </w:tcPr>
           <w:p>
             <w:pPr/>
@@ -497,7 +497,7 @@
         </w:tc>
         <w:tc>
           <w:tcPr>
-            <w:tcW w:w="2732" w:type="dxa"/>
+            <w:tcW w:w="2953" w:type="dxa"/>
           </w:tcPr>
           <w:p>
             <w:pPr/>
@@ -510,7 +510,7 @@
       <w:tr>
         <w:tc>
           <w:tcPr>
-            <w:tcW w:w="2668" w:type="dxa"/>
+            <w:tcW w:w="2559" w:type="dxa"/>
           </w:tcPr>
           <w:p>
             <w:pPr/>
@@ -526,7 +526,7 @@
         </w:tc>
         <w:tc>
           <w:tcPr>
-            <w:tcW w:w="2358" w:type="dxa"/>
+            <w:tcW w:w="2292" w:type="dxa"/>
           </w:tcPr>
           <w:p>
             <w:pPr/>
@@ -537,7 +537,7 @@
         </w:tc>
         <w:tc>
           <w:tcPr>
-            <w:tcW w:w="1601" w:type="dxa"/>
+            <w:tcW w:w="1556" w:type="dxa"/>
           </w:tcPr>
           <w:p>
             <w:pPr/>
@@ -548,7 +548,7 @@
         </w:tc>
         <w:tc>
           <w:tcPr>
-            <w:tcW w:w="2732" w:type="dxa"/>
+            <w:tcW w:w="2953" w:type="dxa"/>
           </w:tcPr>
           <w:p>
             <w:pPr/>
@@ -561,7 +561,7 @@
       <w:tr>
         <w:tc>
           <w:tcPr>
-            <w:tcW w:w="2668" w:type="dxa"/>
+            <w:tcW w:w="2559" w:type="dxa"/>
           </w:tcPr>
           <w:p>
             <w:pPr/>
@@ -591,7 +591,7 @@
         </w:tc>
         <w:tc>
           <w:tcPr>
-            <w:tcW w:w="2358" w:type="dxa"/>
+            <w:tcW w:w="2292" w:type="dxa"/>
           </w:tcPr>
           <w:p>
             <w:pPr/>
@@ -602,7 +602,7 @@
         </w:tc>
         <w:tc>
           <w:tcPr>
-            <w:tcW w:w="1601" w:type="dxa"/>
+            <w:tcW w:w="1556" w:type="dxa"/>
           </w:tcPr>
           <w:p>
             <w:pPr/>
@@ -613,7 +613,7 @@
         </w:tc>
         <w:tc>
           <w:tcPr>
-            <w:tcW w:w="2732" w:type="dxa"/>
+            <w:tcW w:w="2953" w:type="dxa"/>
           </w:tcPr>
           <w:p>
             <w:pPr/>
@@ -626,7 +626,7 @@
       <w:tr>
         <w:tc>
           <w:tcPr>
-            <w:tcW w:w="2668" w:type="dxa"/>
+            <w:tcW w:w="2559" w:type="dxa"/>
           </w:tcPr>
           <w:p>
             <w:pPr/>
@@ -635,6 +635,57 @@
                 <w:rPr>
                   <w:rStyle w:val="Hyperlink"/>
                 </w:rPr>
+                <w:t xml:space="preserve">Destinační společnost Postřelí</w:t>
+              </w:r>
+            </w:hyperlink>
+          </w:p>
+        </w:tc>
+        <w:tc>
+          <w:tcPr>
+            <w:tcW w:w="2292" w:type="dxa"/>
+          </w:tcPr>
+          <w:p>
+            <w:pPr/>
+            <w:r>
+              <w:t xml:space="preserve">spolek je člen; nepřímá podpora</w:t>
+            </w:r>
+          </w:p>
+        </w:tc>
+        <w:tc>
+          <w:tcPr>
+            <w:tcW w:w="1556" w:type="dxa"/>
+          </w:tcPr>
+          <w:p>
+            <w:pPr/>
+            <w:r>
+              <w:t xml:space="preserve">průběžně, bez výzvy</w:t>
+            </w:r>
+          </w:p>
+        </w:tc>
+        <w:tc>
+          <w:tcPr>
+            <w:tcW w:w="2953" w:type="dxa"/>
+          </w:tcPr>
+          <w:p>
+            <w:pPr/>
+            <w:r>
+              <w:t xml:space="preserve">individuálně s ředitelem Ondřejem Fáberou, +420 728 215 628, dspostreli@gmail.com</w:t>
+            </w:r>
+          </w:p>
+        </w:tc>
+      </w:tr>
+      <w:tr>
+        <w:tc>
+          <w:tcPr>
+            <w:tcW w:w="2559" w:type="dxa"/>
+          </w:tcPr>
+          <w:p>
+            <w:pPr/>
+            <w:hyperlink r:id="rId10" w:history="1">
+              <w:r>
+                <w:rPr>
+                  <w:rStyle w:val="Hyperlink"/>
+                </w:rPr>
                 <w:t xml:space="preserve">Nadace ČEZ: Zaměstnanecké granty</w:t>
               </w:r>
             </w:hyperlink>
@@ -642,7 +693,7 @@
         </w:tc>
         <w:tc>
           <w:tcPr>
-            <w:tcW w:w="2358" w:type="dxa"/>
+            <w:tcW w:w="2292" w:type="dxa"/>
           </w:tcPr>
           <w:p>
             <w:pPr/>
@@ -653,7 +704,7 @@
         </w:tc>
         <w:tc>
           <w:tcPr>
-            <w:tcW w:w="1601" w:type="dxa"/>
+            <w:tcW w:w="1556" w:type="dxa"/>
           </w:tcPr>
           <w:p>
             <w:pPr/>
@@ -664,7 +715,7 @@
         </w:tc>
         <w:tc>
           <w:tcPr>
-            <w:tcW w:w="2732" w:type="dxa"/>
+            <w:tcW w:w="2953" w:type="dxa"/>
           </w:tcPr>
           <w:p>
             <w:pPr/>
@@ -677,11 +728,11 @@
       <w:tr>
         <w:tc>
           <w:tcPr>
-            <w:tcW w:w="2668" w:type="dxa"/>
-          </w:tcPr>
-          <w:p>
-            <w:pPr/>
-            <w:hyperlink r:id="rId10" w:history="1">
+            <w:tcW w:w="2559" w:type="dxa"/>
+          </w:tcPr>
+          <w:p>
+            <w:pPr/>
+            <w:hyperlink r:id="rId11" w:history="1">
               <w:r>
                 <w:rPr>
                   <w:rStyle w:val="Hyperlink"/>
@@ -693,7 +744,7 @@
         </w:tc>
         <w:tc>
           <w:tcPr>
-            <w:tcW w:w="2358" w:type="dxa"/>
+            <w:tcW w:w="2292" w:type="dxa"/>
           </w:tcPr>
           <w:p>
             <w:pPr/>
@@ -704,7 +755,7 @@
         </w:tc>
         <w:tc>
           <w:tcPr>
-            <w:tcW w:w="1601" w:type="dxa"/>
+            <w:tcW w:w="1556" w:type="dxa"/>
           </w:tcPr>
           <w:p>
             <w:pPr/>
@@ -715,7 +766,7 @@
         </w:tc>
         <w:tc>
           <w:tcPr>
-            <w:tcW w:w="2732" w:type="dxa"/>
+            <w:tcW w:w="2953" w:type="dxa"/>
           </w:tcPr>
           <w:p>
             <w:pPr/>
@@ -728,11 +779,11 @@
       <w:tr>
         <w:tc>
           <w:tcPr>
-            <w:tcW w:w="2668" w:type="dxa"/>
-          </w:tcPr>
-          <w:p>
-            <w:pPr/>
-            <w:hyperlink r:id="rId11" w:history="1">
+            <w:tcW w:w="2559" w:type="dxa"/>
+          </w:tcPr>
+          <w:p>
+            <w:pPr/>
+            <w:hyperlink r:id="rId12" w:history="1">
               <w:r>
                 <w:rPr>
                   <w:rStyle w:val="Hyperlink"/>
@@ -744,7 +795,7 @@
         </w:tc>
         <w:tc>
           <w:tcPr>
-            <w:tcW w:w="2358" w:type="dxa"/>
+            <w:tcW w:w="2292" w:type="dxa"/>
           </w:tcPr>
           <w:p>
             <w:pPr/>
@@ -755,7 +806,7 @@
         </w:tc>
         <w:tc>
           <w:tcPr>
-            <w:tcW w:w="1601" w:type="dxa"/>
+            <w:tcW w:w="1556" w:type="dxa"/>
           </w:tcPr>
           <w:p>
             <w:pPr/>
@@ -766,7 +817,7 @@
         </w:tc>
         <w:tc>
           <w:tcPr>
-            <w:tcW w:w="2732" w:type="dxa"/>
+            <w:tcW w:w="2953" w:type="dxa"/>
           </w:tcPr>
           <w:p>
             <w:pPr/>
@@ -863,7 +914,7 @@
           </w:tcPr>
           <w:p>
             <w:pPr/>
-            <w:hyperlink r:id="rId12" w:history="1">
+            <w:hyperlink r:id="rId13" w:history="1">
               <w:r>
                 <w:rPr>
                   <w:rStyle w:val="Hyperlink"/>
@@ -903,7 +954,7 @@
           </w:tcPr>
           <w:p>
             <w:pPr/>
-            <w:hyperlink r:id="rId13" w:history="1">
+            <w:hyperlink r:id="rId14" w:history="1">
               <w:r>
                 <w:rPr>
                   <w:rStyle w:val="Hyperlink"/>
@@ -943,7 +994,7 @@
           </w:tcPr>
           <w:p>
             <w:pPr/>
-            <w:hyperlink r:id="rId14" w:history="1">
+            <w:hyperlink r:id="rId15" w:history="1">
               <w:r>
                 <w:rPr>
                   <w:rStyle w:val="Hyperlink"/>
@@ -954,7 +1005,7 @@
             <w:r>
               <w:t xml:space="preserve"> (</w:t>
             </w:r>
-            <w:hyperlink r:id="rId15" w:history="1">
+            <w:hyperlink r:id="rId16" w:history="1">
               <w:r>
                 <w:rPr>
                   <w:rStyle w:val="Hyperlink"/>
@@ -997,7 +1048,7 @@
           </w:tcPr>
           <w:p>
             <w:pPr/>
-            <w:hyperlink r:id="rId16" w:history="1">
+            <w:hyperlink r:id="rId17" w:history="1">
               <w:r>
                 <w:rPr>
                   <w:rStyle w:val="Hyperlink"/>
@@ -1037,7 +1088,7 @@
           </w:tcPr>
           <w:p>
             <w:pPr/>
-            <w:hyperlink r:id="rId17" w:history="1">
+            <w:hyperlink r:id="rId18" w:history="1">
               <w:r>
                 <w:rPr>
                   <w:rStyle w:val="Hyperlink"/>
@@ -1048,7 +1099,7 @@
             <w:r>
               <w:t xml:space="preserve"> (</w:t>
             </w:r>
-            <w:hyperlink r:id="rId18" w:history="1">
+            <w:hyperlink r:id="rId19" w:history="1">
               <w:r>
                 <w:rPr>
                   <w:rStyle w:val="Hyperlink"/>
@@ -1091,7 +1142,7 @@
           </w:tcPr>
           <w:p>
             <w:pPr/>
-            <w:hyperlink r:id="rId19" w:history="1">
+            <w:hyperlink r:id="rId20" w:history="1">
               <w:r>
                 <w:rPr>
                   <w:rStyle w:val="Hyperlink"/>
@@ -1131,7 +1182,7 @@
           </w:tcPr>
           <w:p>
             <w:pPr/>
-            <w:hyperlink r:id="rId20" w:history="1">
+            <w:hyperlink r:id="rId21" w:history="1">
               <w:r>
                 <w:rPr>
                   <w:rStyle w:val="Hyperlink"/>
@@ -1171,7 +1222,7 @@
           </w:tcPr>
           <w:p>
             <w:pPr/>
-            <w:hyperlink r:id="rId21" w:history="1">
+            <w:hyperlink r:id="rId22" w:history="1">
               <w:r>
                 <w:rPr>
                   <w:rStyle w:val="Hyperlink"/>
@@ -1210,7 +1261,7 @@
       <w:r>
         <w:t xml:space="preserve">Kde hledat další: </w:t>
       </w:r>
-      <w:hyperlink r:id="rId22" w:history="1">
+      <w:hyperlink r:id="rId23" w:history="1">
         <w:r>
           <w:rPr>
             <w:rStyle w:val="Hyperlink"/>
@@ -1221,7 +1272,7 @@
       <w:r>
         <w:t xml:space="preserve"> (Úřad vlády, státní programy pro neziskovky), </w:t>
       </w:r>
-      <w:hyperlink r:id="rId14" w:history="1">
+      <w:hyperlink r:id="rId15" w:history="1">
         <w:r>
           <w:rPr>
             <w:rStyle w:val="Hyperlink"/>
@@ -1232,7 +1283,7 @@
       <w:r>
         <w:t xml:space="preserve">, </w:t>
       </w:r>
-      <w:hyperlink r:id="rId23" w:history="1">
+      <w:hyperlink r:id="rId24" w:history="1">
         <w:r>
           <w:rPr>
             <w:rStyle w:val="Hyperlink"/>
@@ -1243,7 +1294,7 @@
       <w:r>
         <w:t xml:space="preserve"> a </w:t>
       </w:r>
-      <w:hyperlink r:id="rId24" w:history="1">
+      <w:hyperlink r:id="rId25" w:history="1">
         <w:r>
           <w:rPr>
             <w:rStyle w:val="Hyperlink"/>

</xml_diff>

<commit_message>
Dotační manuál: tabulka vyřazených zdrojů
Co-Authored-By: Claude Opus 5.5 (1M context) <noreply@anthropic.com>
Claude-Session: https://claude.ai/code/session_014Cms99YiFfg5qXi7rp4DXx
</commit_message>
<xml_diff>
--- a/docs/dotacni-manual.docx
+++ b/docs/dotacni-manual.docx
@@ -829,12 +829,6 @@
       </w:tr>
     </w:tbl>
     <w:p>
-      <w:pPr/>
-      <w:r>
-        <w:t xml:space="preserve">Ministerstvo kultury se nehlídá: v roce 2026 byla žádost zpoplatněná a nebyla podpořena.</w:t>
-      </w:r>
-    </w:p>
-    <w:p>
       <w:pPr>
         <w:pStyle w:val="Heading2"/>
       </w:pPr>
@@ -1306,6 +1300,353 @@
         <w:t xml:space="preserve"> na propamatky.cz. Propamatky.cz je jen rozcestník, podmínky je vždy potřeba ověřit u poskytovatele.</w:t>
       </w:r>
     </w:p>
+    <w:p>
+      <w:pPr>
+        <w:pStyle w:val="Heading2"/>
+      </w:pPr>
+      <w:r>
+        <w:t xml:space="preserve">Vyřazené zdroje</w:t>
+      </w:r>
+    </w:p>
+    <w:p>
+      <w:pPr/>
+      <w:r>
+        <w:t xml:space="preserve">Zdroje, které se prověřily a spolku se teď nehodí. Nechávají se tu s odkazem pro případ, že se podmínky změní. Pondělní hledání sem zapisuje každý další vyřazený zdroj.</w:t>
+      </w:r>
+    </w:p>
+    <w:tbl>
+      <w:tblPr>
+        <w:tblStyle w:val="TableGrid"/>
+        <w:tblW w:w="0" w:type="auto"/>
+        <w:tblLayout w:type="fixed"/>
+        <w:tblLook w:val="04A0" w:firstRow="1" w:lastRow="0" w:firstColumn="0" w:lastColumn="0" w:noHBand="0" w:noVBand="1"/>
+      </w:tblPr>
+      <w:tblGrid>
+        <w:gridCol w:w="3852"/>
+        <w:gridCol w:w="3839"/>
+        <w:gridCol w:w="1669"/>
+      </w:tblGrid>
+      <w:tr>
+        <w:trPr>
+          <w:tblHeader/>
+        </w:trPr>
+        <w:tc>
+          <w:tcPr>
+            <w:tcW w:w="3852" w:type="dxa"/>
+            <w:shd w:val="clear" w:color="auto" w:fill="F2F2F2"/>
+          </w:tcPr>
+          <w:p>
+            <w:pPr/>
+            <w:r>
+              <w:t xml:space="preserve">Zdroj</w:t>
+            </w:r>
+          </w:p>
+        </w:tc>
+        <w:tc>
+          <w:tcPr>
+            <w:tcW w:w="3839" w:type="dxa"/>
+            <w:shd w:val="clear" w:color="auto" w:fill="F2F2F2"/>
+          </w:tcPr>
+          <w:p>
+            <w:pPr/>
+            <w:r>
+              <w:t xml:space="preserve">Proč vyřazen</w:t>
+            </w:r>
+          </w:p>
+        </w:tc>
+        <w:tc>
+          <w:tcPr>
+            <w:tcW w:w="1669" w:type="dxa"/>
+            <w:shd w:val="clear" w:color="auto" w:fill="F2F2F2"/>
+          </w:tcPr>
+          <w:p>
+            <w:pPr/>
+            <w:r>
+              <w:t xml:space="preserve">Vyřazeno</w:t>
+            </w:r>
+          </w:p>
+        </w:tc>
+      </w:tr>
+      <w:tr>
+        <w:tc>
+          <w:tcPr>
+            <w:tcW w:w="3852" w:type="dxa"/>
+          </w:tcPr>
+          <w:p>
+            <w:pPr/>
+            <w:hyperlink r:id="rId26" w:history="1">
+              <w:r>
+                <w:rPr>
+                  <w:rStyle w:val="Hyperlink"/>
+                </w:rPr>
+                <w:t xml:space="preserve">Ministerstvo kultury</w:t>
+              </w:r>
+            </w:hyperlink>
+          </w:p>
+        </w:tc>
+        <w:tc>
+          <w:tcPr>
+            <w:tcW w:w="3839" w:type="dxa"/>
+          </w:tcPr>
+          <w:p>
+            <w:pPr/>
+            <w:r>
+              <w:t xml:space="preserve">v roce 2026 byla žádost zpoplatněná a nebyla podpořena</w:t>
+            </w:r>
+          </w:p>
+        </w:tc>
+        <w:tc>
+          <w:tcPr>
+            <w:tcW w:w="1669" w:type="dxa"/>
+          </w:tcPr>
+          <w:p>
+            <w:pPr/>
+            <w:r>
+              <w:t xml:space="preserve">2026 (Michal)</w:t>
+            </w:r>
+          </w:p>
+        </w:tc>
+      </w:tr>
+      <w:tr>
+        <w:tc>
+          <w:tcPr>
+            <w:tcW w:w="3852" w:type="dxa"/>
+          </w:tcPr>
+          <w:p>
+            <w:pPr/>
+            <w:hyperlink r:id="rId27" w:history="1">
+              <w:r>
+                <w:rPr>
+                  <w:rStyle w:val="Hyperlink"/>
+                </w:rPr>
+                <w:t xml:space="preserve">RIS, krajské dotační tituly</w:t>
+              </w:r>
+            </w:hyperlink>
+          </w:p>
+        </w:tc>
+        <w:tc>
+          <w:tcPr>
+            <w:tcW w:w="3839" w:type="dxa"/>
+          </w:tcPr>
+          <w:p>
+            <w:pPr/>
+            <w:r>
+              <w:t xml:space="preserve">rozcestník, data jen do roku 2023</w:t>
+            </w:r>
+          </w:p>
+        </w:tc>
+        <w:tc>
+          <w:tcPr>
+            <w:tcW w:w="1669" w:type="dxa"/>
+          </w:tcPr>
+          <w:p>
+            <w:pPr/>
+            <w:r>
+              <w:t xml:space="preserve">20. 10. 2026</w:t>
+            </w:r>
+          </w:p>
+        </w:tc>
+      </w:tr>
+      <w:tr>
+        <w:tc>
+          <w:tcPr>
+            <w:tcW w:w="3852" w:type="dxa"/>
+          </w:tcPr>
+          <w:p>
+            <w:pPr/>
+            <w:hyperlink r:id="rId28" w:history="1">
+              <w:r>
+                <w:rPr>
+                  <w:rStyle w:val="Hyperlink"/>
+                </w:rPr>
+                <w:t xml:space="preserve">Nadace Občanského fóra: Památky a zdraví</w:t>
+              </w:r>
+            </w:hyperlink>
+          </w:p>
+        </w:tc>
+        <w:tc>
+          <w:tcPr>
+            <w:tcW w:w="3839" w:type="dxa"/>
+          </w:tcPr>
+          <w:p>
+            <w:pPr/>
+            <w:r>
+              <w:t xml:space="preserve">jen pro památky sloužící zdravotní a sociální péči</w:t>
+            </w:r>
+          </w:p>
+        </w:tc>
+        <w:tc>
+          <w:tcPr>
+            <w:tcW w:w="1669" w:type="dxa"/>
+          </w:tcPr>
+          <w:p>
+            <w:pPr/>
+            <w:r>
+              <w:t xml:space="preserve">20. 10. 2026</w:t>
+            </w:r>
+          </w:p>
+        </w:tc>
+      </w:tr>
+      <w:tr>
+        <w:tc>
+          <w:tcPr>
+            <w:tcW w:w="3852" w:type="dxa"/>
+          </w:tcPr>
+          <w:p>
+            <w:pPr/>
+            <w:hyperlink r:id="rId6" w:history="1">
+              <w:r>
+                <w:rPr>
+                  <w:rStyle w:val="Hyperlink"/>
+                </w:rPr>
+                <w:t xml:space="preserve">Město Toužim: program Infocentrum a komunitní akce 2027–2029</w:t>
+              </w:r>
+            </w:hyperlink>
+          </w:p>
+        </w:tc>
+        <w:tc>
+          <w:tcPr>
+            <w:tcW w:w="3839" w:type="dxa"/>
+          </w:tcPr>
+          <w:p>
+            <w:pPr/>
+            <w:r>
+              <w:t xml:space="preserve">spolku se netýká (Michal)</w:t>
+            </w:r>
+          </w:p>
+        </w:tc>
+        <w:tc>
+          <w:tcPr>
+            <w:tcW w:w="1669" w:type="dxa"/>
+          </w:tcPr>
+          <w:p>
+            <w:pPr/>
+            <w:r>
+              <w:t xml:space="preserve">20. 10. 2026</w:t>
+            </w:r>
+          </w:p>
+        </w:tc>
+      </w:tr>
+      <w:tr>
+        <w:tc>
+          <w:tcPr>
+            <w:tcW w:w="3852" w:type="dxa"/>
+          </w:tcPr>
+          <w:p>
+            <w:pPr/>
+            <w:hyperlink r:id="rId24" w:history="1">
+              <w:r>
+                <w:rPr>
+                  <w:rStyle w:val="Hyperlink"/>
+                </w:rPr>
+                <w:t xml:space="preserve">Nadace Partnerství: Sázíme budoucnost do 100 tis., KB PS, Škoda Stromky</w:t>
+              </w:r>
+            </w:hyperlink>
+          </w:p>
+        </w:tc>
+        <w:tc>
+          <w:tcPr>
+            <w:tcW w:w="3839" w:type="dxa"/>
+          </w:tcPr>
+          <w:p>
+            <w:pPr/>
+            <w:r>
+              <w:t xml:space="preserve">výsadby ve volné krajině a alejích, ne na zahradu</w:t>
+            </w:r>
+          </w:p>
+        </w:tc>
+        <w:tc>
+          <w:tcPr>
+            <w:tcW w:w="1669" w:type="dxa"/>
+          </w:tcPr>
+          <w:p>
+            <w:pPr/>
+            <w:r>
+              <w:t xml:space="preserve">20. 10. 2026</w:t>
+            </w:r>
+          </w:p>
+        </w:tc>
+      </w:tr>
+      <w:tr>
+        <w:tc>
+          <w:tcPr>
+            <w:tcW w:w="3852" w:type="dxa"/>
+          </w:tcPr>
+          <w:p>
+            <w:pPr/>
+            <w:hyperlink r:id="rId29" w:history="1">
+              <w:r>
+                <w:rPr>
+                  <w:rStyle w:val="Hyperlink"/>
+                </w:rPr>
+                <w:t xml:space="preserve">MAS v kraji mimo Kraj živých vod</w:t>
+              </w:r>
+            </w:hyperlink>
+            <w:r>
+              <w:t xml:space="preserve"> (MAS 21, Sokolovsko, Vladař, Krušné hory)</w:t>
+            </w:r>
+          </w:p>
+        </w:tc>
+        <w:tc>
+          <w:tcPr>
+            <w:tcW w:w="3839" w:type="dxa"/>
+          </w:tcPr>
+          <w:p>
+            <w:pPr/>
+            <w:r>
+              <w:t xml:space="preserve">každá MAS podporuje jen své území, Toužim patří do Kraje živých vod</w:t>
+            </w:r>
+          </w:p>
+        </w:tc>
+        <w:tc>
+          <w:tcPr>
+            <w:tcW w:w="1669" w:type="dxa"/>
+          </w:tcPr>
+          <w:p>
+            <w:pPr/>
+            <w:r>
+              <w:t xml:space="preserve">20. 10. 2026</w:t>
+            </w:r>
+          </w:p>
+        </w:tc>
+      </w:tr>
+      <w:tr>
+        <w:tc>
+          <w:tcPr>
+            <w:tcW w:w="3852" w:type="dxa"/>
+          </w:tcPr>
+          <w:p>
+            <w:pPr/>
+            <w:r>
+              <w:t xml:space="preserve">Destinační agentura Krušnohoří</w:t>
+            </w:r>
+          </w:p>
+        </w:tc>
+        <w:tc>
+          <w:tcPr>
+            <w:tcW w:w="3839" w:type="dxa"/>
+          </w:tcPr>
+          <w:p>
+            <w:pPr/>
+            <w:r>
+              <w:t xml:space="preserve">působí jen v Krušných horách, Toužim mimo</w:t>
+            </w:r>
+          </w:p>
+        </w:tc>
+        <w:tc>
+          <w:tcPr>
+            <w:tcW w:w="1669" w:type="dxa"/>
+          </w:tcPr>
+          <w:p>
+            <w:pPr/>
+            <w:r>
+              <w:t xml:space="preserve">20. 10. 2026</w:t>
+            </w:r>
+          </w:p>
+        </w:tc>
+      </w:tr>
+    </w:tbl>
+    <w:p/>
     <w:sectPr>
       <w:pgSz w:w="12240" w:h="15840"/>
       <w:pgMar w:top="1440" w:right="1440" w:bottom="1440" w:left="1440" w:header="720" w:footer="720" w:gutter="0"/>

</xml_diff>

<commit_message>
Dotační manuál: tabulka vyřazených zdrojů (#24)
Claude-Session: https://claude.ai/code/session_014Cms99YiFfg5qXi7rp4DXx

Co-authored-by: Claude <noreply@anthropic.com>
</commit_message>
<xml_diff>
--- a/docs/dotacni-manual.docx
+++ b/docs/dotacni-manual.docx
@@ -829,12 +829,6 @@
       </w:tr>
     </w:tbl>
     <w:p>
-      <w:pPr/>
-      <w:r>
-        <w:t xml:space="preserve">Ministerstvo kultury se nehlídá: v roce 2026 byla žádost zpoplatněná a nebyla podpořena.</w:t>
-      </w:r>
-    </w:p>
-    <w:p>
       <w:pPr>
         <w:pStyle w:val="Heading2"/>
       </w:pPr>
@@ -1306,6 +1300,353 @@
         <w:t xml:space="preserve"> na propamatky.cz. Propamatky.cz je jen rozcestník, podmínky je vždy potřeba ověřit u poskytovatele.</w:t>
       </w:r>
     </w:p>
+    <w:p>
+      <w:pPr>
+        <w:pStyle w:val="Heading2"/>
+      </w:pPr>
+      <w:r>
+        <w:t xml:space="preserve">Vyřazené zdroje</w:t>
+      </w:r>
+    </w:p>
+    <w:p>
+      <w:pPr/>
+      <w:r>
+        <w:t xml:space="preserve">Zdroje, které se prověřily a spolku se teď nehodí. Nechávají se tu s odkazem pro případ, že se podmínky změní. Pondělní hledání sem zapisuje každý další vyřazený zdroj.</w:t>
+      </w:r>
+    </w:p>
+    <w:tbl>
+      <w:tblPr>
+        <w:tblStyle w:val="TableGrid"/>
+        <w:tblW w:w="0" w:type="auto"/>
+        <w:tblLayout w:type="fixed"/>
+        <w:tblLook w:val="04A0" w:firstRow="1" w:lastRow="0" w:firstColumn="0" w:lastColumn="0" w:noHBand="0" w:noVBand="1"/>
+      </w:tblPr>
+      <w:tblGrid>
+        <w:gridCol w:w="3852"/>
+        <w:gridCol w:w="3839"/>
+        <w:gridCol w:w="1669"/>
+      </w:tblGrid>
+      <w:tr>
+        <w:trPr>
+          <w:tblHeader/>
+        </w:trPr>
+        <w:tc>
+          <w:tcPr>
+            <w:tcW w:w="3852" w:type="dxa"/>
+            <w:shd w:val="clear" w:color="auto" w:fill="F2F2F2"/>
+          </w:tcPr>
+          <w:p>
+            <w:pPr/>
+            <w:r>
+              <w:t xml:space="preserve">Zdroj</w:t>
+            </w:r>
+          </w:p>
+        </w:tc>
+        <w:tc>
+          <w:tcPr>
+            <w:tcW w:w="3839" w:type="dxa"/>
+            <w:shd w:val="clear" w:color="auto" w:fill="F2F2F2"/>
+          </w:tcPr>
+          <w:p>
+            <w:pPr/>
+            <w:r>
+              <w:t xml:space="preserve">Proč vyřazen</w:t>
+            </w:r>
+          </w:p>
+        </w:tc>
+        <w:tc>
+          <w:tcPr>
+            <w:tcW w:w="1669" w:type="dxa"/>
+            <w:shd w:val="clear" w:color="auto" w:fill="F2F2F2"/>
+          </w:tcPr>
+          <w:p>
+            <w:pPr/>
+            <w:r>
+              <w:t xml:space="preserve">Vyřazeno</w:t>
+            </w:r>
+          </w:p>
+        </w:tc>
+      </w:tr>
+      <w:tr>
+        <w:tc>
+          <w:tcPr>
+            <w:tcW w:w="3852" w:type="dxa"/>
+          </w:tcPr>
+          <w:p>
+            <w:pPr/>
+            <w:hyperlink r:id="rId26" w:history="1">
+              <w:r>
+                <w:rPr>
+                  <w:rStyle w:val="Hyperlink"/>
+                </w:rPr>
+                <w:t xml:space="preserve">Ministerstvo kultury</w:t>
+              </w:r>
+            </w:hyperlink>
+          </w:p>
+        </w:tc>
+        <w:tc>
+          <w:tcPr>
+            <w:tcW w:w="3839" w:type="dxa"/>
+          </w:tcPr>
+          <w:p>
+            <w:pPr/>
+            <w:r>
+              <w:t xml:space="preserve">v roce 2026 byla žádost zpoplatněná a nebyla podpořena</w:t>
+            </w:r>
+          </w:p>
+        </w:tc>
+        <w:tc>
+          <w:tcPr>
+            <w:tcW w:w="1669" w:type="dxa"/>
+          </w:tcPr>
+          <w:p>
+            <w:pPr/>
+            <w:r>
+              <w:t xml:space="preserve">2026 (Michal)</w:t>
+            </w:r>
+          </w:p>
+        </w:tc>
+      </w:tr>
+      <w:tr>
+        <w:tc>
+          <w:tcPr>
+            <w:tcW w:w="3852" w:type="dxa"/>
+          </w:tcPr>
+          <w:p>
+            <w:pPr/>
+            <w:hyperlink r:id="rId27" w:history="1">
+              <w:r>
+                <w:rPr>
+                  <w:rStyle w:val="Hyperlink"/>
+                </w:rPr>
+                <w:t xml:space="preserve">RIS, krajské dotační tituly</w:t>
+              </w:r>
+            </w:hyperlink>
+          </w:p>
+        </w:tc>
+        <w:tc>
+          <w:tcPr>
+            <w:tcW w:w="3839" w:type="dxa"/>
+          </w:tcPr>
+          <w:p>
+            <w:pPr/>
+            <w:r>
+              <w:t xml:space="preserve">rozcestník, data jen do roku 2023</w:t>
+            </w:r>
+          </w:p>
+        </w:tc>
+        <w:tc>
+          <w:tcPr>
+            <w:tcW w:w="1669" w:type="dxa"/>
+          </w:tcPr>
+          <w:p>
+            <w:pPr/>
+            <w:r>
+              <w:t xml:space="preserve">20. 10. 2026</w:t>
+            </w:r>
+          </w:p>
+        </w:tc>
+      </w:tr>
+      <w:tr>
+        <w:tc>
+          <w:tcPr>
+            <w:tcW w:w="3852" w:type="dxa"/>
+          </w:tcPr>
+          <w:p>
+            <w:pPr/>
+            <w:hyperlink r:id="rId28" w:history="1">
+              <w:r>
+                <w:rPr>
+                  <w:rStyle w:val="Hyperlink"/>
+                </w:rPr>
+                <w:t xml:space="preserve">Nadace Občanského fóra: Památky a zdraví</w:t>
+              </w:r>
+            </w:hyperlink>
+          </w:p>
+        </w:tc>
+        <w:tc>
+          <w:tcPr>
+            <w:tcW w:w="3839" w:type="dxa"/>
+          </w:tcPr>
+          <w:p>
+            <w:pPr/>
+            <w:r>
+              <w:t xml:space="preserve">jen pro památky sloužící zdravotní a sociální péči</w:t>
+            </w:r>
+          </w:p>
+        </w:tc>
+        <w:tc>
+          <w:tcPr>
+            <w:tcW w:w="1669" w:type="dxa"/>
+          </w:tcPr>
+          <w:p>
+            <w:pPr/>
+            <w:r>
+              <w:t xml:space="preserve">20. 10. 2026</w:t>
+            </w:r>
+          </w:p>
+        </w:tc>
+      </w:tr>
+      <w:tr>
+        <w:tc>
+          <w:tcPr>
+            <w:tcW w:w="3852" w:type="dxa"/>
+          </w:tcPr>
+          <w:p>
+            <w:pPr/>
+            <w:hyperlink r:id="rId6" w:history="1">
+              <w:r>
+                <w:rPr>
+                  <w:rStyle w:val="Hyperlink"/>
+                </w:rPr>
+                <w:t xml:space="preserve">Město Toužim: program Infocentrum a komunitní akce 2027–2029</w:t>
+              </w:r>
+            </w:hyperlink>
+          </w:p>
+        </w:tc>
+        <w:tc>
+          <w:tcPr>
+            <w:tcW w:w="3839" w:type="dxa"/>
+          </w:tcPr>
+          <w:p>
+            <w:pPr/>
+            <w:r>
+              <w:t xml:space="preserve">spolku se netýká (Michal)</w:t>
+            </w:r>
+          </w:p>
+        </w:tc>
+        <w:tc>
+          <w:tcPr>
+            <w:tcW w:w="1669" w:type="dxa"/>
+          </w:tcPr>
+          <w:p>
+            <w:pPr/>
+            <w:r>
+              <w:t xml:space="preserve">20. 10. 2026</w:t>
+            </w:r>
+          </w:p>
+        </w:tc>
+      </w:tr>
+      <w:tr>
+        <w:tc>
+          <w:tcPr>
+            <w:tcW w:w="3852" w:type="dxa"/>
+          </w:tcPr>
+          <w:p>
+            <w:pPr/>
+            <w:hyperlink r:id="rId24" w:history="1">
+              <w:r>
+                <w:rPr>
+                  <w:rStyle w:val="Hyperlink"/>
+                </w:rPr>
+                <w:t xml:space="preserve">Nadace Partnerství: Sázíme budoucnost do 100 tis., KB PS, Škoda Stromky</w:t>
+              </w:r>
+            </w:hyperlink>
+          </w:p>
+        </w:tc>
+        <w:tc>
+          <w:tcPr>
+            <w:tcW w:w="3839" w:type="dxa"/>
+          </w:tcPr>
+          <w:p>
+            <w:pPr/>
+            <w:r>
+              <w:t xml:space="preserve">výsadby ve volné krajině a alejích, ne na zahradu</w:t>
+            </w:r>
+          </w:p>
+        </w:tc>
+        <w:tc>
+          <w:tcPr>
+            <w:tcW w:w="1669" w:type="dxa"/>
+          </w:tcPr>
+          <w:p>
+            <w:pPr/>
+            <w:r>
+              <w:t xml:space="preserve">20. 10. 2026</w:t>
+            </w:r>
+          </w:p>
+        </w:tc>
+      </w:tr>
+      <w:tr>
+        <w:tc>
+          <w:tcPr>
+            <w:tcW w:w="3852" w:type="dxa"/>
+          </w:tcPr>
+          <w:p>
+            <w:pPr/>
+            <w:hyperlink r:id="rId29" w:history="1">
+              <w:r>
+                <w:rPr>
+                  <w:rStyle w:val="Hyperlink"/>
+                </w:rPr>
+                <w:t xml:space="preserve">MAS v kraji mimo Kraj živých vod</w:t>
+              </w:r>
+            </w:hyperlink>
+            <w:r>
+              <w:t xml:space="preserve"> (MAS 21, Sokolovsko, Vladař, Krušné hory)</w:t>
+            </w:r>
+          </w:p>
+        </w:tc>
+        <w:tc>
+          <w:tcPr>
+            <w:tcW w:w="3839" w:type="dxa"/>
+          </w:tcPr>
+          <w:p>
+            <w:pPr/>
+            <w:r>
+              <w:t xml:space="preserve">každá MAS podporuje jen své území, Toužim patří do Kraje živých vod</w:t>
+            </w:r>
+          </w:p>
+        </w:tc>
+        <w:tc>
+          <w:tcPr>
+            <w:tcW w:w="1669" w:type="dxa"/>
+          </w:tcPr>
+          <w:p>
+            <w:pPr/>
+            <w:r>
+              <w:t xml:space="preserve">20. 10. 2026</w:t>
+            </w:r>
+          </w:p>
+        </w:tc>
+      </w:tr>
+      <w:tr>
+        <w:tc>
+          <w:tcPr>
+            <w:tcW w:w="3852" w:type="dxa"/>
+          </w:tcPr>
+          <w:p>
+            <w:pPr/>
+            <w:r>
+              <w:t xml:space="preserve">Destinační agentura Krušnohoří</w:t>
+            </w:r>
+          </w:p>
+        </w:tc>
+        <w:tc>
+          <w:tcPr>
+            <w:tcW w:w="3839" w:type="dxa"/>
+          </w:tcPr>
+          <w:p>
+            <w:pPr/>
+            <w:r>
+              <w:t xml:space="preserve">působí jen v Krušných horách, Toužim mimo</w:t>
+            </w:r>
+          </w:p>
+        </w:tc>
+        <w:tc>
+          <w:tcPr>
+            <w:tcW w:w="1669" w:type="dxa"/>
+          </w:tcPr>
+          <w:p>
+            <w:pPr/>
+            <w:r>
+              <w:t xml:space="preserve">20. 10. 2026</w:t>
+            </w:r>
+          </w:p>
+        </w:tc>
+      </w:tr>
+    </w:tbl>
+    <w:p/>
     <w:sectPr>
       <w:pgSz w:w="12240" w:h="15840"/>
       <w:pgMar w:top="1440" w:right="1440" w:bottom="1440" w:left="1440" w:header="720" w:footer="720" w:gutter="0"/>

</xml_diff>

<commit_message>
Dotace: pondělní aktualizace 26. 10. 2026
Kalendář: Nadace Život umělce s termíny výzev, ČEZ Podpora regionů 2027 od 4. 1.,
MMR 2. výzva, nové karty Nadace ČEZ Stromy a kraj Obnova kulturních památek,
štítek novinka. Manuál: nové a vyřazené zdroje.

Co-Authored-By: Claude Opus 5.5 (1M context) <noreply@anthropic.com>
Claude-Session: https://claude.ai/code/session_01KYJqMqs1rodYiHpW8j2rHK
</commit_message>
<xml_diff>
--- a/docs/dotacni-manual.docx
+++ b/docs/dotacni-manual.docx
@@ -285,7 +285,7 @@
     <w:p>
       <w:pPr/>
       <w:r>
-        <w:t xml:space="preserve">Termíny jsou poslední známé a ověřené na webech poskytovatelů (20. 10. 2026). Před podáním je potřeba je zkontrolovat na odkazu, aktuální stav je vždy v kalendáři.</w:t>
+        <w:t xml:space="preserve">Termíny jsou poslední známé a ověřené na webech poskytovatelů (26. 10. 2026). Před podáním je potřeba je zkontrolovat na odkazu, aktuální stav je vždy v kalendáři.</w:t>
       </w:r>
     </w:p>
     <w:tbl>
@@ -296,10 +296,10 @@
         <w:tblLook w:val="04A0" w:firstRow="1" w:lastRow="0" w:firstColumn="0" w:lastColumn="0" w:noHBand="0" w:noVBand="1"/>
       </w:tblPr>
       <w:tblGrid>
-        <w:gridCol w:w="2559"/>
-        <w:gridCol w:w="2292"/>
-        <w:gridCol w:w="1556"/>
-        <w:gridCol w:w="2953"/>
+        <w:gridCol w:w="2259"/>
+        <w:gridCol w:w="2556"/>
+        <w:gridCol w:w="1563"/>
+        <w:gridCol w:w="2982"/>
       </w:tblGrid>
       <w:tr>
         <w:trPr>
@@ -307,7 +307,7 @@
         </w:trPr>
         <w:tc>
           <w:tcPr>
-            <w:tcW w:w="2559" w:type="dxa"/>
+            <w:tcW w:w="2259" w:type="dxa"/>
             <w:shd w:val="clear" w:color="auto" w:fill="F2F2F2"/>
           </w:tcPr>
           <w:p>
@@ -319,7 +319,7 @@
         </w:tc>
         <w:tc>
           <w:tcPr>
-            <w:tcW w:w="2292" w:type="dxa"/>
+            <w:tcW w:w="2556" w:type="dxa"/>
             <w:shd w:val="clear" w:color="auto" w:fill="F2F2F2"/>
           </w:tcPr>
           <w:p>
@@ -331,7 +331,7 @@
         </w:tc>
         <w:tc>
           <w:tcPr>
-            <w:tcW w:w="1556" w:type="dxa"/>
+            <w:tcW w:w="1563" w:type="dxa"/>
             <w:shd w:val="clear" w:color="auto" w:fill="F2F2F2"/>
           </w:tcPr>
           <w:p>
@@ -343,7 +343,7 @@
         </w:tc>
         <w:tc>
           <w:tcPr>
-            <w:tcW w:w="2953" w:type="dxa"/>
+            <w:tcW w:w="2982" w:type="dxa"/>
             <w:shd w:val="clear" w:color="auto" w:fill="F2F2F2"/>
           </w:tcPr>
           <w:p>
@@ -357,7 +357,7 @@
       <w:tr>
         <w:tc>
           <w:tcPr>
-            <w:tcW w:w="2559" w:type="dxa"/>
+            <w:tcW w:w="2259" w:type="dxa"/>
           </w:tcPr>
           <w:p>
             <w:pPr/>
@@ -373,7 +373,7 @@
         </w:tc>
         <w:tc>
           <w:tcPr>
-            <w:tcW w:w="2292" w:type="dxa"/>
+            <w:tcW w:w="2556" w:type="dxa"/>
           </w:tcPr>
           <w:p>
             <w:pPr/>
@@ -384,7 +384,7 @@
         </w:tc>
         <w:tc>
           <w:tcPr>
-            <w:tcW w:w="1556" w:type="dxa"/>
+            <w:tcW w:w="1563" w:type="dxa"/>
           </w:tcPr>
           <w:p>
             <w:pPr/>
@@ -395,7 +395,7 @@
         </w:tc>
         <w:tc>
           <w:tcPr>
-            <w:tcW w:w="2953" w:type="dxa"/>
+            <w:tcW w:w="2982" w:type="dxa"/>
           </w:tcPr>
           <w:p>
             <w:pPr/>
@@ -408,7 +408,7 @@
       <w:tr>
         <w:tc>
           <w:tcPr>
-            <w:tcW w:w="2559" w:type="dxa"/>
+            <w:tcW w:w="2259" w:type="dxa"/>
           </w:tcPr>
           <w:p>
             <w:pPr/>
@@ -424,7 +424,7 @@
         </w:tc>
         <w:tc>
           <w:tcPr>
-            <w:tcW w:w="2292" w:type="dxa"/>
+            <w:tcW w:w="2556" w:type="dxa"/>
           </w:tcPr>
           <w:p>
             <w:pPr/>
@@ -435,7 +435,7 @@
         </w:tc>
         <w:tc>
           <w:tcPr>
-            <w:tcW w:w="1556" w:type="dxa"/>
+            <w:tcW w:w="1563" w:type="dxa"/>
           </w:tcPr>
           <w:p>
             <w:pPr/>
@@ -446,7 +446,7 @@
         </w:tc>
         <w:tc>
           <w:tcPr>
-            <w:tcW w:w="2953" w:type="dxa"/>
+            <w:tcW w:w="2982" w:type="dxa"/>
           </w:tcPr>
           <w:p>
             <w:pPr/>
@@ -459,7 +459,7 @@
       <w:tr>
         <w:tc>
           <w:tcPr>
-            <w:tcW w:w="2559" w:type="dxa"/>
+            <w:tcW w:w="2259" w:type="dxa"/>
           </w:tcPr>
           <w:p>
             <w:pPr/>
@@ -475,7 +475,7 @@
         </w:tc>
         <w:tc>
           <w:tcPr>
-            <w:tcW w:w="2292" w:type="dxa"/>
+            <w:tcW w:w="2556" w:type="dxa"/>
           </w:tcPr>
           <w:p>
             <w:pPr/>
@@ -486,7 +486,7 @@
         </w:tc>
         <w:tc>
           <w:tcPr>
-            <w:tcW w:w="1556" w:type="dxa"/>
+            <w:tcW w:w="1563" w:type="dxa"/>
           </w:tcPr>
           <w:p>
             <w:pPr/>
@@ -497,7 +497,7 @@
         </w:tc>
         <w:tc>
           <w:tcPr>
-            <w:tcW w:w="2953" w:type="dxa"/>
+            <w:tcW w:w="2982" w:type="dxa"/>
           </w:tcPr>
           <w:p>
             <w:pPr/>
@@ -510,7 +510,7 @@
       <w:tr>
         <w:tc>
           <w:tcPr>
-            <w:tcW w:w="2559" w:type="dxa"/>
+            <w:tcW w:w="2259" w:type="dxa"/>
           </w:tcPr>
           <w:p>
             <w:pPr/>
@@ -526,7 +526,7 @@
         </w:tc>
         <w:tc>
           <w:tcPr>
-            <w:tcW w:w="2292" w:type="dxa"/>
+            <w:tcW w:w="2556" w:type="dxa"/>
           </w:tcPr>
           <w:p>
             <w:pPr/>
@@ -537,7 +537,7 @@
         </w:tc>
         <w:tc>
           <w:tcPr>
-            <w:tcW w:w="1556" w:type="dxa"/>
+            <w:tcW w:w="1563" w:type="dxa"/>
           </w:tcPr>
           <w:p>
             <w:pPr/>
@@ -548,7 +548,7 @@
         </w:tc>
         <w:tc>
           <w:tcPr>
-            <w:tcW w:w="2953" w:type="dxa"/>
+            <w:tcW w:w="2982" w:type="dxa"/>
           </w:tcPr>
           <w:p>
             <w:pPr/>
@@ -561,7 +561,7 @@
       <w:tr>
         <w:tc>
           <w:tcPr>
-            <w:tcW w:w="2559" w:type="dxa"/>
+            <w:tcW w:w="2259" w:type="dxa"/>
           </w:tcPr>
           <w:p>
             <w:pPr/>
@@ -591,7 +591,7 @@
         </w:tc>
         <w:tc>
           <w:tcPr>
-            <w:tcW w:w="2292" w:type="dxa"/>
+            <w:tcW w:w="2556" w:type="dxa"/>
           </w:tcPr>
           <w:p>
             <w:pPr/>
@@ -602,7 +602,7 @@
         </w:tc>
         <w:tc>
           <w:tcPr>
-            <w:tcW w:w="1556" w:type="dxa"/>
+            <w:tcW w:w="1563" w:type="dxa"/>
           </w:tcPr>
           <w:p>
             <w:pPr/>
@@ -613,7 +613,7 @@
         </w:tc>
         <w:tc>
           <w:tcPr>
-            <w:tcW w:w="2953" w:type="dxa"/>
+            <w:tcW w:w="2982" w:type="dxa"/>
           </w:tcPr>
           <w:p>
             <w:pPr/>
@@ -626,7 +626,7 @@
       <w:tr>
         <w:tc>
           <w:tcPr>
-            <w:tcW w:w="2559" w:type="dxa"/>
+            <w:tcW w:w="2259" w:type="dxa"/>
           </w:tcPr>
           <w:p>
             <w:pPr/>
@@ -642,7 +642,7 @@
         </w:tc>
         <w:tc>
           <w:tcPr>
-            <w:tcW w:w="2292" w:type="dxa"/>
+            <w:tcW w:w="2556" w:type="dxa"/>
           </w:tcPr>
           <w:p>
             <w:pPr/>
@@ -653,7 +653,7 @@
         </w:tc>
         <w:tc>
           <w:tcPr>
-            <w:tcW w:w="1556" w:type="dxa"/>
+            <w:tcW w:w="1563" w:type="dxa"/>
           </w:tcPr>
           <w:p>
             <w:pPr/>
@@ -664,7 +664,7 @@
         </w:tc>
         <w:tc>
           <w:tcPr>
-            <w:tcW w:w="2953" w:type="dxa"/>
+            <w:tcW w:w="2982" w:type="dxa"/>
           </w:tcPr>
           <w:p>
             <w:pPr/>
@@ -677,7 +677,7 @@
       <w:tr>
         <w:tc>
           <w:tcPr>
-            <w:tcW w:w="2559" w:type="dxa"/>
+            <w:tcW w:w="2259" w:type="dxa"/>
           </w:tcPr>
           <w:p>
             <w:pPr/>
@@ -693,7 +693,7 @@
         </w:tc>
         <w:tc>
           <w:tcPr>
-            <w:tcW w:w="2292" w:type="dxa"/>
+            <w:tcW w:w="2556" w:type="dxa"/>
           </w:tcPr>
           <w:p>
             <w:pPr/>
@@ -704,7 +704,7 @@
         </w:tc>
         <w:tc>
           <w:tcPr>
-            <w:tcW w:w="1556" w:type="dxa"/>
+            <w:tcW w:w="1563" w:type="dxa"/>
           </w:tcPr>
           <w:p>
             <w:pPr/>
@@ -715,7 +715,7 @@
         </w:tc>
         <w:tc>
           <w:tcPr>
-            <w:tcW w:w="2953" w:type="dxa"/>
+            <w:tcW w:w="2982" w:type="dxa"/>
           </w:tcPr>
           <w:p>
             <w:pPr/>
@@ -728,7 +728,7 @@
       <w:tr>
         <w:tc>
           <w:tcPr>
-            <w:tcW w:w="2559" w:type="dxa"/>
+            <w:tcW w:w="2259" w:type="dxa"/>
           </w:tcPr>
           <w:p>
             <w:pPr/>
@@ -744,7 +744,7 @@
         </w:tc>
         <w:tc>
           <w:tcPr>
-            <w:tcW w:w="2292" w:type="dxa"/>
+            <w:tcW w:w="2556" w:type="dxa"/>
           </w:tcPr>
           <w:p>
             <w:pPr/>
@@ -755,7 +755,7 @@
         </w:tc>
         <w:tc>
           <w:tcPr>
-            <w:tcW w:w="1556" w:type="dxa"/>
+            <w:tcW w:w="1563" w:type="dxa"/>
           </w:tcPr>
           <w:p>
             <w:pPr/>
@@ -766,7 +766,7 @@
         </w:tc>
         <w:tc>
           <w:tcPr>
-            <w:tcW w:w="2953" w:type="dxa"/>
+            <w:tcW w:w="2982" w:type="dxa"/>
           </w:tcPr>
           <w:p>
             <w:pPr/>
@@ -779,7 +779,7 @@
       <w:tr>
         <w:tc>
           <w:tcPr>
-            <w:tcW w:w="2559" w:type="dxa"/>
+            <w:tcW w:w="2259" w:type="dxa"/>
           </w:tcPr>
           <w:p>
             <w:pPr/>
@@ -788,41 +788,41 @@
                 <w:rPr>
                   <w:rStyle w:val="Hyperlink"/>
                 </w:rPr>
-                <w:t xml:space="preserve">Nadace Život umělce</w:t>
-              </w:r>
-            </w:hyperlink>
-          </w:p>
-        </w:tc>
-        <w:tc>
-          <w:tcPr>
-            <w:tcW w:w="2292" w:type="dxa"/>
-          </w:tcPr>
-          <w:p>
-            <w:pPr/>
-            <w:r>
-              <w:t xml:space="preserve">kultura</w:t>
-            </w:r>
-          </w:p>
-        </w:tc>
-        <w:tc>
-          <w:tcPr>
-            <w:tcW w:w="1556" w:type="dxa"/>
-          </w:tcPr>
-          <w:p>
-            <w:pPr/>
-            <w:r>
-              <w:t xml:space="preserve">termín nezjištěn</w:t>
-            </w:r>
-          </w:p>
-        </w:tc>
-        <w:tc>
-          <w:tcPr>
-            <w:tcW w:w="2953" w:type="dxa"/>
-          </w:tcPr>
-          <w:p>
-            <w:pPr/>
-            <w:r>
-              <w:t xml:space="preserve">podle výzvy</w:t>
+                <w:t xml:space="preserve">Nadace Život umělce: Grantový program</w:t>
+              </w:r>
+            </w:hyperlink>
+          </w:p>
+        </w:tc>
+        <w:tc>
+          <w:tcPr>
+            <w:tcW w:w="2556" w:type="dxa"/>
+          </w:tcPr>
+          <w:p>
+            <w:pPr/>
+            <w:r>
+              <w:t xml:space="preserve">umělecké projekty: honoráře umělců, nájem sálu, OSA a DILIA, doprava souboru, plakáty; nejvýš 2 podpořené projekty ročně</w:t>
+            </w:r>
+          </w:p>
+        </w:tc>
+        <w:tc>
+          <w:tcPr>
+            <w:tcW w:w="1563" w:type="dxa"/>
+          </w:tcPr>
+          <w:p>
+            <w:pPr/>
+            <w:r>
+              <w:t xml:space="preserve">každý rok 1. 1.–28. 2. a 1. 6.–31. 8., jen na akce v daném roce</w:t>
+            </w:r>
+          </w:p>
+        </w:tc>
+        <w:tc>
+          <w:tcPr>
+            <w:tcW w:w="2982" w:type="dxa"/>
+          </w:tcPr>
+          <w:p>
+            <w:pPr/>
+            <w:r>
+              <w:t xml:space="preserve">jen elektronicky v grantovém systému nadace, příloha kopie smlouvy o účtu; vyúčtování do 30 dnů po akci</w:t>
             </w:r>
           </w:p>
         </w:tc>
@@ -856,9 +856,9 @@
         <w:tblLook w:val="04A0" w:firstRow="1" w:lastRow="0" w:firstColumn="0" w:lastColumn="0" w:noHBand="0" w:noVBand="1"/>
       </w:tblPr>
       <w:tblGrid>
-        <w:gridCol w:w="2245"/>
-        <w:gridCol w:w="4879"/>
-        <w:gridCol w:w="2236"/>
+        <w:gridCol w:w="2196"/>
+        <w:gridCol w:w="4920"/>
+        <w:gridCol w:w="2244"/>
       </w:tblGrid>
       <w:tr>
         <w:trPr>
@@ -866,7 +866,7 @@
         </w:trPr>
         <w:tc>
           <w:tcPr>
-            <w:tcW w:w="2245" w:type="dxa"/>
+            <w:tcW w:w="2196" w:type="dxa"/>
             <w:shd w:val="clear" w:color="auto" w:fill="F2F2F2"/>
           </w:tcPr>
           <w:p>
@@ -878,7 +878,7 @@
         </w:tc>
         <w:tc>
           <w:tcPr>
-            <w:tcW w:w="4879" w:type="dxa"/>
+            <w:tcW w:w="4920" w:type="dxa"/>
             <w:shd w:val="clear" w:color="auto" w:fill="F2F2F2"/>
           </w:tcPr>
           <w:p>
@@ -890,7 +890,7 @@
         </w:tc>
         <w:tc>
           <w:tcPr>
-            <w:tcW w:w="2236" w:type="dxa"/>
+            <w:tcW w:w="2244" w:type="dxa"/>
             <w:shd w:val="clear" w:color="auto" w:fill="F2F2F2"/>
           </w:tcPr>
           <w:p>
@@ -904,7 +904,7 @@
       <w:tr>
         <w:tc>
           <w:tcPr>
-            <w:tcW w:w="2245" w:type="dxa"/>
+            <w:tcW w:w="2196" w:type="dxa"/>
           </w:tcPr>
           <w:p>
             <w:pPr/>
@@ -920,7 +920,7 @@
         </w:tc>
         <w:tc>
           <w:tcPr>
-            <w:tcW w:w="4879" w:type="dxa"/>
+            <w:tcW w:w="4920" w:type="dxa"/>
           </w:tcPr>
           <w:p>
             <w:pPr/>
@@ -931,20 +931,20 @@
         </w:tc>
         <w:tc>
           <w:tcPr>
-            <w:tcW w:w="2236" w:type="dxa"/>
-          </w:tcPr>
-          <w:p>
-            <w:pPr/>
-            <w:r>
-              <w:t xml:space="preserve">2026: do 12. 11.; 2027 od 1. 1.</w:t>
-            </w:r>
-          </w:p>
-        </w:tc>
-      </w:tr>
-      <w:tr>
-        <w:tc>
-          <w:tcPr>
-            <w:tcW w:w="2245" w:type="dxa"/>
+            <w:tcW w:w="2244" w:type="dxa"/>
+          </w:tcPr>
+          <w:p>
+            <w:pPr/>
+            <w:r>
+              <w:t xml:space="preserve">2026: do 12. 11.; příjem na 2027 od 4. 1. 2027</w:t>
+            </w:r>
+          </w:p>
+        </w:tc>
+      </w:tr>
+      <w:tr>
+        <w:tc>
+          <w:tcPr>
+            <w:tcW w:w="2196" w:type="dxa"/>
           </w:tcPr>
           <w:p>
             <w:pPr/>
@@ -953,6 +953,60 @@
                 <w:rPr>
                   <w:rStyle w:val="Hyperlink"/>
                 </w:rPr>
+                <w:t xml:space="preserve">Nadace ČEZ: Stromy</w:t>
+              </w:r>
+            </w:hyperlink>
+            <w:r>
+              <w:t xml:space="preserve"> (</w:t>
+            </w:r>
+            <w:hyperlink r:id="rId15" w:history="1">
+              <w:r>
+                <w:rPr>
+                  <w:rStyle w:val="Hyperlink"/>
+                </w:rPr>
+                <w:t xml:space="preserve">podmínky 2026</w:t>
+              </w:r>
+            </w:hyperlink>
+            <w:r>
+              <w:t xml:space="preserve">)</w:t>
+            </w:r>
+          </w:p>
+        </w:tc>
+        <w:tc>
+          <w:tcPr>
+            <w:tcW w:w="4920" w:type="dxa"/>
+          </w:tcPr>
+          <w:p>
+            <w:pPr/>
+            <w:r>
+              <w:t xml:space="preserve">až 150 000 Kč na výsadbu stromů a keřů, výslovně i ve veřejně přístupných zahradách; sazenice aspoň 70 % nákladů; písemný souhlas vlastníka (města) s udržitelností na 10 let</w:t>
+            </w:r>
+          </w:p>
+        </w:tc>
+        <w:tc>
+          <w:tcPr>
+            <w:tcW w:w="2244" w:type="dxa"/>
+          </w:tcPr>
+          <w:p>
+            <w:pPr/>
+            <w:r>
+              <w:t xml:space="preserve">2026: 1.–26. 1. a 1. 6.–31. 7.; 2027 zatím nevyhlášeno (odhad stejně)</w:t>
+            </w:r>
+          </w:p>
+        </w:tc>
+      </w:tr>
+      <w:tr>
+        <w:tc>
+          <w:tcPr>
+            <w:tcW w:w="2196" w:type="dxa"/>
+          </w:tcPr>
+          <w:p>
+            <w:pPr/>
+            <w:hyperlink r:id="rId16" w:history="1">
+              <w:r>
+                <w:rPr>
+                  <w:rStyle w:val="Hyperlink"/>
+                </w:rPr>
                 <w:t xml:space="preserve">Nadace VIA: Fond Kaufland, komunitní zahrady</w:t>
               </w:r>
             </w:hyperlink>
@@ -960,7 +1014,7 @@
         </w:tc>
         <w:tc>
           <w:tcPr>
-            <w:tcW w:w="4879" w:type="dxa"/>
+            <w:tcW w:w="4920" w:type="dxa"/>
           </w:tcPr>
           <w:p>
             <w:pPr/>
@@ -971,7 +1025,7 @@
         </w:tc>
         <w:tc>
           <w:tcPr>
-            <w:tcW w:w="2236" w:type="dxa"/>
+            <w:tcW w:w="2244" w:type="dxa"/>
           </w:tcPr>
           <w:p>
             <w:pPr/>
@@ -984,11 +1038,11 @@
       <w:tr>
         <w:tc>
           <w:tcPr>
-            <w:tcW w:w="2245" w:type="dxa"/>
-          </w:tcPr>
-          <w:p>
-            <w:pPr/>
-            <w:hyperlink r:id="rId15" w:history="1">
+            <w:tcW w:w="2196" w:type="dxa"/>
+          </w:tcPr>
+          <w:p>
+            <w:pPr/>
+            <w:hyperlink r:id="rId17" w:history="1">
               <w:r>
                 <w:rPr>
                   <w:rStyle w:val="Hyperlink"/>
@@ -999,7 +1053,7 @@
             <w:r>
               <w:t xml:space="preserve"> (</w:t>
             </w:r>
-            <w:hyperlink r:id="rId16" w:history="1">
+            <w:hyperlink r:id="rId18" w:history="1">
               <w:r>
                 <w:rPr>
                   <w:rStyle w:val="Hyperlink"/>
@@ -1014,7 +1068,7 @@
         </w:tc>
         <w:tc>
           <w:tcPr>
-            <w:tcW w:w="4879" w:type="dxa"/>
+            <w:tcW w:w="4920" w:type="dxa"/>
           </w:tcPr>
           <w:p>
             <w:pPr/>
@@ -1025,24 +1079,24 @@
         </w:tc>
         <w:tc>
           <w:tcPr>
-            <w:tcW w:w="2236" w:type="dxa"/>
-          </w:tcPr>
-          <w:p>
-            <w:pPr/>
-            <w:r>
-              <w:t xml:space="preserve">na 2026 příjem 19. 11.–31. 12. 2025; na 2027 se čeká kolem listopadu 2026</w:t>
-            </w:r>
-          </w:p>
-        </w:tc>
-      </w:tr>
-      <w:tr>
-        <w:tc>
-          <w:tcPr>
-            <w:tcW w:w="2245" w:type="dxa"/>
-          </w:tcPr>
-          <w:p>
-            <w:pPr/>
-            <w:hyperlink r:id="rId17" w:history="1">
+            <w:tcW w:w="2244" w:type="dxa"/>
+          </w:tcPr>
+          <w:p>
+            <w:pPr/>
+            <w:r>
+              <w:t xml:space="preserve">na 2026 příjem 19. 11.–31. 12. 2025 a 2. výzva 26. 3.–27. 4. 2026; na 2027 zatím nevyhlášena</w:t>
+            </w:r>
+          </w:p>
+        </w:tc>
+      </w:tr>
+      <w:tr>
+        <w:tc>
+          <w:tcPr>
+            <w:tcW w:w="2196" w:type="dxa"/>
+          </w:tcPr>
+          <w:p>
+            <w:pPr/>
+            <w:hyperlink r:id="rId19" w:history="1">
               <w:r>
                 <w:rPr>
                   <w:rStyle w:val="Hyperlink"/>
@@ -1054,7 +1108,7 @@
         </w:tc>
         <w:tc>
           <w:tcPr>
-            <w:tcW w:w="4879" w:type="dxa"/>
+            <w:tcW w:w="4920" w:type="dxa"/>
           </w:tcPr>
           <w:p>
             <w:pPr/>
@@ -1065,7 +1119,7 @@
         </w:tc>
         <w:tc>
           <w:tcPr>
-            <w:tcW w:w="2236" w:type="dxa"/>
+            <w:tcW w:w="2244" w:type="dxa"/>
           </w:tcPr>
           <w:p>
             <w:pPr/>
@@ -1078,11 +1132,11 @@
       <w:tr>
         <w:tc>
           <w:tcPr>
-            <w:tcW w:w="2245" w:type="dxa"/>
-          </w:tcPr>
-          <w:p>
-            <w:pPr/>
-            <w:hyperlink r:id="rId18" w:history="1">
+            <w:tcW w:w="2196" w:type="dxa"/>
+          </w:tcPr>
+          <w:p>
+            <w:pPr/>
+            <w:hyperlink r:id="rId20" w:history="1">
               <w:r>
                 <w:rPr>
                   <w:rStyle w:val="Hyperlink"/>
@@ -1093,7 +1147,7 @@
             <w:r>
               <w:t xml:space="preserve"> (</w:t>
             </w:r>
-            <w:hyperlink r:id="rId19" w:history="1">
+            <w:hyperlink r:id="rId21" w:history="1">
               <w:r>
                 <w:rPr>
                   <w:rStyle w:val="Hyperlink"/>
@@ -1108,7 +1162,7 @@
         </w:tc>
         <w:tc>
           <w:tcPr>
-            <w:tcW w:w="4879" w:type="dxa"/>
+            <w:tcW w:w="4920" w:type="dxa"/>
           </w:tcPr>
           <w:p>
             <w:pPr/>
@@ -1119,7 +1173,7 @@
         </w:tc>
         <w:tc>
           <w:tcPr>
-            <w:tcW w:w="2236" w:type="dxa"/>
+            <w:tcW w:w="2244" w:type="dxa"/>
           </w:tcPr>
           <w:p>
             <w:pPr/>
@@ -1132,11 +1186,11 @@
       <w:tr>
         <w:tc>
           <w:tcPr>
-            <w:tcW w:w="2245" w:type="dxa"/>
-          </w:tcPr>
-          <w:p>
-            <w:pPr/>
-            <w:hyperlink r:id="rId20" w:history="1">
+            <w:tcW w:w="2196" w:type="dxa"/>
+          </w:tcPr>
+          <w:p>
+            <w:pPr/>
+            <w:hyperlink r:id="rId22" w:history="1">
               <w:r>
                 <w:rPr>
                   <w:rStyle w:val="Hyperlink"/>
@@ -1148,7 +1202,7 @@
         </w:tc>
         <w:tc>
           <w:tcPr>
-            <w:tcW w:w="4879" w:type="dxa"/>
+            <w:tcW w:w="4920" w:type="dxa"/>
           </w:tcPr>
           <w:p>
             <w:pPr/>
@@ -1159,7 +1213,7 @@
         </w:tc>
         <w:tc>
           <w:tcPr>
-            <w:tcW w:w="2236" w:type="dxa"/>
+            <w:tcW w:w="2244" w:type="dxa"/>
           </w:tcPr>
           <w:p>
             <w:pPr/>
@@ -1172,11 +1226,65 @@
       <w:tr>
         <w:tc>
           <w:tcPr>
-            <w:tcW w:w="2245" w:type="dxa"/>
-          </w:tcPr>
-          <w:p>
-            <w:pPr/>
-            <w:hyperlink r:id="rId21" w:history="1">
+            <w:tcW w:w="2196" w:type="dxa"/>
+          </w:tcPr>
+          <w:p>
+            <w:pPr/>
+            <w:hyperlink r:id="rId23" w:history="1">
+              <w:r>
+                <w:rPr>
+                  <w:rStyle w:val="Hyperlink"/>
+                </w:rPr>
+                <w:t xml:space="preserve">Karlovarský kraj: Obnova a nové využití kulturních památek</w:t>
+              </w:r>
+            </w:hyperlink>
+            <w:r>
+              <w:t xml:space="preserve"> (</w:t>
+            </w:r>
+            <w:hyperlink r:id="rId24" w:history="1">
+              <w:r>
+                <w:rPr>
+                  <w:rStyle w:val="Hyperlink"/>
+                </w:rPr>
+                <w:t xml:space="preserve">program</w:t>
+              </w:r>
+            </w:hyperlink>
+            <w:r>
+              <w:t xml:space="preserve">)</w:t>
+            </w:r>
+          </w:p>
+        </w:tc>
+        <w:tc>
+          <w:tcPr>
+            <w:tcW w:w="4920" w:type="dxa"/>
+          </w:tcPr>
+          <w:p>
+            <w:pPr/>
+            <w:r>
+              <w:t xml:space="preserve">oprava památek sloužících veřejnosti, až 800 000 Kč, projekt v roce 2027; žádat smí jen vlastník nebo správce, proto spíš pro město se spolkem jako partnerem</w:t>
+            </w:r>
+          </w:p>
+        </w:tc>
+        <w:tc>
+          <w:tcPr>
+            <w:tcW w:w="2244" w:type="dxa"/>
+          </w:tcPr>
+          <w:p>
+            <w:pPr/>
+            <w:r>
+              <w:t xml:space="preserve">27. 10.–9. 11. 2026</w:t>
+            </w:r>
+          </w:p>
+        </w:tc>
+      </w:tr>
+      <w:tr>
+        <w:tc>
+          <w:tcPr>
+            <w:tcW w:w="2196" w:type="dxa"/>
+          </w:tcPr>
+          <w:p>
+            <w:pPr/>
+            <w:hyperlink r:id="rId25" w:history="1">
               <w:r>
                 <w:rPr>
                   <w:rStyle w:val="Hyperlink"/>
@@ -1188,7 +1296,7 @@
         </w:tc>
         <w:tc>
           <w:tcPr>
-            <w:tcW w:w="4879" w:type="dxa"/>
+            <w:tcW w:w="4920" w:type="dxa"/>
           </w:tcPr>
           <w:p>
             <w:pPr/>
@@ -1199,7 +1307,7 @@
         </w:tc>
         <w:tc>
           <w:tcPr>
-            <w:tcW w:w="2236" w:type="dxa"/>
+            <w:tcW w:w="2244" w:type="dxa"/>
           </w:tcPr>
           <w:p>
             <w:pPr/>
@@ -1212,11 +1320,11 @@
       <w:tr>
         <w:tc>
           <w:tcPr>
-            <w:tcW w:w="2245" w:type="dxa"/>
-          </w:tcPr>
-          <w:p>
-            <w:pPr/>
-            <w:hyperlink r:id="rId22" w:history="1">
+            <w:tcW w:w="2196" w:type="dxa"/>
+          </w:tcPr>
+          <w:p>
+            <w:pPr/>
+            <w:hyperlink r:id="rId26" w:history="1">
               <w:r>
                 <w:rPr>
                   <w:rStyle w:val="Hyperlink"/>
@@ -1228,7 +1336,7 @@
         </w:tc>
         <w:tc>
           <w:tcPr>
-            <w:tcW w:w="4879" w:type="dxa"/>
+            <w:tcW w:w="4920" w:type="dxa"/>
           </w:tcPr>
           <w:p>
             <w:pPr/>
@@ -1239,7 +1347,7 @@
         </w:tc>
         <w:tc>
           <w:tcPr>
-            <w:tcW w:w="2236" w:type="dxa"/>
+            <w:tcW w:w="2244" w:type="dxa"/>
           </w:tcPr>
           <w:p>
             <w:pPr/>
@@ -1255,7 +1363,7 @@
       <w:r>
         <w:t xml:space="preserve">Kde hledat další: </w:t>
       </w:r>
-      <w:hyperlink r:id="rId23" w:history="1">
+      <w:hyperlink r:id="rId27" w:history="1">
         <w:r>
           <w:rPr>
             <w:rStyle w:val="Hyperlink"/>
@@ -1266,7 +1374,7 @@
       <w:r>
         <w:t xml:space="preserve"> (Úřad vlády, státní programy pro neziskovky), </w:t>
       </w:r>
-      <w:hyperlink r:id="rId15" w:history="1">
+      <w:hyperlink r:id="rId17" w:history="1">
         <w:r>
           <w:rPr>
             <w:rStyle w:val="Hyperlink"/>
@@ -1277,7 +1385,7 @@
       <w:r>
         <w:t xml:space="preserve">, </w:t>
       </w:r>
-      <w:hyperlink r:id="rId24" w:history="1">
+      <w:hyperlink r:id="rId28" w:history="1">
         <w:r>
           <w:rPr>
             <w:rStyle w:val="Hyperlink"/>
@@ -1288,7 +1396,7 @@
       <w:r>
         <w:t xml:space="preserve"> a </w:t>
       </w:r>
-      <w:hyperlink r:id="rId25" w:history="1">
+      <w:hyperlink r:id="rId29" w:history="1">
         <w:r>
           <w:rPr>
             <w:rStyle w:val="Hyperlink"/>
@@ -1322,8 +1430,8 @@
         <w:tblLook w:val="04A0" w:firstRow="1" w:lastRow="0" w:firstColumn="0" w:lastColumn="0" w:noHBand="0" w:noVBand="1"/>
       </w:tblPr>
       <w:tblGrid>
-        <w:gridCol w:w="3852"/>
-        <w:gridCol w:w="3839"/>
+        <w:gridCol w:w="3522"/>
+        <w:gridCol w:w="4169"/>
         <w:gridCol w:w="1669"/>
       </w:tblGrid>
       <w:tr>
@@ -1332,7 +1440,7 @@
         </w:trPr>
         <w:tc>
           <w:tcPr>
-            <w:tcW w:w="3852" w:type="dxa"/>
+            <w:tcW w:w="3522" w:type="dxa"/>
             <w:shd w:val="clear" w:color="auto" w:fill="F2F2F2"/>
           </w:tcPr>
           <w:p>
@@ -1344,7 +1452,7 @@
         </w:tc>
         <w:tc>
           <w:tcPr>
-            <w:tcW w:w="3839" w:type="dxa"/>
+            <w:tcW w:w="4169" w:type="dxa"/>
             <w:shd w:val="clear" w:color="auto" w:fill="F2F2F2"/>
           </w:tcPr>
           <w:p>
@@ -1370,11 +1478,11 @@
       <w:tr>
         <w:tc>
           <w:tcPr>
-            <w:tcW w:w="3852" w:type="dxa"/>
-          </w:tcPr>
-          <w:p>
-            <w:pPr/>
-            <w:hyperlink r:id="rId26" w:history="1">
+            <w:tcW w:w="3522" w:type="dxa"/>
+          </w:tcPr>
+          <w:p>
+            <w:pPr/>
+            <w:hyperlink r:id="rId30" w:history="1">
               <w:r>
                 <w:rPr>
                   <w:rStyle w:val="Hyperlink"/>
@@ -1386,7 +1494,7 @@
         </w:tc>
         <w:tc>
           <w:tcPr>
-            <w:tcW w:w="3839" w:type="dxa"/>
+            <w:tcW w:w="4169" w:type="dxa"/>
           </w:tcPr>
           <w:p>
             <w:pPr/>
@@ -1410,11 +1518,11 @@
       <w:tr>
         <w:tc>
           <w:tcPr>
-            <w:tcW w:w="3852" w:type="dxa"/>
-          </w:tcPr>
-          <w:p>
-            <w:pPr/>
-            <w:hyperlink r:id="rId27" w:history="1">
+            <w:tcW w:w="3522" w:type="dxa"/>
+          </w:tcPr>
+          <w:p>
+            <w:pPr/>
+            <w:hyperlink r:id="rId31" w:history="1">
               <w:r>
                 <w:rPr>
                   <w:rStyle w:val="Hyperlink"/>
@@ -1426,7 +1534,7 @@
         </w:tc>
         <w:tc>
           <w:tcPr>
-            <w:tcW w:w="3839" w:type="dxa"/>
+            <w:tcW w:w="4169" w:type="dxa"/>
           </w:tcPr>
           <w:p>
             <w:pPr/>
@@ -1450,7 +1558,87 @@
       <w:tr>
         <w:tc>
           <w:tcPr>
-            <w:tcW w:w="3852" w:type="dxa"/>
+            <w:tcW w:w="3522" w:type="dxa"/>
+          </w:tcPr>
+          <w:p>
+            <w:pPr/>
+            <w:hyperlink r:id="rId32" w:history="1">
+              <w:r>
+                <w:rPr>
+                  <w:rStyle w:val="Hyperlink"/>
+                </w:rPr>
+                <w:t xml:space="preserve">Nadace Občanského fóra: Památky a zdraví</w:t>
+              </w:r>
+            </w:hyperlink>
+          </w:p>
+        </w:tc>
+        <w:tc>
+          <w:tcPr>
+            <w:tcW w:w="4169" w:type="dxa"/>
+          </w:tcPr>
+          <w:p>
+            <w:pPr/>
+            <w:r>
+              <w:t xml:space="preserve">jen pro památky sloužící zdravotní a sociální péči</w:t>
+            </w:r>
+          </w:p>
+        </w:tc>
+        <w:tc>
+          <w:tcPr>
+            <w:tcW w:w="1669" w:type="dxa"/>
+          </w:tcPr>
+          <w:p>
+            <w:pPr/>
+            <w:r>
+              <w:t xml:space="preserve">20. 10. 2026</w:t>
+            </w:r>
+          </w:p>
+        </w:tc>
+      </w:tr>
+      <w:tr>
+        <w:tc>
+          <w:tcPr>
+            <w:tcW w:w="3522" w:type="dxa"/>
+          </w:tcPr>
+          <w:p>
+            <w:pPr/>
+            <w:hyperlink r:id="rId6" w:history="1">
+              <w:r>
+                <w:rPr>
+                  <w:rStyle w:val="Hyperlink"/>
+                </w:rPr>
+                <w:t xml:space="preserve">Město Toužim: program Infocentrum a komunitní akce 2027–2029</w:t>
+              </w:r>
+            </w:hyperlink>
+          </w:p>
+        </w:tc>
+        <w:tc>
+          <w:tcPr>
+            <w:tcW w:w="4169" w:type="dxa"/>
+          </w:tcPr>
+          <w:p>
+            <w:pPr/>
+            <w:r>
+              <w:t xml:space="preserve">spolku se netýká (Michal)</w:t>
+            </w:r>
+          </w:p>
+        </w:tc>
+        <w:tc>
+          <w:tcPr>
+            <w:tcW w:w="1669" w:type="dxa"/>
+          </w:tcPr>
+          <w:p>
+            <w:pPr/>
+            <w:r>
+              <w:t xml:space="preserve">20. 10. 2026</w:t>
+            </w:r>
+          </w:p>
+        </w:tc>
+      </w:tr>
+      <w:tr>
+        <w:tc>
+          <w:tcPr>
+            <w:tcW w:w="3522" w:type="dxa"/>
           </w:tcPr>
           <w:p>
             <w:pPr/>
@@ -1459,19 +1647,19 @@
                 <w:rPr>
                   <w:rStyle w:val="Hyperlink"/>
                 </w:rPr>
-                <w:t xml:space="preserve">Nadace Občanského fóra: Památky a zdraví</w:t>
-              </w:r>
-            </w:hyperlink>
-          </w:p>
-        </w:tc>
-        <w:tc>
-          <w:tcPr>
-            <w:tcW w:w="3839" w:type="dxa"/>
-          </w:tcPr>
-          <w:p>
-            <w:pPr/>
-            <w:r>
-              <w:t xml:space="preserve">jen pro památky sloužící zdravotní a sociální péči</w:t>
+                <w:t xml:space="preserve">Nadace Partnerství: Sázíme budoucnost do 100 tis., KB PS, Škoda Stromky</w:t>
+              </w:r>
+            </w:hyperlink>
+          </w:p>
+        </w:tc>
+        <w:tc>
+          <w:tcPr>
+            <w:tcW w:w="4169" w:type="dxa"/>
+          </w:tcPr>
+          <w:p>
+            <w:pPr/>
+            <w:r>
+              <w:t xml:space="preserve">výsadby ve volné krajině a alejích, ne na zahradu</w:t>
             </w:r>
           </w:p>
         </w:tc>
@@ -1490,28 +1678,31 @@
       <w:tr>
         <w:tc>
           <w:tcPr>
-            <w:tcW w:w="3852" w:type="dxa"/>
-          </w:tcPr>
-          <w:p>
-            <w:pPr/>
-            <w:hyperlink r:id="rId6" w:history="1">
-              <w:r>
-                <w:rPr>
-                  <w:rStyle w:val="Hyperlink"/>
-                </w:rPr>
-                <w:t xml:space="preserve">Město Toužim: program Infocentrum a komunitní akce 2027–2029</w:t>
-              </w:r>
-            </w:hyperlink>
-          </w:p>
-        </w:tc>
-        <w:tc>
-          <w:tcPr>
-            <w:tcW w:w="3839" w:type="dxa"/>
-          </w:tcPr>
-          <w:p>
-            <w:pPr/>
-            <w:r>
-              <w:t xml:space="preserve">spolku se netýká (Michal)</w:t>
+            <w:tcW w:w="3522" w:type="dxa"/>
+          </w:tcPr>
+          <w:p>
+            <w:pPr/>
+            <w:hyperlink r:id="rId33" w:history="1">
+              <w:r>
+                <w:rPr>
+                  <w:rStyle w:val="Hyperlink"/>
+                </w:rPr>
+                <w:t xml:space="preserve">MAS v kraji mimo Kraj živých vod</w:t>
+              </w:r>
+            </w:hyperlink>
+            <w:r>
+              <w:t xml:space="preserve"> (MAS 21, Sokolovsko, Vladař, Krušné hory)</w:t>
+            </w:r>
+          </w:p>
+        </w:tc>
+        <w:tc>
+          <w:tcPr>
+            <w:tcW w:w="4169" w:type="dxa"/>
+          </w:tcPr>
+          <w:p>
+            <w:pPr/>
+            <w:r>
+              <w:t xml:space="preserve">každá MAS podporuje jen své území, Toužim patří do Kraje živých vod</w:t>
             </w:r>
           </w:p>
         </w:tc>
@@ -1530,28 +1721,23 @@
       <w:tr>
         <w:tc>
           <w:tcPr>
-            <w:tcW w:w="3852" w:type="dxa"/>
-          </w:tcPr>
-          <w:p>
-            <w:pPr/>
-            <w:hyperlink r:id="rId24" w:history="1">
-              <w:r>
-                <w:rPr>
-                  <w:rStyle w:val="Hyperlink"/>
-                </w:rPr>
-                <w:t xml:space="preserve">Nadace Partnerství: Sázíme budoucnost do 100 tis., KB PS, Škoda Stromky</w:t>
-              </w:r>
-            </w:hyperlink>
-          </w:p>
-        </w:tc>
-        <w:tc>
-          <w:tcPr>
-            <w:tcW w:w="3839" w:type="dxa"/>
-          </w:tcPr>
-          <w:p>
-            <w:pPr/>
-            <w:r>
-              <w:t xml:space="preserve">výsadby ve volné krajině a alejích, ne na zahradu</w:t>
+            <w:tcW w:w="3522" w:type="dxa"/>
+          </w:tcPr>
+          <w:p>
+            <w:pPr/>
+            <w:r>
+              <w:t xml:space="preserve">Destinační agentura Krušnohoří</w:t>
+            </w:r>
+          </w:p>
+        </w:tc>
+        <w:tc>
+          <w:tcPr>
+            <w:tcW w:w="4169" w:type="dxa"/>
+          </w:tcPr>
+          <w:p>
+            <w:pPr/>
+            <w:r>
+              <w:t xml:space="preserve">působí jen v Krušných horách, Toužim mimo</w:t>
             </w:r>
           </w:p>
         </w:tc>
@@ -1570,31 +1756,28 @@
       <w:tr>
         <w:tc>
           <w:tcPr>
-            <w:tcW w:w="3852" w:type="dxa"/>
-          </w:tcPr>
-          <w:p>
-            <w:pPr/>
-            <w:hyperlink r:id="rId29" w:history="1">
-              <w:r>
-                <w:rPr>
-                  <w:rStyle w:val="Hyperlink"/>
-                </w:rPr>
-                <w:t xml:space="preserve">MAS v kraji mimo Kraj živých vod</w:t>
-              </w:r>
-            </w:hyperlink>
-            <w:r>
-              <w:t xml:space="preserve"> (MAS 21, Sokolovsko, Vladař, Krušné hory)</w:t>
-            </w:r>
-          </w:p>
-        </w:tc>
-        <w:tc>
-          <w:tcPr>
-            <w:tcW w:w="3839" w:type="dxa"/>
-          </w:tcPr>
-          <w:p>
-            <w:pPr/>
-            <w:r>
-              <w:t xml:space="preserve">každá MAS podporuje jen své území, Toužim patří do Kraje živých vod</w:t>
+            <w:tcW w:w="3522" w:type="dxa"/>
+          </w:tcPr>
+          <w:p>
+            <w:pPr/>
+            <w:hyperlink r:id="rId34" w:history="1">
+              <w:r>
+                <w:rPr>
+                  <w:rStyle w:val="Hyperlink"/>
+                </w:rPr>
+                <w:t xml:space="preserve">Karlovarský kraj: Podpora vzdělávání dětí a mládeže v kultuře</w:t>
+              </w:r>
+            </w:hyperlink>
+          </w:p>
+        </w:tc>
+        <w:tc>
+          <w:tcPr>
+            <w:tcW w:w="4169" w:type="dxa"/>
+          </w:tcPr>
+          <w:p>
+            <w:pPr/>
+            <w:r>
+              <w:t xml:space="preserve">jen pro pořady, které kraj zařadí do Katalogu dopoledních kulturních pořadů pro děti a mládež (představení pro školy); na akce spolku se nehodí</w:t>
             </w:r>
           </w:p>
         </w:tc>
@@ -1605,42 +1788,7 @@
           <w:p>
             <w:pPr/>
             <w:r>
-              <w:t xml:space="preserve">20. 10. 2026</w:t>
-            </w:r>
-          </w:p>
-        </w:tc>
-      </w:tr>
-      <w:tr>
-        <w:tc>
-          <w:tcPr>
-            <w:tcW w:w="3852" w:type="dxa"/>
-          </w:tcPr>
-          <w:p>
-            <w:pPr/>
-            <w:r>
-              <w:t xml:space="preserve">Destinační agentura Krušnohoří</w:t>
-            </w:r>
-          </w:p>
-        </w:tc>
-        <w:tc>
-          <w:tcPr>
-            <w:tcW w:w="3839" w:type="dxa"/>
-          </w:tcPr>
-          <w:p>
-            <w:pPr/>
-            <w:r>
-              <w:t xml:space="preserve">působí jen v Krušných horách, Toužim mimo</w:t>
-            </w:r>
-          </w:p>
-        </w:tc>
-        <w:tc>
-          <w:tcPr>
-            <w:tcW w:w="1669" w:type="dxa"/>
-          </w:tcPr>
-          <w:p>
-            <w:pPr/>
-            <w:r>
-              <w:t xml:space="preserve">20. 10. 2026</w:t>
+              <w:t xml:space="preserve">26. 10. 2026</w:t>
             </w:r>
           </w:p>
         </w:tc>

</xml_diff>

<commit_message>
Dotace: pondělní aktualizace 26. 10. 2026 (#32)
Kalendář: Nadace Život umělce s termíny výzev, ČEZ Podpora regionů 2027 od 4. 1.,
MMR 2. výzva, nové karty Nadace ČEZ Stromy a kraj Obnova kulturních památek,
štítek novinka. Manuál: nové a vyřazené zdroje.


Claude-Session: https://claude.ai/code/session_01KYJqMqs1rodYiHpW8j2rHK

Co-authored-by: Claude <noreply@anthropic.com>
</commit_message>
<xml_diff>
--- a/docs/dotacni-manual.docx
+++ b/docs/dotacni-manual.docx
@@ -285,7 +285,7 @@
     <w:p>
       <w:pPr/>
       <w:r>
-        <w:t xml:space="preserve">Termíny jsou poslední známé a ověřené na webech poskytovatelů (20. 10. 2026). Před podáním je potřeba je zkontrolovat na odkazu, aktuální stav je vždy v kalendáři.</w:t>
+        <w:t xml:space="preserve">Termíny jsou poslední známé a ověřené na webech poskytovatelů (26. 10. 2026). Před podáním je potřeba je zkontrolovat na odkazu, aktuální stav je vždy v kalendáři.</w:t>
       </w:r>
     </w:p>
     <w:tbl>
@@ -296,10 +296,10 @@
         <w:tblLook w:val="04A0" w:firstRow="1" w:lastRow="0" w:firstColumn="0" w:lastColumn="0" w:noHBand="0" w:noVBand="1"/>
       </w:tblPr>
       <w:tblGrid>
-        <w:gridCol w:w="2559"/>
-        <w:gridCol w:w="2292"/>
-        <w:gridCol w:w="1556"/>
-        <w:gridCol w:w="2953"/>
+        <w:gridCol w:w="2259"/>
+        <w:gridCol w:w="2556"/>
+        <w:gridCol w:w="1563"/>
+        <w:gridCol w:w="2982"/>
       </w:tblGrid>
       <w:tr>
         <w:trPr>
@@ -307,7 +307,7 @@
         </w:trPr>
         <w:tc>
           <w:tcPr>
-            <w:tcW w:w="2559" w:type="dxa"/>
+            <w:tcW w:w="2259" w:type="dxa"/>
             <w:shd w:val="clear" w:color="auto" w:fill="F2F2F2"/>
           </w:tcPr>
           <w:p>
@@ -319,7 +319,7 @@
         </w:tc>
         <w:tc>
           <w:tcPr>
-            <w:tcW w:w="2292" w:type="dxa"/>
+            <w:tcW w:w="2556" w:type="dxa"/>
             <w:shd w:val="clear" w:color="auto" w:fill="F2F2F2"/>
           </w:tcPr>
           <w:p>
@@ -331,7 +331,7 @@
         </w:tc>
         <w:tc>
           <w:tcPr>
-            <w:tcW w:w="1556" w:type="dxa"/>
+            <w:tcW w:w="1563" w:type="dxa"/>
             <w:shd w:val="clear" w:color="auto" w:fill="F2F2F2"/>
           </w:tcPr>
           <w:p>
@@ -343,7 +343,7 @@
         </w:tc>
         <w:tc>
           <w:tcPr>
-            <w:tcW w:w="2953" w:type="dxa"/>
+            <w:tcW w:w="2982" w:type="dxa"/>
             <w:shd w:val="clear" w:color="auto" w:fill="F2F2F2"/>
           </w:tcPr>
           <w:p>
@@ -357,7 +357,7 @@
       <w:tr>
         <w:tc>
           <w:tcPr>
-            <w:tcW w:w="2559" w:type="dxa"/>
+            <w:tcW w:w="2259" w:type="dxa"/>
           </w:tcPr>
           <w:p>
             <w:pPr/>
@@ -373,7 +373,7 @@
         </w:tc>
         <w:tc>
           <w:tcPr>
-            <w:tcW w:w="2292" w:type="dxa"/>
+            <w:tcW w:w="2556" w:type="dxa"/>
           </w:tcPr>
           <w:p>
             <w:pPr/>
@@ -384,7 +384,7 @@
         </w:tc>
         <w:tc>
           <w:tcPr>
-            <w:tcW w:w="1556" w:type="dxa"/>
+            <w:tcW w:w="1563" w:type="dxa"/>
           </w:tcPr>
           <w:p>
             <w:pPr/>
@@ -395,7 +395,7 @@
         </w:tc>
         <w:tc>
           <w:tcPr>
-            <w:tcW w:w="2953" w:type="dxa"/>
+            <w:tcW w:w="2982" w:type="dxa"/>
           </w:tcPr>
           <w:p>
             <w:pPr/>
@@ -408,7 +408,7 @@
       <w:tr>
         <w:tc>
           <w:tcPr>
-            <w:tcW w:w="2559" w:type="dxa"/>
+            <w:tcW w:w="2259" w:type="dxa"/>
           </w:tcPr>
           <w:p>
             <w:pPr/>
@@ -424,7 +424,7 @@
         </w:tc>
         <w:tc>
           <w:tcPr>
-            <w:tcW w:w="2292" w:type="dxa"/>
+            <w:tcW w:w="2556" w:type="dxa"/>
           </w:tcPr>
           <w:p>
             <w:pPr/>
@@ -435,7 +435,7 @@
         </w:tc>
         <w:tc>
           <w:tcPr>
-            <w:tcW w:w="1556" w:type="dxa"/>
+            <w:tcW w:w="1563" w:type="dxa"/>
           </w:tcPr>
           <w:p>
             <w:pPr/>
@@ -446,7 +446,7 @@
         </w:tc>
         <w:tc>
           <w:tcPr>
-            <w:tcW w:w="2953" w:type="dxa"/>
+            <w:tcW w:w="2982" w:type="dxa"/>
           </w:tcPr>
           <w:p>
             <w:pPr/>
@@ -459,7 +459,7 @@
       <w:tr>
         <w:tc>
           <w:tcPr>
-            <w:tcW w:w="2559" w:type="dxa"/>
+            <w:tcW w:w="2259" w:type="dxa"/>
           </w:tcPr>
           <w:p>
             <w:pPr/>
@@ -475,7 +475,7 @@
         </w:tc>
         <w:tc>
           <w:tcPr>
-            <w:tcW w:w="2292" w:type="dxa"/>
+            <w:tcW w:w="2556" w:type="dxa"/>
           </w:tcPr>
           <w:p>
             <w:pPr/>
@@ -486,7 +486,7 @@
         </w:tc>
         <w:tc>
           <w:tcPr>
-            <w:tcW w:w="1556" w:type="dxa"/>
+            <w:tcW w:w="1563" w:type="dxa"/>
           </w:tcPr>
           <w:p>
             <w:pPr/>
@@ -497,7 +497,7 @@
         </w:tc>
         <w:tc>
           <w:tcPr>
-            <w:tcW w:w="2953" w:type="dxa"/>
+            <w:tcW w:w="2982" w:type="dxa"/>
           </w:tcPr>
           <w:p>
             <w:pPr/>
@@ -510,7 +510,7 @@
       <w:tr>
         <w:tc>
           <w:tcPr>
-            <w:tcW w:w="2559" w:type="dxa"/>
+            <w:tcW w:w="2259" w:type="dxa"/>
           </w:tcPr>
           <w:p>
             <w:pPr/>
@@ -526,7 +526,7 @@
         </w:tc>
         <w:tc>
           <w:tcPr>
-            <w:tcW w:w="2292" w:type="dxa"/>
+            <w:tcW w:w="2556" w:type="dxa"/>
           </w:tcPr>
           <w:p>
             <w:pPr/>
@@ -537,7 +537,7 @@
         </w:tc>
         <w:tc>
           <w:tcPr>
-            <w:tcW w:w="1556" w:type="dxa"/>
+            <w:tcW w:w="1563" w:type="dxa"/>
           </w:tcPr>
           <w:p>
             <w:pPr/>
@@ -548,7 +548,7 @@
         </w:tc>
         <w:tc>
           <w:tcPr>
-            <w:tcW w:w="2953" w:type="dxa"/>
+            <w:tcW w:w="2982" w:type="dxa"/>
           </w:tcPr>
           <w:p>
             <w:pPr/>
@@ -561,7 +561,7 @@
       <w:tr>
         <w:tc>
           <w:tcPr>
-            <w:tcW w:w="2559" w:type="dxa"/>
+            <w:tcW w:w="2259" w:type="dxa"/>
           </w:tcPr>
           <w:p>
             <w:pPr/>
@@ -591,7 +591,7 @@
         </w:tc>
         <w:tc>
           <w:tcPr>
-            <w:tcW w:w="2292" w:type="dxa"/>
+            <w:tcW w:w="2556" w:type="dxa"/>
           </w:tcPr>
           <w:p>
             <w:pPr/>
@@ -602,7 +602,7 @@
         </w:tc>
         <w:tc>
           <w:tcPr>
-            <w:tcW w:w="1556" w:type="dxa"/>
+            <w:tcW w:w="1563" w:type="dxa"/>
           </w:tcPr>
           <w:p>
             <w:pPr/>
@@ -613,7 +613,7 @@
         </w:tc>
         <w:tc>
           <w:tcPr>
-            <w:tcW w:w="2953" w:type="dxa"/>
+            <w:tcW w:w="2982" w:type="dxa"/>
           </w:tcPr>
           <w:p>
             <w:pPr/>
@@ -626,7 +626,7 @@
       <w:tr>
         <w:tc>
           <w:tcPr>
-            <w:tcW w:w="2559" w:type="dxa"/>
+            <w:tcW w:w="2259" w:type="dxa"/>
           </w:tcPr>
           <w:p>
             <w:pPr/>
@@ -642,7 +642,7 @@
         </w:tc>
         <w:tc>
           <w:tcPr>
-            <w:tcW w:w="2292" w:type="dxa"/>
+            <w:tcW w:w="2556" w:type="dxa"/>
           </w:tcPr>
           <w:p>
             <w:pPr/>
@@ -653,7 +653,7 @@
         </w:tc>
         <w:tc>
           <w:tcPr>
-            <w:tcW w:w="1556" w:type="dxa"/>
+            <w:tcW w:w="1563" w:type="dxa"/>
           </w:tcPr>
           <w:p>
             <w:pPr/>
@@ -664,7 +664,7 @@
         </w:tc>
         <w:tc>
           <w:tcPr>
-            <w:tcW w:w="2953" w:type="dxa"/>
+            <w:tcW w:w="2982" w:type="dxa"/>
           </w:tcPr>
           <w:p>
             <w:pPr/>
@@ -677,7 +677,7 @@
       <w:tr>
         <w:tc>
           <w:tcPr>
-            <w:tcW w:w="2559" w:type="dxa"/>
+            <w:tcW w:w="2259" w:type="dxa"/>
           </w:tcPr>
           <w:p>
             <w:pPr/>
@@ -693,7 +693,7 @@
         </w:tc>
         <w:tc>
           <w:tcPr>
-            <w:tcW w:w="2292" w:type="dxa"/>
+            <w:tcW w:w="2556" w:type="dxa"/>
           </w:tcPr>
           <w:p>
             <w:pPr/>
@@ -704,7 +704,7 @@
         </w:tc>
         <w:tc>
           <w:tcPr>
-            <w:tcW w:w="1556" w:type="dxa"/>
+            <w:tcW w:w="1563" w:type="dxa"/>
           </w:tcPr>
           <w:p>
             <w:pPr/>
@@ -715,7 +715,7 @@
         </w:tc>
         <w:tc>
           <w:tcPr>
-            <w:tcW w:w="2953" w:type="dxa"/>
+            <w:tcW w:w="2982" w:type="dxa"/>
           </w:tcPr>
           <w:p>
             <w:pPr/>
@@ -728,7 +728,7 @@
       <w:tr>
         <w:tc>
           <w:tcPr>
-            <w:tcW w:w="2559" w:type="dxa"/>
+            <w:tcW w:w="2259" w:type="dxa"/>
           </w:tcPr>
           <w:p>
             <w:pPr/>
@@ -744,7 +744,7 @@
         </w:tc>
         <w:tc>
           <w:tcPr>
-            <w:tcW w:w="2292" w:type="dxa"/>
+            <w:tcW w:w="2556" w:type="dxa"/>
           </w:tcPr>
           <w:p>
             <w:pPr/>
@@ -755,7 +755,7 @@
         </w:tc>
         <w:tc>
           <w:tcPr>
-            <w:tcW w:w="1556" w:type="dxa"/>
+            <w:tcW w:w="1563" w:type="dxa"/>
           </w:tcPr>
           <w:p>
             <w:pPr/>
@@ -766,7 +766,7 @@
         </w:tc>
         <w:tc>
           <w:tcPr>
-            <w:tcW w:w="2953" w:type="dxa"/>
+            <w:tcW w:w="2982" w:type="dxa"/>
           </w:tcPr>
           <w:p>
             <w:pPr/>
@@ -779,7 +779,7 @@
       <w:tr>
         <w:tc>
           <w:tcPr>
-            <w:tcW w:w="2559" w:type="dxa"/>
+            <w:tcW w:w="2259" w:type="dxa"/>
           </w:tcPr>
           <w:p>
             <w:pPr/>
@@ -788,41 +788,41 @@
                 <w:rPr>
                   <w:rStyle w:val="Hyperlink"/>
                 </w:rPr>
-                <w:t xml:space="preserve">Nadace Život umělce</w:t>
-              </w:r>
-            </w:hyperlink>
-          </w:p>
-        </w:tc>
-        <w:tc>
-          <w:tcPr>
-            <w:tcW w:w="2292" w:type="dxa"/>
-          </w:tcPr>
-          <w:p>
-            <w:pPr/>
-            <w:r>
-              <w:t xml:space="preserve">kultura</w:t>
-            </w:r>
-          </w:p>
-        </w:tc>
-        <w:tc>
-          <w:tcPr>
-            <w:tcW w:w="1556" w:type="dxa"/>
-          </w:tcPr>
-          <w:p>
-            <w:pPr/>
-            <w:r>
-              <w:t xml:space="preserve">termín nezjištěn</w:t>
-            </w:r>
-          </w:p>
-        </w:tc>
-        <w:tc>
-          <w:tcPr>
-            <w:tcW w:w="2953" w:type="dxa"/>
-          </w:tcPr>
-          <w:p>
-            <w:pPr/>
-            <w:r>
-              <w:t xml:space="preserve">podle výzvy</w:t>
+                <w:t xml:space="preserve">Nadace Život umělce: Grantový program</w:t>
+              </w:r>
+            </w:hyperlink>
+          </w:p>
+        </w:tc>
+        <w:tc>
+          <w:tcPr>
+            <w:tcW w:w="2556" w:type="dxa"/>
+          </w:tcPr>
+          <w:p>
+            <w:pPr/>
+            <w:r>
+              <w:t xml:space="preserve">umělecké projekty: honoráře umělců, nájem sálu, OSA a DILIA, doprava souboru, plakáty; nejvýš 2 podpořené projekty ročně</w:t>
+            </w:r>
+          </w:p>
+        </w:tc>
+        <w:tc>
+          <w:tcPr>
+            <w:tcW w:w="1563" w:type="dxa"/>
+          </w:tcPr>
+          <w:p>
+            <w:pPr/>
+            <w:r>
+              <w:t xml:space="preserve">každý rok 1. 1.–28. 2. a 1. 6.–31. 8., jen na akce v daném roce</w:t>
+            </w:r>
+          </w:p>
+        </w:tc>
+        <w:tc>
+          <w:tcPr>
+            <w:tcW w:w="2982" w:type="dxa"/>
+          </w:tcPr>
+          <w:p>
+            <w:pPr/>
+            <w:r>
+              <w:t xml:space="preserve">jen elektronicky v grantovém systému nadace, příloha kopie smlouvy o účtu; vyúčtování do 30 dnů po akci</w:t>
             </w:r>
           </w:p>
         </w:tc>
@@ -856,9 +856,9 @@
         <w:tblLook w:val="04A0" w:firstRow="1" w:lastRow="0" w:firstColumn="0" w:lastColumn="0" w:noHBand="0" w:noVBand="1"/>
       </w:tblPr>
       <w:tblGrid>
-        <w:gridCol w:w="2245"/>
-        <w:gridCol w:w="4879"/>
-        <w:gridCol w:w="2236"/>
+        <w:gridCol w:w="2196"/>
+        <w:gridCol w:w="4920"/>
+        <w:gridCol w:w="2244"/>
       </w:tblGrid>
       <w:tr>
         <w:trPr>
@@ -866,7 +866,7 @@
         </w:trPr>
         <w:tc>
           <w:tcPr>
-            <w:tcW w:w="2245" w:type="dxa"/>
+            <w:tcW w:w="2196" w:type="dxa"/>
             <w:shd w:val="clear" w:color="auto" w:fill="F2F2F2"/>
           </w:tcPr>
           <w:p>
@@ -878,7 +878,7 @@
         </w:tc>
         <w:tc>
           <w:tcPr>
-            <w:tcW w:w="4879" w:type="dxa"/>
+            <w:tcW w:w="4920" w:type="dxa"/>
             <w:shd w:val="clear" w:color="auto" w:fill="F2F2F2"/>
           </w:tcPr>
           <w:p>
@@ -890,7 +890,7 @@
         </w:tc>
         <w:tc>
           <w:tcPr>
-            <w:tcW w:w="2236" w:type="dxa"/>
+            <w:tcW w:w="2244" w:type="dxa"/>
             <w:shd w:val="clear" w:color="auto" w:fill="F2F2F2"/>
           </w:tcPr>
           <w:p>
@@ -904,7 +904,7 @@
       <w:tr>
         <w:tc>
           <w:tcPr>
-            <w:tcW w:w="2245" w:type="dxa"/>
+            <w:tcW w:w="2196" w:type="dxa"/>
           </w:tcPr>
           <w:p>
             <w:pPr/>
@@ -920,7 +920,7 @@
         </w:tc>
         <w:tc>
           <w:tcPr>
-            <w:tcW w:w="4879" w:type="dxa"/>
+            <w:tcW w:w="4920" w:type="dxa"/>
           </w:tcPr>
           <w:p>
             <w:pPr/>
@@ -931,20 +931,20 @@
         </w:tc>
         <w:tc>
           <w:tcPr>
-            <w:tcW w:w="2236" w:type="dxa"/>
-          </w:tcPr>
-          <w:p>
-            <w:pPr/>
-            <w:r>
-              <w:t xml:space="preserve">2026: do 12. 11.; 2027 od 1. 1.</w:t>
-            </w:r>
-          </w:p>
-        </w:tc>
-      </w:tr>
-      <w:tr>
-        <w:tc>
-          <w:tcPr>
-            <w:tcW w:w="2245" w:type="dxa"/>
+            <w:tcW w:w="2244" w:type="dxa"/>
+          </w:tcPr>
+          <w:p>
+            <w:pPr/>
+            <w:r>
+              <w:t xml:space="preserve">2026: do 12. 11.; příjem na 2027 od 4. 1. 2027</w:t>
+            </w:r>
+          </w:p>
+        </w:tc>
+      </w:tr>
+      <w:tr>
+        <w:tc>
+          <w:tcPr>
+            <w:tcW w:w="2196" w:type="dxa"/>
           </w:tcPr>
           <w:p>
             <w:pPr/>
@@ -953,6 +953,60 @@
                 <w:rPr>
                   <w:rStyle w:val="Hyperlink"/>
                 </w:rPr>
+                <w:t xml:space="preserve">Nadace ČEZ: Stromy</w:t>
+              </w:r>
+            </w:hyperlink>
+            <w:r>
+              <w:t xml:space="preserve"> (</w:t>
+            </w:r>
+            <w:hyperlink r:id="rId15" w:history="1">
+              <w:r>
+                <w:rPr>
+                  <w:rStyle w:val="Hyperlink"/>
+                </w:rPr>
+                <w:t xml:space="preserve">podmínky 2026</w:t>
+              </w:r>
+            </w:hyperlink>
+            <w:r>
+              <w:t xml:space="preserve">)</w:t>
+            </w:r>
+          </w:p>
+        </w:tc>
+        <w:tc>
+          <w:tcPr>
+            <w:tcW w:w="4920" w:type="dxa"/>
+          </w:tcPr>
+          <w:p>
+            <w:pPr/>
+            <w:r>
+              <w:t xml:space="preserve">až 150 000 Kč na výsadbu stromů a keřů, výslovně i ve veřejně přístupných zahradách; sazenice aspoň 70 % nákladů; písemný souhlas vlastníka (města) s udržitelností na 10 let</w:t>
+            </w:r>
+          </w:p>
+        </w:tc>
+        <w:tc>
+          <w:tcPr>
+            <w:tcW w:w="2244" w:type="dxa"/>
+          </w:tcPr>
+          <w:p>
+            <w:pPr/>
+            <w:r>
+              <w:t xml:space="preserve">2026: 1.–26. 1. a 1. 6.–31. 7.; 2027 zatím nevyhlášeno (odhad stejně)</w:t>
+            </w:r>
+          </w:p>
+        </w:tc>
+      </w:tr>
+      <w:tr>
+        <w:tc>
+          <w:tcPr>
+            <w:tcW w:w="2196" w:type="dxa"/>
+          </w:tcPr>
+          <w:p>
+            <w:pPr/>
+            <w:hyperlink r:id="rId16" w:history="1">
+              <w:r>
+                <w:rPr>
+                  <w:rStyle w:val="Hyperlink"/>
+                </w:rPr>
                 <w:t xml:space="preserve">Nadace VIA: Fond Kaufland, komunitní zahrady</w:t>
               </w:r>
             </w:hyperlink>
@@ -960,7 +1014,7 @@
         </w:tc>
         <w:tc>
           <w:tcPr>
-            <w:tcW w:w="4879" w:type="dxa"/>
+            <w:tcW w:w="4920" w:type="dxa"/>
           </w:tcPr>
           <w:p>
             <w:pPr/>
@@ -971,7 +1025,7 @@
         </w:tc>
         <w:tc>
           <w:tcPr>
-            <w:tcW w:w="2236" w:type="dxa"/>
+            <w:tcW w:w="2244" w:type="dxa"/>
           </w:tcPr>
           <w:p>
             <w:pPr/>
@@ -984,11 +1038,11 @@
       <w:tr>
         <w:tc>
           <w:tcPr>
-            <w:tcW w:w="2245" w:type="dxa"/>
-          </w:tcPr>
-          <w:p>
-            <w:pPr/>
-            <w:hyperlink r:id="rId15" w:history="1">
+            <w:tcW w:w="2196" w:type="dxa"/>
+          </w:tcPr>
+          <w:p>
+            <w:pPr/>
+            <w:hyperlink r:id="rId17" w:history="1">
               <w:r>
                 <w:rPr>
                   <w:rStyle w:val="Hyperlink"/>
@@ -999,7 +1053,7 @@
             <w:r>
               <w:t xml:space="preserve"> (</w:t>
             </w:r>
-            <w:hyperlink r:id="rId16" w:history="1">
+            <w:hyperlink r:id="rId18" w:history="1">
               <w:r>
                 <w:rPr>
                   <w:rStyle w:val="Hyperlink"/>
@@ -1014,7 +1068,7 @@
         </w:tc>
         <w:tc>
           <w:tcPr>
-            <w:tcW w:w="4879" w:type="dxa"/>
+            <w:tcW w:w="4920" w:type="dxa"/>
           </w:tcPr>
           <w:p>
             <w:pPr/>
@@ -1025,24 +1079,24 @@
         </w:tc>
         <w:tc>
           <w:tcPr>
-            <w:tcW w:w="2236" w:type="dxa"/>
-          </w:tcPr>
-          <w:p>
-            <w:pPr/>
-            <w:r>
-              <w:t xml:space="preserve">na 2026 příjem 19. 11.–31. 12. 2025; na 2027 se čeká kolem listopadu 2026</w:t>
-            </w:r>
-          </w:p>
-        </w:tc>
-      </w:tr>
-      <w:tr>
-        <w:tc>
-          <w:tcPr>
-            <w:tcW w:w="2245" w:type="dxa"/>
-          </w:tcPr>
-          <w:p>
-            <w:pPr/>
-            <w:hyperlink r:id="rId17" w:history="1">
+            <w:tcW w:w="2244" w:type="dxa"/>
+          </w:tcPr>
+          <w:p>
+            <w:pPr/>
+            <w:r>
+              <w:t xml:space="preserve">na 2026 příjem 19. 11.–31. 12. 2025 a 2. výzva 26. 3.–27. 4. 2026; na 2027 zatím nevyhlášena</w:t>
+            </w:r>
+          </w:p>
+        </w:tc>
+      </w:tr>
+      <w:tr>
+        <w:tc>
+          <w:tcPr>
+            <w:tcW w:w="2196" w:type="dxa"/>
+          </w:tcPr>
+          <w:p>
+            <w:pPr/>
+            <w:hyperlink r:id="rId19" w:history="1">
               <w:r>
                 <w:rPr>
                   <w:rStyle w:val="Hyperlink"/>
@@ -1054,7 +1108,7 @@
         </w:tc>
         <w:tc>
           <w:tcPr>
-            <w:tcW w:w="4879" w:type="dxa"/>
+            <w:tcW w:w="4920" w:type="dxa"/>
           </w:tcPr>
           <w:p>
             <w:pPr/>
@@ -1065,7 +1119,7 @@
         </w:tc>
         <w:tc>
           <w:tcPr>
-            <w:tcW w:w="2236" w:type="dxa"/>
+            <w:tcW w:w="2244" w:type="dxa"/>
           </w:tcPr>
           <w:p>
             <w:pPr/>
@@ -1078,11 +1132,11 @@
       <w:tr>
         <w:tc>
           <w:tcPr>
-            <w:tcW w:w="2245" w:type="dxa"/>
-          </w:tcPr>
-          <w:p>
-            <w:pPr/>
-            <w:hyperlink r:id="rId18" w:history="1">
+            <w:tcW w:w="2196" w:type="dxa"/>
+          </w:tcPr>
+          <w:p>
+            <w:pPr/>
+            <w:hyperlink r:id="rId20" w:history="1">
               <w:r>
                 <w:rPr>
                   <w:rStyle w:val="Hyperlink"/>
@@ -1093,7 +1147,7 @@
             <w:r>
               <w:t xml:space="preserve"> (</w:t>
             </w:r>
-            <w:hyperlink r:id="rId19" w:history="1">
+            <w:hyperlink r:id="rId21" w:history="1">
               <w:r>
                 <w:rPr>
                   <w:rStyle w:val="Hyperlink"/>
@@ -1108,7 +1162,7 @@
         </w:tc>
         <w:tc>
           <w:tcPr>
-            <w:tcW w:w="4879" w:type="dxa"/>
+            <w:tcW w:w="4920" w:type="dxa"/>
           </w:tcPr>
           <w:p>
             <w:pPr/>
@@ -1119,7 +1173,7 @@
         </w:tc>
         <w:tc>
           <w:tcPr>
-            <w:tcW w:w="2236" w:type="dxa"/>
+            <w:tcW w:w="2244" w:type="dxa"/>
           </w:tcPr>
           <w:p>
             <w:pPr/>
@@ -1132,11 +1186,11 @@
       <w:tr>
         <w:tc>
           <w:tcPr>
-            <w:tcW w:w="2245" w:type="dxa"/>
-          </w:tcPr>
-          <w:p>
-            <w:pPr/>
-            <w:hyperlink r:id="rId20" w:history="1">
+            <w:tcW w:w="2196" w:type="dxa"/>
+          </w:tcPr>
+          <w:p>
+            <w:pPr/>
+            <w:hyperlink r:id="rId22" w:history="1">
               <w:r>
                 <w:rPr>
                   <w:rStyle w:val="Hyperlink"/>
@@ -1148,7 +1202,7 @@
         </w:tc>
         <w:tc>
           <w:tcPr>
-            <w:tcW w:w="4879" w:type="dxa"/>
+            <w:tcW w:w="4920" w:type="dxa"/>
           </w:tcPr>
           <w:p>
             <w:pPr/>
@@ -1159,7 +1213,7 @@
         </w:tc>
         <w:tc>
           <w:tcPr>
-            <w:tcW w:w="2236" w:type="dxa"/>
+            <w:tcW w:w="2244" w:type="dxa"/>
           </w:tcPr>
           <w:p>
             <w:pPr/>
@@ -1172,11 +1226,65 @@
       <w:tr>
         <w:tc>
           <w:tcPr>
-            <w:tcW w:w="2245" w:type="dxa"/>
-          </w:tcPr>
-          <w:p>
-            <w:pPr/>
-            <w:hyperlink r:id="rId21" w:history="1">
+            <w:tcW w:w="2196" w:type="dxa"/>
+          </w:tcPr>
+          <w:p>
+            <w:pPr/>
+            <w:hyperlink r:id="rId23" w:history="1">
+              <w:r>
+                <w:rPr>
+                  <w:rStyle w:val="Hyperlink"/>
+                </w:rPr>
+                <w:t xml:space="preserve">Karlovarský kraj: Obnova a nové využití kulturních památek</w:t>
+              </w:r>
+            </w:hyperlink>
+            <w:r>
+              <w:t xml:space="preserve"> (</w:t>
+            </w:r>
+            <w:hyperlink r:id="rId24" w:history="1">
+              <w:r>
+                <w:rPr>
+                  <w:rStyle w:val="Hyperlink"/>
+                </w:rPr>
+                <w:t xml:space="preserve">program</w:t>
+              </w:r>
+            </w:hyperlink>
+            <w:r>
+              <w:t xml:space="preserve">)</w:t>
+            </w:r>
+          </w:p>
+        </w:tc>
+        <w:tc>
+          <w:tcPr>
+            <w:tcW w:w="4920" w:type="dxa"/>
+          </w:tcPr>
+          <w:p>
+            <w:pPr/>
+            <w:r>
+              <w:t xml:space="preserve">oprava památek sloužících veřejnosti, až 800 000 Kč, projekt v roce 2027; žádat smí jen vlastník nebo správce, proto spíš pro město se spolkem jako partnerem</w:t>
+            </w:r>
+          </w:p>
+        </w:tc>
+        <w:tc>
+          <w:tcPr>
+            <w:tcW w:w="2244" w:type="dxa"/>
+          </w:tcPr>
+          <w:p>
+            <w:pPr/>
+            <w:r>
+              <w:t xml:space="preserve">27. 10.–9. 11. 2026</w:t>
+            </w:r>
+          </w:p>
+        </w:tc>
+      </w:tr>
+      <w:tr>
+        <w:tc>
+          <w:tcPr>
+            <w:tcW w:w="2196" w:type="dxa"/>
+          </w:tcPr>
+          <w:p>
+            <w:pPr/>
+            <w:hyperlink r:id="rId25" w:history="1">
               <w:r>
                 <w:rPr>
                   <w:rStyle w:val="Hyperlink"/>
@@ -1188,7 +1296,7 @@
         </w:tc>
         <w:tc>
           <w:tcPr>
-            <w:tcW w:w="4879" w:type="dxa"/>
+            <w:tcW w:w="4920" w:type="dxa"/>
           </w:tcPr>
           <w:p>
             <w:pPr/>
@@ -1199,7 +1307,7 @@
         </w:tc>
         <w:tc>
           <w:tcPr>
-            <w:tcW w:w="2236" w:type="dxa"/>
+            <w:tcW w:w="2244" w:type="dxa"/>
           </w:tcPr>
           <w:p>
             <w:pPr/>
@@ -1212,11 +1320,11 @@
       <w:tr>
         <w:tc>
           <w:tcPr>
-            <w:tcW w:w="2245" w:type="dxa"/>
-          </w:tcPr>
-          <w:p>
-            <w:pPr/>
-            <w:hyperlink r:id="rId22" w:history="1">
+            <w:tcW w:w="2196" w:type="dxa"/>
+          </w:tcPr>
+          <w:p>
+            <w:pPr/>
+            <w:hyperlink r:id="rId26" w:history="1">
               <w:r>
                 <w:rPr>
                   <w:rStyle w:val="Hyperlink"/>
@@ -1228,7 +1336,7 @@
         </w:tc>
         <w:tc>
           <w:tcPr>
-            <w:tcW w:w="4879" w:type="dxa"/>
+            <w:tcW w:w="4920" w:type="dxa"/>
           </w:tcPr>
           <w:p>
             <w:pPr/>
@@ -1239,7 +1347,7 @@
         </w:tc>
         <w:tc>
           <w:tcPr>
-            <w:tcW w:w="2236" w:type="dxa"/>
+            <w:tcW w:w="2244" w:type="dxa"/>
           </w:tcPr>
           <w:p>
             <w:pPr/>
@@ -1255,7 +1363,7 @@
       <w:r>
         <w:t xml:space="preserve">Kde hledat další: </w:t>
       </w:r>
-      <w:hyperlink r:id="rId23" w:history="1">
+      <w:hyperlink r:id="rId27" w:history="1">
         <w:r>
           <w:rPr>
             <w:rStyle w:val="Hyperlink"/>
@@ -1266,7 +1374,7 @@
       <w:r>
         <w:t xml:space="preserve"> (Úřad vlády, státní programy pro neziskovky), </w:t>
       </w:r>
-      <w:hyperlink r:id="rId15" w:history="1">
+      <w:hyperlink r:id="rId17" w:history="1">
         <w:r>
           <w:rPr>
             <w:rStyle w:val="Hyperlink"/>
@@ -1277,7 +1385,7 @@
       <w:r>
         <w:t xml:space="preserve">, </w:t>
       </w:r>
-      <w:hyperlink r:id="rId24" w:history="1">
+      <w:hyperlink r:id="rId28" w:history="1">
         <w:r>
           <w:rPr>
             <w:rStyle w:val="Hyperlink"/>
@@ -1288,7 +1396,7 @@
       <w:r>
         <w:t xml:space="preserve"> a </w:t>
       </w:r>
-      <w:hyperlink r:id="rId25" w:history="1">
+      <w:hyperlink r:id="rId29" w:history="1">
         <w:r>
           <w:rPr>
             <w:rStyle w:val="Hyperlink"/>
@@ -1322,8 +1430,8 @@
         <w:tblLook w:val="04A0" w:firstRow="1" w:lastRow="0" w:firstColumn="0" w:lastColumn="0" w:noHBand="0" w:noVBand="1"/>
       </w:tblPr>
       <w:tblGrid>
-        <w:gridCol w:w="3852"/>
-        <w:gridCol w:w="3839"/>
+        <w:gridCol w:w="3522"/>
+        <w:gridCol w:w="4169"/>
         <w:gridCol w:w="1669"/>
       </w:tblGrid>
       <w:tr>
@@ -1332,7 +1440,7 @@
         </w:trPr>
         <w:tc>
           <w:tcPr>
-            <w:tcW w:w="3852" w:type="dxa"/>
+            <w:tcW w:w="3522" w:type="dxa"/>
             <w:shd w:val="clear" w:color="auto" w:fill="F2F2F2"/>
           </w:tcPr>
           <w:p>
@@ -1344,7 +1452,7 @@
         </w:tc>
         <w:tc>
           <w:tcPr>
-            <w:tcW w:w="3839" w:type="dxa"/>
+            <w:tcW w:w="4169" w:type="dxa"/>
             <w:shd w:val="clear" w:color="auto" w:fill="F2F2F2"/>
           </w:tcPr>
           <w:p>
@@ -1370,11 +1478,11 @@
       <w:tr>
         <w:tc>
           <w:tcPr>
-            <w:tcW w:w="3852" w:type="dxa"/>
-          </w:tcPr>
-          <w:p>
-            <w:pPr/>
-            <w:hyperlink r:id="rId26" w:history="1">
+            <w:tcW w:w="3522" w:type="dxa"/>
+          </w:tcPr>
+          <w:p>
+            <w:pPr/>
+            <w:hyperlink r:id="rId30" w:history="1">
               <w:r>
                 <w:rPr>
                   <w:rStyle w:val="Hyperlink"/>
@@ -1386,7 +1494,7 @@
         </w:tc>
         <w:tc>
           <w:tcPr>
-            <w:tcW w:w="3839" w:type="dxa"/>
+            <w:tcW w:w="4169" w:type="dxa"/>
           </w:tcPr>
           <w:p>
             <w:pPr/>
@@ -1410,11 +1518,11 @@
       <w:tr>
         <w:tc>
           <w:tcPr>
-            <w:tcW w:w="3852" w:type="dxa"/>
-          </w:tcPr>
-          <w:p>
-            <w:pPr/>
-            <w:hyperlink r:id="rId27" w:history="1">
+            <w:tcW w:w="3522" w:type="dxa"/>
+          </w:tcPr>
+          <w:p>
+            <w:pPr/>
+            <w:hyperlink r:id="rId31" w:history="1">
               <w:r>
                 <w:rPr>
                   <w:rStyle w:val="Hyperlink"/>
@@ -1426,7 +1534,7 @@
         </w:tc>
         <w:tc>
           <w:tcPr>
-            <w:tcW w:w="3839" w:type="dxa"/>
+            <w:tcW w:w="4169" w:type="dxa"/>
           </w:tcPr>
           <w:p>
             <w:pPr/>
@@ -1450,7 +1558,87 @@
       <w:tr>
         <w:tc>
           <w:tcPr>
-            <w:tcW w:w="3852" w:type="dxa"/>
+            <w:tcW w:w="3522" w:type="dxa"/>
+          </w:tcPr>
+          <w:p>
+            <w:pPr/>
+            <w:hyperlink r:id="rId32" w:history="1">
+              <w:r>
+                <w:rPr>
+                  <w:rStyle w:val="Hyperlink"/>
+                </w:rPr>
+                <w:t xml:space="preserve">Nadace Občanského fóra: Památky a zdraví</w:t>
+              </w:r>
+            </w:hyperlink>
+          </w:p>
+        </w:tc>
+        <w:tc>
+          <w:tcPr>
+            <w:tcW w:w="4169" w:type="dxa"/>
+          </w:tcPr>
+          <w:p>
+            <w:pPr/>
+            <w:r>
+              <w:t xml:space="preserve">jen pro památky sloužící zdravotní a sociální péči</w:t>
+            </w:r>
+          </w:p>
+        </w:tc>
+        <w:tc>
+          <w:tcPr>
+            <w:tcW w:w="1669" w:type="dxa"/>
+          </w:tcPr>
+          <w:p>
+            <w:pPr/>
+            <w:r>
+              <w:t xml:space="preserve">20. 10. 2026</w:t>
+            </w:r>
+          </w:p>
+        </w:tc>
+      </w:tr>
+      <w:tr>
+        <w:tc>
+          <w:tcPr>
+            <w:tcW w:w="3522" w:type="dxa"/>
+          </w:tcPr>
+          <w:p>
+            <w:pPr/>
+            <w:hyperlink r:id="rId6" w:history="1">
+              <w:r>
+                <w:rPr>
+                  <w:rStyle w:val="Hyperlink"/>
+                </w:rPr>
+                <w:t xml:space="preserve">Město Toužim: program Infocentrum a komunitní akce 2027–2029</w:t>
+              </w:r>
+            </w:hyperlink>
+          </w:p>
+        </w:tc>
+        <w:tc>
+          <w:tcPr>
+            <w:tcW w:w="4169" w:type="dxa"/>
+          </w:tcPr>
+          <w:p>
+            <w:pPr/>
+            <w:r>
+              <w:t xml:space="preserve">spolku se netýká (Michal)</w:t>
+            </w:r>
+          </w:p>
+        </w:tc>
+        <w:tc>
+          <w:tcPr>
+            <w:tcW w:w="1669" w:type="dxa"/>
+          </w:tcPr>
+          <w:p>
+            <w:pPr/>
+            <w:r>
+              <w:t xml:space="preserve">20. 10. 2026</w:t>
+            </w:r>
+          </w:p>
+        </w:tc>
+      </w:tr>
+      <w:tr>
+        <w:tc>
+          <w:tcPr>
+            <w:tcW w:w="3522" w:type="dxa"/>
           </w:tcPr>
           <w:p>
             <w:pPr/>
@@ -1459,19 +1647,19 @@
                 <w:rPr>
                   <w:rStyle w:val="Hyperlink"/>
                 </w:rPr>
-                <w:t xml:space="preserve">Nadace Občanského fóra: Památky a zdraví</w:t>
-              </w:r>
-            </w:hyperlink>
-          </w:p>
-        </w:tc>
-        <w:tc>
-          <w:tcPr>
-            <w:tcW w:w="3839" w:type="dxa"/>
-          </w:tcPr>
-          <w:p>
-            <w:pPr/>
-            <w:r>
-              <w:t xml:space="preserve">jen pro památky sloužící zdravotní a sociální péči</w:t>
+                <w:t xml:space="preserve">Nadace Partnerství: Sázíme budoucnost do 100 tis., KB PS, Škoda Stromky</w:t>
+              </w:r>
+            </w:hyperlink>
+          </w:p>
+        </w:tc>
+        <w:tc>
+          <w:tcPr>
+            <w:tcW w:w="4169" w:type="dxa"/>
+          </w:tcPr>
+          <w:p>
+            <w:pPr/>
+            <w:r>
+              <w:t xml:space="preserve">výsadby ve volné krajině a alejích, ne na zahradu</w:t>
             </w:r>
           </w:p>
         </w:tc>
@@ -1490,28 +1678,31 @@
       <w:tr>
         <w:tc>
           <w:tcPr>
-            <w:tcW w:w="3852" w:type="dxa"/>
-          </w:tcPr>
-          <w:p>
-            <w:pPr/>
-            <w:hyperlink r:id="rId6" w:history="1">
-              <w:r>
-                <w:rPr>
-                  <w:rStyle w:val="Hyperlink"/>
-                </w:rPr>
-                <w:t xml:space="preserve">Město Toužim: program Infocentrum a komunitní akce 2027–2029</w:t>
-              </w:r>
-            </w:hyperlink>
-          </w:p>
-        </w:tc>
-        <w:tc>
-          <w:tcPr>
-            <w:tcW w:w="3839" w:type="dxa"/>
-          </w:tcPr>
-          <w:p>
-            <w:pPr/>
-            <w:r>
-              <w:t xml:space="preserve">spolku se netýká (Michal)</w:t>
+            <w:tcW w:w="3522" w:type="dxa"/>
+          </w:tcPr>
+          <w:p>
+            <w:pPr/>
+            <w:hyperlink r:id="rId33" w:history="1">
+              <w:r>
+                <w:rPr>
+                  <w:rStyle w:val="Hyperlink"/>
+                </w:rPr>
+                <w:t xml:space="preserve">MAS v kraji mimo Kraj živých vod</w:t>
+              </w:r>
+            </w:hyperlink>
+            <w:r>
+              <w:t xml:space="preserve"> (MAS 21, Sokolovsko, Vladař, Krušné hory)</w:t>
+            </w:r>
+          </w:p>
+        </w:tc>
+        <w:tc>
+          <w:tcPr>
+            <w:tcW w:w="4169" w:type="dxa"/>
+          </w:tcPr>
+          <w:p>
+            <w:pPr/>
+            <w:r>
+              <w:t xml:space="preserve">každá MAS podporuje jen své území, Toužim patří do Kraje živých vod</w:t>
             </w:r>
           </w:p>
         </w:tc>
@@ -1530,28 +1721,23 @@
       <w:tr>
         <w:tc>
           <w:tcPr>
-            <w:tcW w:w="3852" w:type="dxa"/>
-          </w:tcPr>
-          <w:p>
-            <w:pPr/>
-            <w:hyperlink r:id="rId24" w:history="1">
-              <w:r>
-                <w:rPr>
-                  <w:rStyle w:val="Hyperlink"/>
-                </w:rPr>
-                <w:t xml:space="preserve">Nadace Partnerství: Sázíme budoucnost do 100 tis., KB PS, Škoda Stromky</w:t>
-              </w:r>
-            </w:hyperlink>
-          </w:p>
-        </w:tc>
-        <w:tc>
-          <w:tcPr>
-            <w:tcW w:w="3839" w:type="dxa"/>
-          </w:tcPr>
-          <w:p>
-            <w:pPr/>
-            <w:r>
-              <w:t xml:space="preserve">výsadby ve volné krajině a alejích, ne na zahradu</w:t>
+            <w:tcW w:w="3522" w:type="dxa"/>
+          </w:tcPr>
+          <w:p>
+            <w:pPr/>
+            <w:r>
+              <w:t xml:space="preserve">Destinační agentura Krušnohoří</w:t>
+            </w:r>
+          </w:p>
+        </w:tc>
+        <w:tc>
+          <w:tcPr>
+            <w:tcW w:w="4169" w:type="dxa"/>
+          </w:tcPr>
+          <w:p>
+            <w:pPr/>
+            <w:r>
+              <w:t xml:space="preserve">působí jen v Krušných horách, Toužim mimo</w:t>
             </w:r>
           </w:p>
         </w:tc>
@@ -1570,31 +1756,28 @@
       <w:tr>
         <w:tc>
           <w:tcPr>
-            <w:tcW w:w="3852" w:type="dxa"/>
-          </w:tcPr>
-          <w:p>
-            <w:pPr/>
-            <w:hyperlink r:id="rId29" w:history="1">
-              <w:r>
-                <w:rPr>
-                  <w:rStyle w:val="Hyperlink"/>
-                </w:rPr>
-                <w:t xml:space="preserve">MAS v kraji mimo Kraj živých vod</w:t>
-              </w:r>
-            </w:hyperlink>
-            <w:r>
-              <w:t xml:space="preserve"> (MAS 21, Sokolovsko, Vladař, Krušné hory)</w:t>
-            </w:r>
-          </w:p>
-        </w:tc>
-        <w:tc>
-          <w:tcPr>
-            <w:tcW w:w="3839" w:type="dxa"/>
-          </w:tcPr>
-          <w:p>
-            <w:pPr/>
-            <w:r>
-              <w:t xml:space="preserve">každá MAS podporuje jen své území, Toužim patří do Kraje živých vod</w:t>
+            <w:tcW w:w="3522" w:type="dxa"/>
+          </w:tcPr>
+          <w:p>
+            <w:pPr/>
+            <w:hyperlink r:id="rId34" w:history="1">
+              <w:r>
+                <w:rPr>
+                  <w:rStyle w:val="Hyperlink"/>
+                </w:rPr>
+                <w:t xml:space="preserve">Karlovarský kraj: Podpora vzdělávání dětí a mládeže v kultuře</w:t>
+              </w:r>
+            </w:hyperlink>
+          </w:p>
+        </w:tc>
+        <w:tc>
+          <w:tcPr>
+            <w:tcW w:w="4169" w:type="dxa"/>
+          </w:tcPr>
+          <w:p>
+            <w:pPr/>
+            <w:r>
+              <w:t xml:space="preserve">jen pro pořady, které kraj zařadí do Katalogu dopoledních kulturních pořadů pro děti a mládež (představení pro školy); na akce spolku se nehodí</w:t>
             </w:r>
           </w:p>
         </w:tc>
@@ -1605,42 +1788,7 @@
           <w:p>
             <w:pPr/>
             <w:r>
-              <w:t xml:space="preserve">20. 10. 2026</w:t>
-            </w:r>
-          </w:p>
-        </w:tc>
-      </w:tr>
-      <w:tr>
-        <w:tc>
-          <w:tcPr>
-            <w:tcW w:w="3852" w:type="dxa"/>
-          </w:tcPr>
-          <w:p>
-            <w:pPr/>
-            <w:r>
-              <w:t xml:space="preserve">Destinační agentura Krušnohoří</w:t>
-            </w:r>
-          </w:p>
-        </w:tc>
-        <w:tc>
-          <w:tcPr>
-            <w:tcW w:w="3839" w:type="dxa"/>
-          </w:tcPr>
-          <w:p>
-            <w:pPr/>
-            <w:r>
-              <w:t xml:space="preserve">působí jen v Krušných horách, Toužim mimo</w:t>
-            </w:r>
-          </w:p>
-        </w:tc>
-        <w:tc>
-          <w:tcPr>
-            <w:tcW w:w="1669" w:type="dxa"/>
-          </w:tcPr>
-          <w:p>
-            <w:pPr/>
-            <w:r>
-              <w:t xml:space="preserve">20. 10. 2026</w:t>
+              <w:t xml:space="preserve">26. 10. 2026</w:t>
             </w:r>
           </w:p>
         </w:tc>

</xml_diff>